<commit_message>
inventory sales report marketing
</commit_message>
<xml_diff>
--- a/APLOS/POPResources/Templates/IndivisualGatePass202034.docx
+++ b/APLOS/POPResources/Templates/IndivisualGatePass202034.docx
@@ -1,6 +1,6 @@
 
 <file path=word/document.xml><?xml version="1.0" encoding="utf-8"?>
-<w:document xmlns:wpc="http://schemas.microsoft.com/office/word/2010/wordprocessingCanvas" xmlns:mc="http://schemas.openxmlformats.org/markup-compatibility/2006" xmlns:o="urn:schemas-microsoft-com:office:office" xmlns:r="http://schemas.openxmlformats.org/officeDocument/2006/relationships" xmlns:m="http://schemas.openxmlformats.org/officeDocument/2006/math" xmlns:v="urn:schemas-microsoft-com:vml" xmlns:wp14="http://schemas.microsoft.com/office/word/2010/wordprocessingDrawing" xmlns:wp="http://schemas.openxmlformats.org/drawingml/2006/wordprocessingDrawing" xmlns:w10="urn:schemas-microsoft-com:office:word" xmlns:w="http://schemas.openxmlformats.org/wordprocessingml/2006/main" xmlns:w14="http://schemas.microsoft.com/office/word/2010/wordml" xmlns:w15="http://schemas.microsoft.com/office/word/2012/wordml" xmlns:wpg="http://schemas.microsoft.com/office/word/2010/wordprocessingGroup" xmlns:wpi="http://schemas.microsoft.com/office/word/2010/wordprocessingInk" xmlns:wne="http://schemas.microsoft.com/office/word/2006/wordml" xmlns:wps="http://schemas.microsoft.com/office/word/2010/wordprocessingShape" mc:Ignorable="w14 w15 wp14">
+<w:document xmlns:wpc="http://schemas.microsoft.com/office/word/2010/wordprocessingCanvas" xmlns:cx="http://schemas.microsoft.com/office/drawing/2014/chartex" xmlns:cx1="http://schemas.microsoft.com/office/drawing/2015/9/8/chartex" xmlns:cx2="http://schemas.microsoft.com/office/drawing/2015/10/21/chartex" xmlns:cx3="http://schemas.microsoft.com/office/drawing/2016/5/9/chartex" xmlns:cx4="http://schemas.microsoft.com/office/drawing/2016/5/10/chartex" xmlns:cx5="http://schemas.microsoft.com/office/drawing/2016/5/11/chartex" xmlns:cx6="http://schemas.microsoft.com/office/drawing/2016/5/12/chartex" xmlns:cx7="http://schemas.microsoft.com/office/drawing/2016/5/13/chartex" xmlns:cx8="http://schemas.microsoft.com/office/drawing/2016/5/14/chartex" xmlns:mc="http://schemas.openxmlformats.org/markup-compatibility/2006" xmlns:aink="http://schemas.microsoft.com/office/drawing/2016/ink" xmlns:am3d="http://schemas.microsoft.com/office/drawing/2017/model3d" xmlns:o="urn:schemas-microsoft-com:office:office" xmlns:oel="http://schemas.microsoft.com/office/2019/extlst" xmlns:r="http://schemas.openxmlformats.org/officeDocument/2006/relationships" xmlns:m="http://schemas.openxmlformats.org/officeDocument/2006/math" xmlns:v="urn:schemas-microsoft-com:vml" xmlns:wp14="http://schemas.microsoft.com/office/word/2010/wordprocessingDrawing" xmlns:wp="http://schemas.openxmlformats.org/drawingml/2006/wordprocessingDrawing" xmlns:w10="urn:schemas-microsoft-com:office:word" xmlns:w="http://schemas.openxmlformats.org/wordprocessingml/2006/main" xmlns:w14="http://schemas.microsoft.com/office/word/2010/wordml" xmlns:w15="http://schemas.microsoft.com/office/word/2012/wordml" xmlns:w16cex="http://schemas.microsoft.com/office/word/2018/wordml/cex" xmlns:w16cid="http://schemas.microsoft.com/office/word/2016/wordml/cid" xmlns:w16="http://schemas.microsoft.com/office/word/2018/wordml" xmlns:w16sdtdh="http://schemas.microsoft.com/office/word/2020/wordml/sdtdatahash" xmlns:w16se="http://schemas.microsoft.com/office/word/2015/wordml/symex" xmlns:wpg="http://schemas.microsoft.com/office/word/2010/wordprocessingGroup" xmlns:wpi="http://schemas.microsoft.com/office/word/2010/wordprocessingInk" xmlns:wne="http://schemas.microsoft.com/office/word/2006/wordml" xmlns:wps="http://schemas.microsoft.com/office/word/2010/wordprocessingShape" mc:Ignorable="w14 w15 w16se w16cid w16 w16cex w16sdtdh wp14">
   <w:body>
     <w:p>
       <w:pPr>
@@ -80,7 +80,31 @@
                                 <w:szCs w:val="20"/>
                                 <w:u w:val="thick"/>
                               </w:rPr>
-                              <w:t>{GateRegisterType}</w:t>
+                              <w:t>{</w:t>
+                            </w:r>
+                            <w:proofErr w:type="spellStart"/>
+                            <w:r>
+                              <w:rPr>
+                                <w:rFonts w:ascii="Tahoma" w:hAnsi="Tahoma" w:cs="Tahoma"/>
+                                <w:b/>
+                                <w:bCs/>
+                                <w:sz w:val="20"/>
+                                <w:szCs w:val="20"/>
+                                <w:u w:val="thick"/>
+                              </w:rPr>
+                              <w:t>GateRegisterType</w:t>
+                            </w:r>
+                            <w:proofErr w:type="spellEnd"/>
+                            <w:r>
+                              <w:rPr>
+                                <w:rFonts w:ascii="Tahoma" w:hAnsi="Tahoma" w:cs="Tahoma"/>
+                                <w:b/>
+                                <w:bCs/>
+                                <w:sz w:val="20"/>
+                                <w:szCs w:val="20"/>
+                                <w:u w:val="thick"/>
+                              </w:rPr>
+                              <w:t>}</w:t>
                             </w:r>
                           </w:p>
                         </w:txbxContent>
@@ -106,7 +130,7 @@
                 <v:stroke joinstyle="miter"/>
                 <v:path gradientshapeok="t" o:connecttype="rect"/>
               </v:shapetype>
-              <v:shape id="Text Box 2" o:spid="_x0000_s1026" type="#_x0000_t202" style="position:absolute;left:0;text-align:left;margin-left:-27.6pt;margin-top:7.05pt;width:355.8pt;height:20.05pt;z-index:251663872;visibility:visible;mso-wrap-style:square;mso-width-percent:0;mso-height-percent:0;mso-wrap-distance-left:9pt;mso-wrap-distance-top:3.6pt;mso-wrap-distance-right:9pt;mso-wrap-distance-bottom:3.6pt;mso-position-horizontal:absolute;mso-position-horizontal-relative:margin;mso-position-vertical:absolute;mso-position-vertical-relative:text;mso-width-percent:0;mso-height-percent:0;mso-width-relative:margin;mso-height-relative:margin;v-text-anchor:top" o:gfxdata="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" filled="f" stroked="f">
+              <v:shape id="Text Box 2" o:spid="_x0000_s1026" type="#_x0000_t202" style="position:absolute;left:0;text-align:left;margin-left:-27.6pt;margin-top:7.05pt;width:355.8pt;height:20.05pt;z-index:251663872;visibility:visible;mso-wrap-style:square;mso-width-percent:0;mso-height-percent:0;mso-wrap-distance-left:9pt;mso-wrap-distance-top:3.6pt;mso-wrap-distance-right:9pt;mso-wrap-distance-bottom:3.6pt;mso-position-horizontal:absolute;mso-position-horizontal-relative:margin;mso-position-vertical:absolute;mso-position-vertical-relative:text;mso-width-percent:0;mso-height-percent:0;mso-width-relative:margin;mso-height-relative:margin;v-text-anchor:top" o:gfxdata="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" filled="f" stroked="f">
                 <v:textbox>
                   <w:txbxContent>
                     <w:p>
@@ -127,7 +151,31 @@
                           <w:szCs w:val="20"/>
                           <w:u w:val="thick"/>
                         </w:rPr>
-                        <w:t>{GateRegisterType}</w:t>
+                        <w:t>{</w:t>
+                      </w:r>
+                      <w:proofErr w:type="spellStart"/>
+                      <w:r>
+                        <w:rPr>
+                          <w:rFonts w:ascii="Tahoma" w:hAnsi="Tahoma" w:cs="Tahoma"/>
+                          <w:b/>
+                          <w:bCs/>
+                          <w:sz w:val="20"/>
+                          <w:szCs w:val="20"/>
+                          <w:u w:val="thick"/>
+                        </w:rPr>
+                        <w:t>GateRegisterType</w:t>
+                      </w:r>
+                      <w:proofErr w:type="spellEnd"/>
+                      <w:r>
+                        <w:rPr>
+                          <w:rFonts w:ascii="Tahoma" w:hAnsi="Tahoma" w:cs="Tahoma"/>
+                          <w:b/>
+                          <w:bCs/>
+                          <w:sz w:val="20"/>
+                          <w:szCs w:val="20"/>
+                          <w:u w:val="thick"/>
+                        </w:rPr>
+                        <w:t>}</w:t>
                       </w:r>
                     </w:p>
                   </w:txbxContent>
@@ -183,15 +231,27 @@
                 <w:szCs w:val="18"/>
               </w:rPr>
             </w:pPr>
-            <w:r>
-              <w:rPr>
-                <w:rFonts w:ascii="Tahoma" w:eastAsia="Arial" w:hAnsi="Tahoma" w:cs="Tahoma"/>
-                <w:b/>
-                <w:bCs/>
-                <w:sz w:val="18"/>
-                <w:szCs w:val="18"/>
-              </w:rPr>
-              <w:t>GatePass No:</w:t>
+            <w:proofErr w:type="spellStart"/>
+            <w:r>
+              <w:rPr>
+                <w:rFonts w:ascii="Tahoma" w:eastAsia="Arial" w:hAnsi="Tahoma" w:cs="Tahoma"/>
+                <w:b/>
+                <w:bCs/>
+                <w:sz w:val="18"/>
+                <w:szCs w:val="18"/>
+              </w:rPr>
+              <w:t>GatePass</w:t>
+            </w:r>
+            <w:proofErr w:type="spellEnd"/>
+            <w:r>
+              <w:rPr>
+                <w:rFonts w:ascii="Tahoma" w:eastAsia="Arial" w:hAnsi="Tahoma" w:cs="Tahoma"/>
+                <w:b/>
+                <w:bCs/>
+                <w:sz w:val="18"/>
+                <w:szCs w:val="18"/>
+              </w:rPr>
+              <w:t xml:space="preserve"> No:</w:t>
             </w:r>
             <w:r>
               <w:rPr>
@@ -267,7 +327,27 @@
                 <w:sz w:val="18"/>
                 <w:szCs w:val="18"/>
               </w:rPr>
-              <w:t>{GatepassEntryDate}</w:t>
+              <w:t>{</w:t>
+            </w:r>
+            <w:proofErr w:type="spellStart"/>
+            <w:r>
+              <w:rPr>
+                <w:rFonts w:ascii="Tahoma" w:eastAsia="Times New Roman" w:hAnsi="Tahoma" w:cs="Tahoma"/>
+                <w:color w:val="000000"/>
+                <w:sz w:val="18"/>
+                <w:szCs w:val="18"/>
+              </w:rPr>
+              <w:t>GatepassEntryDate</w:t>
+            </w:r>
+            <w:proofErr w:type="spellEnd"/>
+            <w:r>
+              <w:rPr>
+                <w:rFonts w:ascii="Tahoma" w:eastAsia="Times New Roman" w:hAnsi="Tahoma" w:cs="Tahoma"/>
+                <w:color w:val="000000"/>
+                <w:sz w:val="18"/>
+                <w:szCs w:val="18"/>
+              </w:rPr>
+              <w:t>}</w:t>
             </w:r>
           </w:p>
           <w:p>
@@ -287,17 +367,7 @@
                 <w:sz w:val="18"/>
                 <w:szCs w:val="18"/>
               </w:rPr>
-              <w:t xml:space="preserve">Gate Pass </w:t>
-            </w:r>
-            <w:r>
-              <w:rPr>
-                <w:rFonts w:ascii="Tahoma" w:eastAsia="Arial" w:hAnsi="Tahoma" w:cs="Tahoma"/>
-                <w:b/>
-                <w:bCs/>
-                <w:sz w:val="18"/>
-                <w:szCs w:val="18"/>
-              </w:rPr>
-              <w:t>For</w:t>
+              <w:t>Material Send/Return</w:t>
             </w:r>
             <w:r>
               <w:rPr>
@@ -318,6 +388,7 @@
               </w:rPr>
               <w:t>{</w:t>
             </w:r>
+            <w:proofErr w:type="spellStart"/>
             <w:r>
               <w:rPr>
                 <w:rFonts w:ascii="Tahoma" w:eastAsia="Times New Roman" w:hAnsi="Tahoma" w:cs="Tahoma"/>
@@ -327,6 +398,7 @@
               </w:rPr>
               <w:t>GatePassType</w:t>
             </w:r>
+            <w:proofErr w:type="spellEnd"/>
             <w:r>
               <w:rPr>
                 <w:rFonts w:ascii="Tahoma" w:eastAsia="Times New Roman" w:hAnsi="Tahoma" w:cs="Tahoma"/>
@@ -375,6 +447,7 @@
               </w:rPr>
               <w:t>{</w:t>
             </w:r>
+            <w:proofErr w:type="spellStart"/>
             <w:r>
               <w:rPr>
                 <w:rFonts w:ascii="Tahoma" w:eastAsia="Times New Roman" w:hAnsi="Tahoma" w:cs="Tahoma"/>
@@ -384,6 +457,7 @@
               </w:rPr>
               <w:t>GatePassStatus</w:t>
             </w:r>
+            <w:proofErr w:type="spellEnd"/>
             <w:r>
               <w:rPr>
                 <w:rFonts w:ascii="Tahoma" w:eastAsia="Times New Roman" w:hAnsi="Tahoma" w:cs="Tahoma"/>
@@ -432,6 +506,7 @@
               </w:rPr>
               <w:t>{</w:t>
             </w:r>
+            <w:proofErr w:type="spellStart"/>
             <w:r>
               <w:rPr>
                 <w:rFonts w:ascii="Tahoma" w:eastAsia="Times New Roman" w:hAnsi="Tahoma" w:cs="Tahoma"/>
@@ -450,6 +525,7 @@
               </w:rPr>
               <w:t>nableDate</w:t>
             </w:r>
+            <w:proofErr w:type="spellEnd"/>
             <w:r>
               <w:rPr>
                 <w:rFonts w:ascii="Tahoma" w:eastAsia="Times New Roman" w:hAnsi="Tahoma" w:cs="Tahoma"/>
@@ -498,6 +574,7 @@
               </w:rPr>
               <w:t>{</w:t>
             </w:r>
+            <w:proofErr w:type="spellStart"/>
             <w:r>
               <w:rPr>
                 <w:rFonts w:ascii="Consolas" w:hAnsi="Consolas" w:cs="Consolas"/>
@@ -507,6 +584,7 @@
               </w:rPr>
               <w:t>InvoiceNo</w:t>
             </w:r>
+            <w:proofErr w:type="spellEnd"/>
             <w:r>
               <w:rPr>
                 <w:rFonts w:ascii="Tahoma" w:eastAsia="Times New Roman" w:hAnsi="Tahoma" w:cs="Tahoma"/>
@@ -555,6 +633,7 @@
               </w:rPr>
               <w:t>{</w:t>
             </w:r>
+            <w:proofErr w:type="spellStart"/>
             <w:r>
               <w:rPr>
                 <w:rFonts w:ascii="Consolas" w:hAnsi="Consolas" w:cs="Consolas"/>
@@ -564,6 +643,7 @@
               </w:rPr>
               <w:t>InvoiceValue</w:t>
             </w:r>
+            <w:proofErr w:type="spellEnd"/>
             <w:r>
               <w:rPr>
                 <w:rFonts w:ascii="Tahoma" w:eastAsia="Times New Roman" w:hAnsi="Tahoma" w:cs="Tahoma"/>
@@ -612,6 +692,7 @@
               </w:rPr>
               <w:t>{</w:t>
             </w:r>
+            <w:proofErr w:type="spellStart"/>
             <w:r>
               <w:rPr>
                 <w:rFonts w:ascii="Consolas" w:hAnsi="Consolas" w:cs="Consolas"/>
@@ -621,6 +702,7 @@
               </w:rPr>
               <w:t>NoOfPackages</w:t>
             </w:r>
+            <w:proofErr w:type="spellEnd"/>
             <w:r>
               <w:rPr>
                 <w:rFonts w:ascii="Tahoma" w:eastAsia="Times New Roman" w:hAnsi="Tahoma" w:cs="Tahoma"/>
@@ -686,6 +768,15 @@
                 <w:szCs w:val="18"/>
               </w:rPr>
               <w:t>}</w:t>
+            </w:r>
+            <w:r>
+              <w:rPr>
+                <w:rFonts w:ascii="Tahoma" w:eastAsia="Times New Roman" w:hAnsi="Tahoma" w:cs="Tahoma"/>
+                <w:color w:val="000000"/>
+                <w:sz w:val="18"/>
+                <w:szCs w:val="18"/>
+              </w:rPr>
+              <w:t xml:space="preserve"> </w:t>
             </w:r>
           </w:p>
         </w:tc>
@@ -723,6 +814,7 @@
               </w:rPr>
               <w:t>{</w:t>
             </w:r>
+            <w:proofErr w:type="spellStart"/>
             <w:r>
               <w:rPr>
                 <w:rFonts w:ascii="Tahoma" w:hAnsi="Tahoma" w:cs="Tahoma"/>
@@ -732,6 +824,7 @@
               </w:rPr>
               <w:t>SenderName</w:t>
             </w:r>
+            <w:proofErr w:type="spellEnd"/>
             <w:r>
               <w:rPr>
                 <w:rFonts w:ascii="Tahoma" w:eastAsia="Times New Roman" w:hAnsi="Tahoma" w:cs="Tahoma"/>
@@ -818,6 +911,7 @@
               </w:rPr>
               <w:t xml:space="preserve"> :{</w:t>
             </w:r>
+            <w:proofErr w:type="spellStart"/>
             <w:r>
               <w:rPr>
                 <w:rFonts w:ascii="Consolas" w:hAnsi="Consolas" w:cs="Consolas"/>
@@ -827,6 +921,7 @@
               </w:rPr>
               <w:t>CourierName</w:t>
             </w:r>
+            <w:proofErr w:type="spellEnd"/>
             <w:r>
               <w:rPr>
                 <w:rFonts w:ascii="Tahoma" w:eastAsia="Times New Roman" w:hAnsi="Tahoma" w:cs="Tahoma"/>
@@ -865,6 +960,7 @@
               </w:rPr>
               <w:t>:{</w:t>
             </w:r>
+            <w:proofErr w:type="spellStart"/>
             <w:r>
               <w:rPr>
                 <w:rFonts w:ascii="Consolas" w:hAnsi="Consolas" w:cs="Consolas"/>
@@ -874,6 +970,7 @@
               </w:rPr>
               <w:t>RunnerEmployee</w:t>
             </w:r>
+            <w:proofErr w:type="spellEnd"/>
             <w:r>
               <w:rPr>
                 <w:rFonts w:ascii="Tahoma" w:eastAsia="Times New Roman" w:hAnsi="Tahoma" w:cs="Tahoma"/>
@@ -931,6 +1028,7 @@
               </w:rPr>
               <w:t>{</w:t>
             </w:r>
+            <w:proofErr w:type="spellStart"/>
             <w:r>
               <w:rPr>
                 <w:rFonts w:ascii="Consolas" w:hAnsi="Consolas" w:cs="Consolas"/>
@@ -940,6 +1038,7 @@
               </w:rPr>
               <w:t>TransportAgentName</w:t>
             </w:r>
+            <w:proofErr w:type="spellEnd"/>
             <w:r>
               <w:rPr>
                 <w:rFonts w:ascii="Tahoma" w:eastAsia="Times New Roman" w:hAnsi="Tahoma" w:cs="Tahoma"/>
@@ -988,6 +1087,7 @@
               </w:rPr>
               <w:t>{</w:t>
             </w:r>
+            <w:proofErr w:type="spellStart"/>
             <w:r>
               <w:rPr>
                 <w:rFonts w:ascii="Consolas" w:hAnsi="Consolas" w:cs="Consolas"/>
@@ -997,6 +1097,7 @@
               </w:rPr>
               <w:t>ConsignmentNo</w:t>
             </w:r>
+            <w:proofErr w:type="spellEnd"/>
             <w:r>
               <w:rPr>
                 <w:rFonts w:ascii="Tahoma" w:eastAsia="Times New Roman" w:hAnsi="Tahoma" w:cs="Tahoma"/>
@@ -1045,6 +1146,7 @@
               </w:rPr>
               <w:t>{</w:t>
             </w:r>
+            <w:proofErr w:type="spellStart"/>
             <w:r>
               <w:rPr>
                 <w:rFonts w:ascii="Consolas" w:hAnsi="Consolas" w:cs="Consolas"/>
@@ -1054,6 +1156,7 @@
               </w:rPr>
               <w:t>DriverName</w:t>
             </w:r>
+            <w:proofErr w:type="spellEnd"/>
             <w:r>
               <w:rPr>
                 <w:rFonts w:ascii="Tahoma" w:eastAsia="Times New Roman" w:hAnsi="Tahoma" w:cs="Tahoma"/>
@@ -1102,6 +1205,7 @@
               </w:rPr>
               <w:t>{</w:t>
             </w:r>
+            <w:proofErr w:type="spellStart"/>
             <w:r>
               <w:rPr>
                 <w:rFonts w:ascii="Consolas" w:hAnsi="Consolas" w:cs="Consolas"/>
@@ -1111,6 +1215,7 @@
               </w:rPr>
               <w:t>TransportAgentMobileNo</w:t>
             </w:r>
+            <w:proofErr w:type="spellEnd"/>
             <w:r>
               <w:rPr>
                 <w:rFonts w:ascii="Tahoma" w:eastAsia="Times New Roman" w:hAnsi="Tahoma" w:cs="Tahoma"/>
@@ -1159,6 +1264,7 @@
               </w:rPr>
               <w:t>{</w:t>
             </w:r>
+            <w:proofErr w:type="spellStart"/>
             <w:r>
               <w:rPr>
                 <w:rFonts w:ascii="Consolas" w:hAnsi="Consolas" w:cs="Consolas"/>
@@ -1168,6 +1274,7 @@
               </w:rPr>
               <w:t>VehicleNo</w:t>
             </w:r>
+            <w:proofErr w:type="spellEnd"/>
             <w:r>
               <w:rPr>
                 <w:rFonts w:ascii="Tahoma" w:eastAsia="Times New Roman" w:hAnsi="Tahoma" w:cs="Tahoma"/>
@@ -1235,6 +1342,7 @@
               </w:rPr>
               <w:t>: {</w:t>
             </w:r>
+            <w:proofErr w:type="spellStart"/>
             <w:r>
               <w:rPr>
                 <w:rFonts w:ascii="Tahoma" w:hAnsi="Tahoma" w:cs="Tahoma"/>
@@ -1244,6 +1352,7 @@
               </w:rPr>
               <w:t>PartyName</w:t>
             </w:r>
+            <w:proofErr w:type="spellEnd"/>
             <w:r>
               <w:rPr>
                 <w:rFonts w:ascii="Tahoma" w:hAnsi="Tahoma" w:cs="Tahoma"/>
@@ -1331,8 +1440,6 @@
               </w:rPr>
               <w:t>:{</w:t>
             </w:r>
-            <w:bookmarkStart w:id="0" w:name="_GoBack"/>
-            <w:bookmarkEnd w:id="0"/>
             <w:r>
               <w:rPr>
                 <w:rFonts w:ascii="Consolas" w:hAnsi="Consolas" w:cs="Consolas"/>
@@ -1402,6 +1509,7 @@
               </w:rPr>
               <w:t>:{</w:t>
             </w:r>
+            <w:proofErr w:type="spellStart"/>
             <w:r>
               <w:rPr>
                 <w:rFonts w:ascii="Consolas" w:hAnsi="Consolas" w:cs="Consolas"/>
@@ -1411,6 +1519,7 @@
               </w:rPr>
               <w:t>BuyerName</w:t>
             </w:r>
+            <w:proofErr w:type="spellEnd"/>
             <w:r>
               <w:rPr>
                 <w:rFonts w:ascii="Tahoma" w:hAnsi="Tahoma" w:cs="Tahoma"/>
@@ -1492,6 +1601,7 @@
               </w:rPr>
               <w:t>{</w:t>
             </w:r>
+            <w:proofErr w:type="spellStart"/>
             <w:r>
               <w:rPr>
                 <w:rFonts w:ascii="Consolas" w:hAnsi="Consolas" w:cs="Consolas"/>
@@ -1501,6 +1611,7 @@
               </w:rPr>
               <w:t>OtherPlant</w:t>
             </w:r>
+            <w:proofErr w:type="spellEnd"/>
             <w:r>
               <w:rPr>
                 <w:rFonts w:ascii="Tahoma" w:hAnsi="Tahoma" w:cs="Tahoma"/>
@@ -1543,6 +1654,7 @@
               </w:rPr>
               <w:t>{</w:t>
             </w:r>
+            <w:proofErr w:type="spellStart"/>
             <w:r>
               <w:rPr>
                 <w:rFonts w:ascii="Consolas" w:hAnsi="Consolas" w:cs="Consolas"/>
@@ -1552,6 +1664,7 @@
               </w:rPr>
               <w:t>OtherCompanyName</w:t>
             </w:r>
+            <w:proofErr w:type="spellEnd"/>
             <w:r>
               <w:rPr>
                 <w:rFonts w:ascii="Tahoma" w:hAnsi="Tahoma" w:cs="Tahoma"/>
@@ -1596,6 +1709,7 @@
               </w:rPr>
               <w:t>{</w:t>
             </w:r>
+            <w:proofErr w:type="spellStart"/>
             <w:r>
               <w:rPr>
                 <w:rFonts w:ascii="Consolas" w:hAnsi="Consolas" w:cs="Consolas"/>
@@ -1605,6 +1719,7 @@
               </w:rPr>
               <w:t>PersonName</w:t>
             </w:r>
+            <w:proofErr w:type="spellEnd"/>
             <w:r>
               <w:rPr>
                 <w:rFonts w:ascii="Tahoma" w:hAnsi="Tahoma" w:cs="Tahoma"/>
@@ -1639,6 +1754,7 @@
               </w:rPr>
               <w:t>Mobile No:{</w:t>
             </w:r>
+            <w:proofErr w:type="spellStart"/>
             <w:r>
               <w:rPr>
                 <w:rFonts w:ascii="Consolas" w:hAnsi="Consolas" w:cs="Consolas"/>
@@ -1648,6 +1764,7 @@
               </w:rPr>
               <w:t>MobileNo</w:t>
             </w:r>
+            <w:proofErr w:type="spellEnd"/>
             <w:r>
               <w:rPr>
                 <w:rFonts w:ascii="Tahoma" w:hAnsi="Tahoma" w:cs="Tahoma"/>
@@ -1748,6 +1865,7 @@
               </w:rPr>
               <w:t>{</w:t>
             </w:r>
+            <w:proofErr w:type="spellStart"/>
             <w:r>
               <w:rPr>
                 <w:rFonts w:ascii="Consolas" w:hAnsi="Consolas" w:cs="Consolas"/>
@@ -1757,6 +1875,7 @@
               </w:rPr>
               <w:t>PurposeofGatePass</w:t>
             </w:r>
+            <w:proofErr w:type="spellEnd"/>
             <w:r>
               <w:rPr>
                 <w:rFonts w:ascii="Tahoma" w:eastAsia="Times New Roman" w:hAnsi="Tahoma" w:cs="Tahoma"/>
@@ -1802,7 +1921,29 @@
                 <w:sz w:val="16"/>
                 <w:szCs w:val="16"/>
               </w:rPr>
-              <w:t>{materialItems}</w:t>
+              <w:t>{</w:t>
+            </w:r>
+            <w:proofErr w:type="spellStart"/>
+            <w:r>
+              <w:rPr>
+                <w:rFonts w:ascii="Tahoma" w:eastAsia="Arial" w:hAnsi="Tahoma" w:cs="Tahoma"/>
+                <w:b/>
+                <w:bCs/>
+                <w:sz w:val="16"/>
+                <w:szCs w:val="16"/>
+              </w:rPr>
+              <w:t>materialItems</w:t>
+            </w:r>
+            <w:proofErr w:type="spellEnd"/>
+            <w:r>
+              <w:rPr>
+                <w:rFonts w:ascii="Tahoma" w:eastAsia="Arial" w:hAnsi="Tahoma" w:cs="Tahoma"/>
+                <w:b/>
+                <w:bCs/>
+                <w:sz w:val="16"/>
+                <w:szCs w:val="16"/>
+              </w:rPr>
+              <w:t>}</w:t>
             </w:r>
           </w:p>
           <w:p>
@@ -1849,7 +1990,29 @@
                 <w:sz w:val="16"/>
                 <w:szCs w:val="16"/>
               </w:rPr>
-              <w:t>In Words: {TotalInWords}</w:t>
+              <w:t>In Words: {</w:t>
+            </w:r>
+            <w:proofErr w:type="spellStart"/>
+            <w:r>
+              <w:rPr>
+                <w:rFonts w:ascii="Tahoma" w:eastAsia="Arial" w:hAnsi="Tahoma" w:cs="Tahoma"/>
+                <w:b/>
+                <w:bCs/>
+                <w:sz w:val="16"/>
+                <w:szCs w:val="16"/>
+              </w:rPr>
+              <w:t>TotalInWords</w:t>
+            </w:r>
+            <w:proofErr w:type="spellEnd"/>
+            <w:r>
+              <w:rPr>
+                <w:rFonts w:ascii="Tahoma" w:eastAsia="Arial" w:hAnsi="Tahoma" w:cs="Tahoma"/>
+                <w:b/>
+                <w:bCs/>
+                <w:sz w:val="16"/>
+                <w:szCs w:val="16"/>
+              </w:rPr>
+              <w:t>}</w:t>
             </w:r>
           </w:p>
           <w:p>
@@ -1972,8 +2135,20 @@
                       <w:sz w:val="16"/>
                       <w:szCs w:val="16"/>
                     </w:rPr>
-                    <w:t>Cedaar Textile Pvt.Ltd</w:t>
+                    <w:t xml:space="preserve">Cedaar Textile </w:t>
                   </w:r>
+                  <w:proofErr w:type="spellStart"/>
+                  <w:r>
+                    <w:rPr>
+                      <w:rFonts w:ascii="Tahoma" w:hAnsi="Tahoma" w:cs="Tahoma"/>
+                      <w:b/>
+                      <w:color w:val="000000" w:themeColor="text1"/>
+                      <w:sz w:val="16"/>
+                      <w:szCs w:val="16"/>
+                    </w:rPr>
+                    <w:t>Pvt.Ltd</w:t>
+                  </w:r>
+                  <w:proofErr w:type="spellEnd"/>
                   <w:r>
                     <w:rPr>
                       <w:rFonts w:ascii="Tahoma" w:hAnsi="Tahoma" w:cs="Tahoma"/>
@@ -2102,7 +2277,29 @@
                       <w:sz w:val="16"/>
                       <w:szCs w:val="16"/>
                     </w:rPr>
-                    <w:t>For {VendorName}</w:t>
+                    <w:t>For {</w:t>
+                  </w:r>
+                  <w:proofErr w:type="spellStart"/>
+                  <w:r>
+                    <w:rPr>
+                      <w:rFonts w:ascii="Tahoma" w:eastAsia="Arial" w:hAnsi="Tahoma" w:cs="Tahoma"/>
+                      <w:b/>
+                      <w:bCs/>
+                      <w:sz w:val="16"/>
+                      <w:szCs w:val="16"/>
+                    </w:rPr>
+                    <w:t>VendorName</w:t>
+                  </w:r>
+                  <w:proofErr w:type="spellEnd"/>
+                  <w:r>
+                    <w:rPr>
+                      <w:rFonts w:ascii="Tahoma" w:eastAsia="Arial" w:hAnsi="Tahoma" w:cs="Tahoma"/>
+                      <w:b/>
+                      <w:bCs/>
+                      <w:sz w:val="16"/>
+                      <w:szCs w:val="16"/>
+                    </w:rPr>
+                    <w:t>}</w:t>
                   </w:r>
                 </w:p>
                 <w:p>
@@ -2276,6 +2473,7 @@
               </w:rPr>
               <w:t>{</w:t>
             </w:r>
+            <w:proofErr w:type="spellStart"/>
             <w:r>
               <w:rPr>
                 <w:rFonts w:ascii="Consolas" w:hAnsi="Consolas" w:cs="Consolas"/>
@@ -2285,6 +2483,7 @@
               </w:rPr>
               <w:t>AddedBy</w:t>
             </w:r>
+            <w:proofErr w:type="spellEnd"/>
             <w:r>
               <w:rPr>
                 <w:rFonts w:ascii="Tahoma" w:eastAsia="Arial" w:hAnsi="Tahoma" w:cs="Tahoma"/>
@@ -2368,7 +2567,7 @@
                 </mc:Choice>
                 <mc:Fallback>
                   <w:pict>
-                    <v:line w14:anchorId="74483EE1" id="Straight Connector 3" o:spid="_x0000_s1026" style="position:absolute;flip:x;z-index:251665920;visibility:visible;mso-wrap-style:square;mso-width-percent:0;mso-height-percent:0;mso-wrap-distance-left:9pt;mso-wrap-distance-top:0;mso-wrap-distance-right:9pt;mso-wrap-distance-bottom:0;mso-position-horizontal:absolute;mso-position-horizontal-relative:text;mso-position-vertical:absolute;mso-position-vertical-relative:text;mso-width-percent:0;mso-height-percent:0;mso-width-relative:margin;mso-height-relative:margin" from="53pt,5.1pt" to="162.55pt,5.1pt" o:gfxdata="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" strokecolor="windowText" strokeweight=".5pt">
+                    <v:line w14:anchorId="41A23CC9" id="Straight Connector 3" o:spid="_x0000_s1026" style="position:absolute;flip:x;z-index:251665920;visibility:visible;mso-wrap-style:square;mso-width-percent:0;mso-height-percent:0;mso-wrap-distance-left:9pt;mso-wrap-distance-top:0;mso-wrap-distance-right:9pt;mso-wrap-distance-bottom:0;mso-position-horizontal:absolute;mso-position-horizontal-relative:text;mso-position-vertical:absolute;mso-position-vertical-relative:text;mso-width-percent:0;mso-height-percent:0;mso-width-relative:margin;mso-height-relative:margin" from="53pt,5.1pt" to="162.55pt,5.1pt" o:gfxdata="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" strokecolor="windowText" strokeweight=".5pt">
                       <v:stroke joinstyle="miter"/>
                     </v:line>
                   </w:pict>
@@ -2510,6 +2709,7 @@
               </w:rPr>
               <w:t xml:space="preserve">                             {</w:t>
             </w:r>
+            <w:proofErr w:type="spellStart"/>
             <w:r>
               <w:rPr>
                 <w:rFonts w:ascii="Tahoma" w:hAnsi="Tahoma" w:cs="Tahoma"/>
@@ -2518,6 +2718,7 @@
               </w:rPr>
               <w:t>CheckedBy</w:t>
             </w:r>
+            <w:proofErr w:type="spellEnd"/>
             <w:r>
               <w:rPr>
                 <w:rFonts w:ascii="Tahoma" w:eastAsia="Arial" w:hAnsi="Tahoma" w:cs="Tahoma"/>
@@ -2602,7 +2803,7 @@
                 </mc:Choice>
                 <mc:Fallback>
                   <w:pict>
-                    <v:line w14:anchorId="625B6DC3" id="Straight Connector 6" o:spid="_x0000_s1026" style="position:absolute;flip:x;z-index:251667968;visibility:visible;mso-wrap-style:square;mso-width-percent:0;mso-height-percent:0;mso-wrap-distance-left:9pt;mso-wrap-distance-top:0;mso-wrap-distance-right:9pt;mso-wrap-distance-bottom:0;mso-position-horizontal:absolute;mso-position-horizontal-relative:text;mso-position-vertical:absolute;mso-position-vertical-relative:text;mso-width-percent:0;mso-height-percent:0;mso-width-relative:margin;mso-height-relative:margin" from="47.9pt,1.35pt" to="157.45pt,1.35pt" o:gfxdata="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" strokecolor="windowText" strokeweight=".5pt">
+                    <v:line w14:anchorId="3CF0060F" id="Straight Connector 6" o:spid="_x0000_s1026" style="position:absolute;flip:x;z-index:251667968;visibility:visible;mso-wrap-style:square;mso-width-percent:0;mso-height-percent:0;mso-wrap-distance-left:9pt;mso-wrap-distance-top:0;mso-wrap-distance-right:9pt;mso-wrap-distance-bottom:0;mso-position-horizontal:absolute;mso-position-horizontal-relative:text;mso-position-vertical:absolute;mso-position-vertical-relative:text;mso-width-percent:0;mso-height-percent:0;mso-width-relative:margin;mso-height-relative:margin" from="47.9pt,1.35pt" to="157.45pt,1.35pt" o:gfxdata="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" strokecolor="windowText" strokeweight=".5pt">
                       <v:stroke joinstyle="miter"/>
                     </v:line>
                   </w:pict>
@@ -2763,6 +2964,7 @@
               </w:rPr>
               <w:t>{</w:t>
             </w:r>
+            <w:proofErr w:type="spellStart"/>
             <w:r>
               <w:rPr>
                 <w:rFonts w:ascii="Consolas" w:hAnsi="Consolas" w:cs="Consolas"/>
@@ -2772,6 +2974,7 @@
               </w:rPr>
               <w:t>Approvedby</w:t>
             </w:r>
+            <w:proofErr w:type="spellEnd"/>
             <w:r>
               <w:rPr>
                 <w:rFonts w:ascii="Tahoma" w:eastAsia="Arial" w:hAnsi="Tahoma" w:cs="Tahoma"/>
@@ -2855,7 +3058,7 @@
                 </mc:Choice>
                 <mc:Fallback>
                   <w:pict>
-                    <v:line w14:anchorId="2F721D1E" id="Straight Connector 8" o:spid="_x0000_s1026" style="position:absolute;flip:x;z-index:251668992;visibility:visible;mso-wrap-style:square;mso-width-percent:0;mso-height-percent:0;mso-wrap-distance-left:9pt;mso-wrap-distance-top:0;mso-wrap-distance-right:9pt;mso-wrap-distance-bottom:0;mso-position-horizontal:absolute;mso-position-horizontal-relative:text;mso-position-vertical:absolute;mso-position-vertical-relative:text;mso-width-percent:0;mso-height-percent:0;mso-width-relative:margin;mso-height-relative:margin" from="38pt,7.65pt" to="147.55pt,7.65pt" o:gfxdata="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" strokecolor="windowText" strokeweight=".5pt">
+                    <v:line w14:anchorId="2A1AADDC" id="Straight Connector 8" o:spid="_x0000_s1026" style="position:absolute;flip:x;z-index:251668992;visibility:visible;mso-wrap-style:square;mso-width-percent:0;mso-height-percent:0;mso-wrap-distance-left:9pt;mso-wrap-distance-top:0;mso-wrap-distance-right:9pt;mso-wrap-distance-bottom:0;mso-position-horizontal:absolute;mso-position-horizontal-relative:text;mso-position-vertical:absolute;mso-position-vertical-relative:text;mso-width-percent:0;mso-height-percent:0;mso-width-relative:margin;mso-height-relative:margin" from="38pt,7.65pt" to="147.55pt,7.65pt" o:gfxdata="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" strokecolor="windowText" strokeweight=".5pt">
                       <v:stroke joinstyle="miter"/>
                     </v:line>
                   </w:pict>
@@ -2894,6 +3097,7 @@
               </w:rPr>
               <w:t xml:space="preserve">                            </w:t>
             </w:r>
+            <w:proofErr w:type="spellStart"/>
             <w:r>
               <w:rPr>
                 <w:rFonts w:ascii="Tahoma" w:eastAsia="Arial" w:hAnsi="Tahoma" w:cs="Tahoma"/>
@@ -2914,6 +3118,7 @@
               </w:rPr>
               <w:t>By</w:t>
             </w:r>
+            <w:proofErr w:type="spellEnd"/>
           </w:p>
         </w:tc>
         <w:tc>
@@ -2962,6 +3167,7 @@
               </w:rPr>
               <w:t>{</w:t>
             </w:r>
+            <w:proofErr w:type="spellStart"/>
             <w:r>
               <w:rPr>
                 <w:rFonts w:ascii="Consolas" w:hAnsi="Consolas" w:cs="Consolas"/>
@@ -2971,6 +3177,7 @@
               </w:rPr>
               <w:t>SSEmployeeName</w:t>
             </w:r>
+            <w:proofErr w:type="spellEnd"/>
             <w:r>
               <w:rPr>
                 <w:rFonts w:ascii="Tahoma" w:eastAsia="Arial" w:hAnsi="Tahoma" w:cs="Tahoma"/>
@@ -3048,7 +3255,7 @@
                 </mc:Choice>
                 <mc:Fallback>
                   <w:pict>
-                    <v:line w14:anchorId="597EDF34" id="Straight Connector 2" o:spid="_x0000_s1026" style="position:absolute;z-index:251666944;visibility:visible;mso-wrap-style:square;mso-wrap-distance-left:9pt;mso-wrap-distance-top:0;mso-wrap-distance-right:9pt;mso-wrap-distance-bottom:0;mso-position-horizontal:absolute;mso-position-horizontal-relative:text;mso-position-vertical:absolute;mso-position-vertical-relative:text" from="37.05pt,7.45pt" to="149.1pt,7.45pt" o:gfxdata="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" strokecolor="windowText" strokeweight=".5pt">
+                    <v:line w14:anchorId="36CD5378" id="Straight Connector 2" o:spid="_x0000_s1026" style="position:absolute;z-index:251666944;visibility:visible;mso-wrap-style:square;mso-wrap-distance-left:9pt;mso-wrap-distance-top:0;mso-wrap-distance-right:9pt;mso-wrap-distance-bottom:0;mso-position-horizontal:absolute;mso-position-horizontal-relative:text;mso-position-vertical:absolute;mso-position-vertical-relative:text" from="37.05pt,7.45pt" to="149.1pt,7.45pt" o:gfxdata="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" strokecolor="windowText" strokeweight=".5pt">
                       <v:stroke joinstyle="miter"/>
                     </v:line>
                   </w:pict>
@@ -3388,7 +3595,7 @@
 </file>
 
 <file path=word/endnotes.xml><?xml version="1.0" encoding="utf-8"?>
-<w:endnotes xmlns:wpc="http://schemas.microsoft.com/office/word/2010/wordprocessingCanvas" xmlns:mc="http://schemas.openxmlformats.org/markup-compatibility/2006" xmlns:o="urn:schemas-microsoft-com:office:office" xmlns:r="http://schemas.openxmlformats.org/officeDocument/2006/relationships" xmlns:m="http://schemas.openxmlformats.org/officeDocument/2006/math" xmlns:v="urn:schemas-microsoft-com:vml" xmlns:wp14="http://schemas.microsoft.com/office/word/2010/wordprocessingDrawing" xmlns:wp="http://schemas.openxmlformats.org/drawingml/2006/wordprocessingDrawing" xmlns:w10="urn:schemas-microsoft-com:office:word" xmlns:w="http://schemas.openxmlformats.org/wordprocessingml/2006/main" xmlns:w14="http://schemas.microsoft.com/office/word/2010/wordml" xmlns:w15="http://schemas.microsoft.com/office/word/2012/wordml" xmlns:wpg="http://schemas.microsoft.com/office/word/2010/wordprocessingGroup" xmlns:wpi="http://schemas.microsoft.com/office/word/2010/wordprocessingInk" xmlns:wne="http://schemas.microsoft.com/office/word/2006/wordml" xmlns:wps="http://schemas.microsoft.com/office/word/2010/wordprocessingShape" mc:Ignorable="w14 w15 wp14">
+<w:endnotes xmlns:wpc="http://schemas.microsoft.com/office/word/2010/wordprocessingCanvas" xmlns:cx="http://schemas.microsoft.com/office/drawing/2014/chartex" xmlns:cx1="http://schemas.microsoft.com/office/drawing/2015/9/8/chartex" xmlns:cx2="http://schemas.microsoft.com/office/drawing/2015/10/21/chartex" xmlns:cx3="http://schemas.microsoft.com/office/drawing/2016/5/9/chartex" xmlns:cx4="http://schemas.microsoft.com/office/drawing/2016/5/10/chartex" xmlns:cx5="http://schemas.microsoft.com/office/drawing/2016/5/11/chartex" xmlns:cx6="http://schemas.microsoft.com/office/drawing/2016/5/12/chartex" xmlns:cx7="http://schemas.microsoft.com/office/drawing/2016/5/13/chartex" xmlns:cx8="http://schemas.microsoft.com/office/drawing/2016/5/14/chartex" xmlns:mc="http://schemas.openxmlformats.org/markup-compatibility/2006" xmlns:aink="http://schemas.microsoft.com/office/drawing/2016/ink" xmlns:am3d="http://schemas.microsoft.com/office/drawing/2017/model3d" xmlns:o="urn:schemas-microsoft-com:office:office" xmlns:oel="http://schemas.microsoft.com/office/2019/extlst" xmlns:r="http://schemas.openxmlformats.org/officeDocument/2006/relationships" xmlns:m="http://schemas.openxmlformats.org/officeDocument/2006/math" xmlns:v="urn:schemas-microsoft-com:vml" xmlns:wp14="http://schemas.microsoft.com/office/word/2010/wordprocessingDrawing" xmlns:wp="http://schemas.openxmlformats.org/drawingml/2006/wordprocessingDrawing" xmlns:w10="urn:schemas-microsoft-com:office:word" xmlns:w="http://schemas.openxmlformats.org/wordprocessingml/2006/main" xmlns:w14="http://schemas.microsoft.com/office/word/2010/wordml" xmlns:w15="http://schemas.microsoft.com/office/word/2012/wordml" xmlns:w16cex="http://schemas.microsoft.com/office/word/2018/wordml/cex" xmlns:w16cid="http://schemas.microsoft.com/office/word/2016/wordml/cid" xmlns:w16="http://schemas.microsoft.com/office/word/2018/wordml" xmlns:w16sdtdh="http://schemas.microsoft.com/office/word/2020/wordml/sdtdatahash" xmlns:w16se="http://schemas.microsoft.com/office/word/2015/wordml/symex" xmlns:wpg="http://schemas.microsoft.com/office/word/2010/wordprocessingGroup" xmlns:wpi="http://schemas.microsoft.com/office/word/2010/wordprocessingInk" xmlns:wne="http://schemas.microsoft.com/office/word/2006/wordml" xmlns:wps="http://schemas.microsoft.com/office/word/2010/wordprocessingShape" mc:Ignorable="w14 w15 w16se w16cid w16 w16cex w16sdtdh wp14">
   <w:endnote w:type="separator" w:id="-1">
     <w:p>
       <w:r>
@@ -3407,7 +3614,7 @@
 </file>
 
 <file path=word/footer1.xml><?xml version="1.0" encoding="utf-8"?>
-<w:ftr xmlns:wpc="http://schemas.microsoft.com/office/word/2010/wordprocessingCanvas" xmlns:mc="http://schemas.openxmlformats.org/markup-compatibility/2006" xmlns:o="urn:schemas-microsoft-com:office:office" xmlns:r="http://schemas.openxmlformats.org/officeDocument/2006/relationships" xmlns:m="http://schemas.openxmlformats.org/officeDocument/2006/math" xmlns:v="urn:schemas-microsoft-com:vml" xmlns:wp14="http://schemas.microsoft.com/office/word/2010/wordprocessingDrawing" xmlns:wp="http://schemas.openxmlformats.org/drawingml/2006/wordprocessingDrawing" xmlns:w10="urn:schemas-microsoft-com:office:word" xmlns:w="http://schemas.openxmlformats.org/wordprocessingml/2006/main" xmlns:w14="http://schemas.microsoft.com/office/word/2010/wordml" xmlns:w15="http://schemas.microsoft.com/office/word/2012/wordml" xmlns:wpg="http://schemas.microsoft.com/office/word/2010/wordprocessingGroup" xmlns:wpi="http://schemas.microsoft.com/office/word/2010/wordprocessingInk" xmlns:wne="http://schemas.microsoft.com/office/word/2006/wordml" xmlns:wps="http://schemas.microsoft.com/office/word/2010/wordprocessingShape" mc:Ignorable="w14 w15 wp14">
+<w:ftr xmlns:wpc="http://schemas.microsoft.com/office/word/2010/wordprocessingCanvas" xmlns:cx="http://schemas.microsoft.com/office/drawing/2014/chartex" xmlns:cx1="http://schemas.microsoft.com/office/drawing/2015/9/8/chartex" xmlns:cx2="http://schemas.microsoft.com/office/drawing/2015/10/21/chartex" xmlns:cx3="http://schemas.microsoft.com/office/drawing/2016/5/9/chartex" xmlns:cx4="http://schemas.microsoft.com/office/drawing/2016/5/10/chartex" xmlns:cx5="http://schemas.microsoft.com/office/drawing/2016/5/11/chartex" xmlns:cx6="http://schemas.microsoft.com/office/drawing/2016/5/12/chartex" xmlns:cx7="http://schemas.microsoft.com/office/drawing/2016/5/13/chartex" xmlns:cx8="http://schemas.microsoft.com/office/drawing/2016/5/14/chartex" xmlns:mc="http://schemas.openxmlformats.org/markup-compatibility/2006" xmlns:aink="http://schemas.microsoft.com/office/drawing/2016/ink" xmlns:am3d="http://schemas.microsoft.com/office/drawing/2017/model3d" xmlns:o="urn:schemas-microsoft-com:office:office" xmlns:oel="http://schemas.microsoft.com/office/2019/extlst" xmlns:r="http://schemas.openxmlformats.org/officeDocument/2006/relationships" xmlns:m="http://schemas.openxmlformats.org/officeDocument/2006/math" xmlns:v="urn:schemas-microsoft-com:vml" xmlns:wp14="http://schemas.microsoft.com/office/word/2010/wordprocessingDrawing" xmlns:wp="http://schemas.openxmlformats.org/drawingml/2006/wordprocessingDrawing" xmlns:w10="urn:schemas-microsoft-com:office:word" xmlns:w="http://schemas.openxmlformats.org/wordprocessingml/2006/main" xmlns:w14="http://schemas.microsoft.com/office/word/2010/wordml" xmlns:w15="http://schemas.microsoft.com/office/word/2012/wordml" xmlns:w16cex="http://schemas.microsoft.com/office/word/2018/wordml/cex" xmlns:w16cid="http://schemas.microsoft.com/office/word/2016/wordml/cid" xmlns:w16="http://schemas.microsoft.com/office/word/2018/wordml" xmlns:w16sdtdh="http://schemas.microsoft.com/office/word/2020/wordml/sdtdatahash" xmlns:w16se="http://schemas.microsoft.com/office/word/2015/wordml/symex" xmlns:wpg="http://schemas.microsoft.com/office/word/2010/wordprocessingGroup" xmlns:wpi="http://schemas.microsoft.com/office/word/2010/wordprocessingInk" xmlns:wne="http://schemas.microsoft.com/office/word/2006/wordml" xmlns:wps="http://schemas.microsoft.com/office/word/2010/wordprocessingShape" mc:Ignorable="w14 w15 w16se w16cid w16 w16cex w16sdtdh wp14">
   <w:p>
     <w:pPr>
       <w:pStyle w:val="Footer"/>
@@ -3417,7 +3624,7 @@
 </file>
 
 <file path=word/footer2.xml><?xml version="1.0" encoding="utf-8"?>
-<w:ftr xmlns:wpc="http://schemas.microsoft.com/office/word/2010/wordprocessingCanvas" xmlns:mc="http://schemas.openxmlformats.org/markup-compatibility/2006" xmlns:o="urn:schemas-microsoft-com:office:office" xmlns:r="http://schemas.openxmlformats.org/officeDocument/2006/relationships" xmlns:m="http://schemas.openxmlformats.org/officeDocument/2006/math" xmlns:v="urn:schemas-microsoft-com:vml" xmlns:wp14="http://schemas.microsoft.com/office/word/2010/wordprocessingDrawing" xmlns:wp="http://schemas.openxmlformats.org/drawingml/2006/wordprocessingDrawing" xmlns:w10="urn:schemas-microsoft-com:office:word" xmlns:w="http://schemas.openxmlformats.org/wordprocessingml/2006/main" xmlns:w14="http://schemas.microsoft.com/office/word/2010/wordml" xmlns:w15="http://schemas.microsoft.com/office/word/2012/wordml" xmlns:wpg="http://schemas.microsoft.com/office/word/2010/wordprocessingGroup" xmlns:wpi="http://schemas.microsoft.com/office/word/2010/wordprocessingInk" xmlns:wne="http://schemas.microsoft.com/office/word/2006/wordml" xmlns:wps="http://schemas.microsoft.com/office/word/2010/wordprocessingShape" mc:Ignorable="w14 w15 wp14">
+<w:ftr xmlns:wpc="http://schemas.microsoft.com/office/word/2010/wordprocessingCanvas" xmlns:cx="http://schemas.microsoft.com/office/drawing/2014/chartex" xmlns:cx1="http://schemas.microsoft.com/office/drawing/2015/9/8/chartex" xmlns:cx2="http://schemas.microsoft.com/office/drawing/2015/10/21/chartex" xmlns:cx3="http://schemas.microsoft.com/office/drawing/2016/5/9/chartex" xmlns:cx4="http://schemas.microsoft.com/office/drawing/2016/5/10/chartex" xmlns:cx5="http://schemas.microsoft.com/office/drawing/2016/5/11/chartex" xmlns:cx6="http://schemas.microsoft.com/office/drawing/2016/5/12/chartex" xmlns:cx7="http://schemas.microsoft.com/office/drawing/2016/5/13/chartex" xmlns:cx8="http://schemas.microsoft.com/office/drawing/2016/5/14/chartex" xmlns:mc="http://schemas.openxmlformats.org/markup-compatibility/2006" xmlns:aink="http://schemas.microsoft.com/office/drawing/2016/ink" xmlns:am3d="http://schemas.microsoft.com/office/drawing/2017/model3d" xmlns:o="urn:schemas-microsoft-com:office:office" xmlns:oel="http://schemas.microsoft.com/office/2019/extlst" xmlns:r="http://schemas.openxmlformats.org/officeDocument/2006/relationships" xmlns:m="http://schemas.openxmlformats.org/officeDocument/2006/math" xmlns:v="urn:schemas-microsoft-com:vml" xmlns:wp14="http://schemas.microsoft.com/office/word/2010/wordprocessingDrawing" xmlns:wp="http://schemas.openxmlformats.org/drawingml/2006/wordprocessingDrawing" xmlns:w10="urn:schemas-microsoft-com:office:word" xmlns:w="http://schemas.openxmlformats.org/wordprocessingml/2006/main" xmlns:w14="http://schemas.microsoft.com/office/word/2010/wordml" xmlns:w15="http://schemas.microsoft.com/office/word/2012/wordml" xmlns:w16cex="http://schemas.microsoft.com/office/word/2018/wordml/cex" xmlns:w16cid="http://schemas.microsoft.com/office/word/2016/wordml/cid" xmlns:w16="http://schemas.microsoft.com/office/word/2018/wordml" xmlns:w16sdtdh="http://schemas.microsoft.com/office/word/2020/wordml/sdtdatahash" xmlns:w16se="http://schemas.microsoft.com/office/word/2015/wordml/symex" xmlns:wpg="http://schemas.microsoft.com/office/word/2010/wordprocessingGroup" xmlns:wpi="http://schemas.microsoft.com/office/word/2010/wordprocessingInk" xmlns:wne="http://schemas.microsoft.com/office/word/2006/wordml" xmlns:wps="http://schemas.microsoft.com/office/word/2010/wordprocessingShape" mc:Ignorable="w14 w15 w16se w16cid w16 w16cex w16sdtdh wp14">
   <w:sdt>
     <w:sdtPr>
       <w:id w:val="-901824678"/>
@@ -3476,14 +3683,104 @@
         <w:sz w:val="16"/>
         <w:szCs w:val="16"/>
       </w:rPr>
-      <w:t>Mouza: Depashai, U.P: Sombag, Kalampur, P.S: Dhamrai District: Dhaka, Bangladesh.Web: www.ocl-bd.com Phone: +8809612223355</w:t>
+      <w:t xml:space="preserve">Mouza: </w:t>
+    </w:r>
+    <w:proofErr w:type="spellStart"/>
+    <w:r>
+      <w:rPr>
+        <w:rFonts w:ascii="Tahoma" w:hAnsi="Tahoma" w:cs="Tahoma"/>
+        <w:sz w:val="16"/>
+        <w:szCs w:val="16"/>
+      </w:rPr>
+      <w:t>Depashai</w:t>
+    </w:r>
+    <w:proofErr w:type="spellEnd"/>
+    <w:r>
+      <w:rPr>
+        <w:rFonts w:ascii="Tahoma" w:hAnsi="Tahoma" w:cs="Tahoma"/>
+        <w:sz w:val="16"/>
+        <w:szCs w:val="16"/>
+      </w:rPr>
+      <w:t xml:space="preserve">, U.P: </w:t>
+    </w:r>
+    <w:proofErr w:type="spellStart"/>
+    <w:r>
+      <w:rPr>
+        <w:rFonts w:ascii="Tahoma" w:hAnsi="Tahoma" w:cs="Tahoma"/>
+        <w:sz w:val="16"/>
+        <w:szCs w:val="16"/>
+      </w:rPr>
+      <w:t>Sombag</w:t>
+    </w:r>
+    <w:proofErr w:type="spellEnd"/>
+    <w:r>
+      <w:rPr>
+        <w:rFonts w:ascii="Tahoma" w:hAnsi="Tahoma" w:cs="Tahoma"/>
+        <w:sz w:val="16"/>
+        <w:szCs w:val="16"/>
+      </w:rPr>
+      <w:t xml:space="preserve">, </w:t>
+    </w:r>
+    <w:proofErr w:type="spellStart"/>
+    <w:r>
+      <w:rPr>
+        <w:rFonts w:ascii="Tahoma" w:hAnsi="Tahoma" w:cs="Tahoma"/>
+        <w:sz w:val="16"/>
+        <w:szCs w:val="16"/>
+      </w:rPr>
+      <w:t>Kalampur</w:t>
+    </w:r>
+    <w:proofErr w:type="spellEnd"/>
+    <w:r>
+      <w:rPr>
+        <w:rFonts w:ascii="Tahoma" w:hAnsi="Tahoma" w:cs="Tahoma"/>
+        <w:sz w:val="16"/>
+        <w:szCs w:val="16"/>
+      </w:rPr>
+      <w:t xml:space="preserve">, P.S: </w:t>
+    </w:r>
+    <w:proofErr w:type="spellStart"/>
+    <w:r>
+      <w:rPr>
+        <w:rFonts w:ascii="Tahoma" w:hAnsi="Tahoma" w:cs="Tahoma"/>
+        <w:sz w:val="16"/>
+        <w:szCs w:val="16"/>
+      </w:rPr>
+      <w:t>Dhamrai</w:t>
+    </w:r>
+    <w:proofErr w:type="spellEnd"/>
+    <w:r>
+      <w:rPr>
+        <w:rFonts w:ascii="Tahoma" w:hAnsi="Tahoma" w:cs="Tahoma"/>
+        <w:sz w:val="16"/>
+        <w:szCs w:val="16"/>
+      </w:rPr>
+      <w:t xml:space="preserve"> District: Dhaka, </w:t>
+    </w:r>
+    <w:proofErr w:type="spellStart"/>
+    <w:r>
+      <w:rPr>
+        <w:rFonts w:ascii="Tahoma" w:hAnsi="Tahoma" w:cs="Tahoma"/>
+        <w:sz w:val="16"/>
+        <w:szCs w:val="16"/>
+      </w:rPr>
+      <w:t>Bangladesh.Web</w:t>
+    </w:r>
+    <w:proofErr w:type="spellEnd"/>
+    <w:r>
+      <w:rPr>
+        <w:rFonts w:ascii="Tahoma" w:hAnsi="Tahoma" w:cs="Tahoma"/>
+        <w:sz w:val="16"/>
+        <w:szCs w:val="16"/>
+      </w:rPr>
+      <w:t>: www.ocl-bd.com Phone: +8809612223355</w:t>
     </w:r>
   </w:p>
 </w:ftr>
 </file>
 
 <file path=word/footer3.xml><?xml version="1.0" encoding="utf-8"?>
-<w:ftr xmlns:wpc="http://schemas.microsoft.com/office/word/2010/wordprocessingCanvas" xmlns:mc="http://schemas.openxmlformats.org/markup-compatibility/2006" xmlns:o="urn:schemas-microsoft-com:office:office" xmlns:r="http://schemas.openxmlformats.org/officeDocument/2006/relationships" xmlns:m="http://schemas.openxmlformats.org/officeDocument/2006/math" xmlns:v="urn:schemas-microsoft-com:vml" xmlns:wp14="http://schemas.microsoft.com/office/word/2010/wordprocessingDrawing" xmlns:wp="http://schemas.openxmlformats.org/drawingml/2006/wordprocessingDrawing" xmlns:w10="urn:schemas-microsoft-com:office:word" xmlns:w="http://schemas.openxmlformats.org/wordprocessingml/2006/main" xmlns:w14="http://schemas.microsoft.com/office/word/2010/wordml" xmlns:w15="http://schemas.microsoft.com/office/word/2012/wordml" xmlns:wpg="http://schemas.microsoft.com/office/word/2010/wordprocessingGroup" xmlns:wpi="http://schemas.microsoft.com/office/word/2010/wordprocessingInk" xmlns:wne="http://schemas.microsoft.com/office/word/2006/wordml" xmlns:wps="http://schemas.microsoft.com/office/word/2010/wordprocessingShape" mc:Ignorable="w14 w15 wp14">
+<w:ftr xmlns:wpc="http://schemas.microsoft.com/office/word/2010/wordprocessingCanvas" xmlns:cx="http://schemas.microsoft.com/office/drawing/2014/chartex" xmlns:cx1="http://schemas.microsoft.com/office/drawing/2015/9/8/chartex" xmlns:cx2="http://schemas.microsoft.com/office/drawing/2015/10/21/chartex" xmlns:cx3="http://schemas.microsoft.com/office/drawing/2016/5/9/chartex" xmlns:cx4="http://schemas.microsoft.com/office/drawing/2016/5/10/chartex" xmlns:cx5="http://schemas.microsoft.com/office/drawing/2016/5/11/chartex" xmlns:cx6="http://schemas.microsoft.com/office/drawing/2016/5/12/chartex" xmlns:cx7="http://schemas.microsoft.com/office/drawing/2016/5/13/chartex" xmlns:cx8="http://schemas.microsoft.com/office/drawing/2016/5/14/chartex" xmlns:mc="http://schemas.openxmlformats.org/markup-compatibility/2006" xmlns:aink="http://schemas.microsoft.com/office/drawing/2016/ink" xmlns:am3d="http://schemas.microsoft.com/office/drawing/2017/model3d" xmlns:o="urn:schemas-microsoft-com:office:office" xmlns:oel="http://schemas.microsoft.com/office/2019/extlst" xmlns:r="http://schemas.openxmlformats.org/officeDocument/2006/relationships" xmlns:m="http://schemas.openxmlformats.org/officeDocument/2006/math" xmlns:v="urn:schemas-microsoft-com:vml" xmlns:wp14="http://schemas.microsoft.com/office/word/2010/wordprocessingDrawing" xmlns:wp="http://schemas.openxmlformats.org/drawingml/2006/wordprocessingDrawing" xmlns:w10="urn:schemas-microsoft-com:office:word" xmlns:w="http://schemas.openxmlformats.org/wordprocessingml/2006/main" xmlns:w14="http://schemas.microsoft.com/office/word/2010/wordml" xmlns:w15="http://schemas.microsoft.com/office/word/2012/wordml" xmlns:w16cex="http://schemas.microsoft.com/office/word/2018/wordml/cex" xmlns:w16cid="http://schemas.microsoft.com/office/word/2016/wordml/cid" xmlns:w16="http://schemas.microsoft.com/office/word/2018/wordml" xmlns:w16sdtdh="http://schemas.microsoft.com/office/word/2020/wordml/sdtdatahash" xmlns:w16se="http://schemas.microsoft.com/office/word/2015/wordml/symex" xmlns:wpg="http://schemas.microsoft.com/office/word/2010/wordprocessingGroup" xmlns:wpi="http://schemas.microsoft.com/office/word/2010/wordprocessingInk" xmlns:wne="http://schemas.microsoft.com/office/word/2006/wordml" xmlns:wps="http://schemas.microsoft.com/office/word/2010/wordprocessingShape" mc:Ignorable="w14 w15 w16se w16cid w16 w16cex w16sdtdh wp14">
   <w:p>
     <w:pPr>
       <w:pStyle w:val="Footer"/>
@@ -3493,7 +3790,7 @@
 </file>
 
 <file path=word/footnotes.xml><?xml version="1.0" encoding="utf-8"?>
-<w:footnotes xmlns:wpc="http://schemas.microsoft.com/office/word/2010/wordprocessingCanvas" xmlns:mc="http://schemas.openxmlformats.org/markup-compatibility/2006" xmlns:o="urn:schemas-microsoft-com:office:office" xmlns:r="http://schemas.openxmlformats.org/officeDocument/2006/relationships" xmlns:m="http://schemas.openxmlformats.org/officeDocument/2006/math" xmlns:v="urn:schemas-microsoft-com:vml" xmlns:wp14="http://schemas.microsoft.com/office/word/2010/wordprocessingDrawing" xmlns:wp="http://schemas.openxmlformats.org/drawingml/2006/wordprocessingDrawing" xmlns:w10="urn:schemas-microsoft-com:office:word" xmlns:w="http://schemas.openxmlformats.org/wordprocessingml/2006/main" xmlns:w14="http://schemas.microsoft.com/office/word/2010/wordml" xmlns:w15="http://schemas.microsoft.com/office/word/2012/wordml" xmlns:wpg="http://schemas.microsoft.com/office/word/2010/wordprocessingGroup" xmlns:wpi="http://schemas.microsoft.com/office/word/2010/wordprocessingInk" xmlns:wne="http://schemas.microsoft.com/office/word/2006/wordml" xmlns:wps="http://schemas.microsoft.com/office/word/2010/wordprocessingShape" mc:Ignorable="w14 w15 wp14">
+<w:footnotes xmlns:wpc="http://schemas.microsoft.com/office/word/2010/wordprocessingCanvas" xmlns:cx="http://schemas.microsoft.com/office/drawing/2014/chartex" xmlns:cx1="http://schemas.microsoft.com/office/drawing/2015/9/8/chartex" xmlns:cx2="http://schemas.microsoft.com/office/drawing/2015/10/21/chartex" xmlns:cx3="http://schemas.microsoft.com/office/drawing/2016/5/9/chartex" xmlns:cx4="http://schemas.microsoft.com/office/drawing/2016/5/10/chartex" xmlns:cx5="http://schemas.microsoft.com/office/drawing/2016/5/11/chartex" xmlns:cx6="http://schemas.microsoft.com/office/drawing/2016/5/12/chartex" xmlns:cx7="http://schemas.microsoft.com/office/drawing/2016/5/13/chartex" xmlns:cx8="http://schemas.microsoft.com/office/drawing/2016/5/14/chartex" xmlns:mc="http://schemas.openxmlformats.org/markup-compatibility/2006" xmlns:aink="http://schemas.microsoft.com/office/drawing/2016/ink" xmlns:am3d="http://schemas.microsoft.com/office/drawing/2017/model3d" xmlns:o="urn:schemas-microsoft-com:office:office" xmlns:oel="http://schemas.microsoft.com/office/2019/extlst" xmlns:r="http://schemas.openxmlformats.org/officeDocument/2006/relationships" xmlns:m="http://schemas.openxmlformats.org/officeDocument/2006/math" xmlns:v="urn:schemas-microsoft-com:vml" xmlns:wp14="http://schemas.microsoft.com/office/word/2010/wordprocessingDrawing" xmlns:wp="http://schemas.openxmlformats.org/drawingml/2006/wordprocessingDrawing" xmlns:w10="urn:schemas-microsoft-com:office:word" xmlns:w="http://schemas.openxmlformats.org/wordprocessingml/2006/main" xmlns:w14="http://schemas.microsoft.com/office/word/2010/wordml" xmlns:w15="http://schemas.microsoft.com/office/word/2012/wordml" xmlns:w16cex="http://schemas.microsoft.com/office/word/2018/wordml/cex" xmlns:w16cid="http://schemas.microsoft.com/office/word/2016/wordml/cid" xmlns:w16="http://schemas.microsoft.com/office/word/2018/wordml" xmlns:w16sdtdh="http://schemas.microsoft.com/office/word/2020/wordml/sdtdatahash" xmlns:w16se="http://schemas.microsoft.com/office/word/2015/wordml/symex" xmlns:wpg="http://schemas.microsoft.com/office/word/2010/wordprocessingGroup" xmlns:wpi="http://schemas.microsoft.com/office/word/2010/wordprocessingInk" xmlns:wne="http://schemas.microsoft.com/office/word/2006/wordml" xmlns:wps="http://schemas.microsoft.com/office/word/2010/wordprocessingShape" mc:Ignorable="w14 w15 w16se w16cid w16 w16cex w16sdtdh wp14">
   <w:footnote w:type="separator" w:id="-1">
     <w:p>
       <w:r>
@@ -3512,7 +3809,7 @@
 </file>
 
 <file path=word/header1.xml><?xml version="1.0" encoding="utf-8"?>
-<w:hdr xmlns:wpc="http://schemas.microsoft.com/office/word/2010/wordprocessingCanvas" xmlns:mc="http://schemas.openxmlformats.org/markup-compatibility/2006" xmlns:o="urn:schemas-microsoft-com:office:office" xmlns:r="http://schemas.openxmlformats.org/officeDocument/2006/relationships" xmlns:m="http://schemas.openxmlformats.org/officeDocument/2006/math" xmlns:v="urn:schemas-microsoft-com:vml" xmlns:wp14="http://schemas.microsoft.com/office/word/2010/wordprocessingDrawing" xmlns:wp="http://schemas.openxmlformats.org/drawingml/2006/wordprocessingDrawing" xmlns:w10="urn:schemas-microsoft-com:office:word" xmlns:w="http://schemas.openxmlformats.org/wordprocessingml/2006/main" xmlns:w14="http://schemas.microsoft.com/office/word/2010/wordml" xmlns:w15="http://schemas.microsoft.com/office/word/2012/wordml" xmlns:wpg="http://schemas.microsoft.com/office/word/2010/wordprocessingGroup" xmlns:wpi="http://schemas.microsoft.com/office/word/2010/wordprocessingInk" xmlns:wne="http://schemas.microsoft.com/office/word/2006/wordml" xmlns:wps="http://schemas.microsoft.com/office/word/2010/wordprocessingShape" mc:Ignorable="w14 w15 wp14">
+<w:hdr xmlns:wpc="http://schemas.microsoft.com/office/word/2010/wordprocessingCanvas" xmlns:cx="http://schemas.microsoft.com/office/drawing/2014/chartex" xmlns:cx1="http://schemas.microsoft.com/office/drawing/2015/9/8/chartex" xmlns:cx2="http://schemas.microsoft.com/office/drawing/2015/10/21/chartex" xmlns:cx3="http://schemas.microsoft.com/office/drawing/2016/5/9/chartex" xmlns:cx4="http://schemas.microsoft.com/office/drawing/2016/5/10/chartex" xmlns:cx5="http://schemas.microsoft.com/office/drawing/2016/5/11/chartex" xmlns:cx6="http://schemas.microsoft.com/office/drawing/2016/5/12/chartex" xmlns:cx7="http://schemas.microsoft.com/office/drawing/2016/5/13/chartex" xmlns:cx8="http://schemas.microsoft.com/office/drawing/2016/5/14/chartex" xmlns:mc="http://schemas.openxmlformats.org/markup-compatibility/2006" xmlns:aink="http://schemas.microsoft.com/office/drawing/2016/ink" xmlns:am3d="http://schemas.microsoft.com/office/drawing/2017/model3d" xmlns:o="urn:schemas-microsoft-com:office:office" xmlns:oel="http://schemas.microsoft.com/office/2019/extlst" xmlns:r="http://schemas.openxmlformats.org/officeDocument/2006/relationships" xmlns:m="http://schemas.openxmlformats.org/officeDocument/2006/math" xmlns:v="urn:schemas-microsoft-com:vml" xmlns:wp14="http://schemas.microsoft.com/office/word/2010/wordprocessingDrawing" xmlns:wp="http://schemas.openxmlformats.org/drawingml/2006/wordprocessingDrawing" xmlns:w10="urn:schemas-microsoft-com:office:word" xmlns:w="http://schemas.openxmlformats.org/wordprocessingml/2006/main" xmlns:w14="http://schemas.microsoft.com/office/word/2010/wordml" xmlns:w15="http://schemas.microsoft.com/office/word/2012/wordml" xmlns:w16cex="http://schemas.microsoft.com/office/word/2018/wordml/cex" xmlns:w16cid="http://schemas.microsoft.com/office/word/2016/wordml/cid" xmlns:w16="http://schemas.microsoft.com/office/word/2018/wordml" xmlns:w16sdtdh="http://schemas.microsoft.com/office/word/2020/wordml/sdtdatahash" xmlns:w16se="http://schemas.microsoft.com/office/word/2015/wordml/symex" xmlns:wpg="http://schemas.microsoft.com/office/word/2010/wordprocessingGroup" xmlns:wpi="http://schemas.microsoft.com/office/word/2010/wordprocessingInk" xmlns:wne="http://schemas.microsoft.com/office/word/2006/wordml" xmlns:wps="http://schemas.microsoft.com/office/word/2010/wordprocessingShape" mc:Ignorable="w14 w15 w16se w16cid w16 w16cex w16sdtdh wp14">
   <w:p>
     <w:pPr>
       <w:pStyle w:val="Header"/>
@@ -3522,7 +3819,7 @@
 </file>
 
 <file path=word/header2.xml><?xml version="1.0" encoding="utf-8"?>
-<w:hdr xmlns:wpc="http://schemas.microsoft.com/office/word/2010/wordprocessingCanvas" xmlns:mc="http://schemas.openxmlformats.org/markup-compatibility/2006" xmlns:o="urn:schemas-microsoft-com:office:office" xmlns:r="http://schemas.openxmlformats.org/officeDocument/2006/relationships" xmlns:m="http://schemas.openxmlformats.org/officeDocument/2006/math" xmlns:v="urn:schemas-microsoft-com:vml" xmlns:wp14="http://schemas.microsoft.com/office/word/2010/wordprocessingDrawing" xmlns:wp="http://schemas.openxmlformats.org/drawingml/2006/wordprocessingDrawing" xmlns:w10="urn:schemas-microsoft-com:office:word" xmlns:w="http://schemas.openxmlformats.org/wordprocessingml/2006/main" xmlns:w14="http://schemas.microsoft.com/office/word/2010/wordml" xmlns:w15="http://schemas.microsoft.com/office/word/2012/wordml" xmlns:wpg="http://schemas.microsoft.com/office/word/2010/wordprocessingGroup" xmlns:wpi="http://schemas.microsoft.com/office/word/2010/wordprocessingInk" xmlns:wne="http://schemas.microsoft.com/office/word/2006/wordml" xmlns:wps="http://schemas.microsoft.com/office/word/2010/wordprocessingShape" mc:Ignorable="w14 w15 wp14">
+<w:hdr xmlns:wpc="http://schemas.microsoft.com/office/word/2010/wordprocessingCanvas" xmlns:cx="http://schemas.microsoft.com/office/drawing/2014/chartex" xmlns:cx1="http://schemas.microsoft.com/office/drawing/2015/9/8/chartex" xmlns:cx2="http://schemas.microsoft.com/office/drawing/2015/10/21/chartex" xmlns:cx3="http://schemas.microsoft.com/office/drawing/2016/5/9/chartex" xmlns:cx4="http://schemas.microsoft.com/office/drawing/2016/5/10/chartex" xmlns:cx5="http://schemas.microsoft.com/office/drawing/2016/5/11/chartex" xmlns:cx6="http://schemas.microsoft.com/office/drawing/2016/5/12/chartex" xmlns:cx7="http://schemas.microsoft.com/office/drawing/2016/5/13/chartex" xmlns:cx8="http://schemas.microsoft.com/office/drawing/2016/5/14/chartex" xmlns:mc="http://schemas.openxmlformats.org/markup-compatibility/2006" xmlns:aink="http://schemas.microsoft.com/office/drawing/2016/ink" xmlns:am3d="http://schemas.microsoft.com/office/drawing/2017/model3d" xmlns:o="urn:schemas-microsoft-com:office:office" xmlns:oel="http://schemas.microsoft.com/office/2019/extlst" xmlns:r="http://schemas.openxmlformats.org/officeDocument/2006/relationships" xmlns:m="http://schemas.openxmlformats.org/officeDocument/2006/math" xmlns:v="urn:schemas-microsoft-com:vml" xmlns:wp14="http://schemas.microsoft.com/office/word/2010/wordprocessingDrawing" xmlns:wp="http://schemas.openxmlformats.org/drawingml/2006/wordprocessingDrawing" xmlns:w10="urn:schemas-microsoft-com:office:word" xmlns:w="http://schemas.openxmlformats.org/wordprocessingml/2006/main" xmlns:w14="http://schemas.microsoft.com/office/word/2010/wordml" xmlns:w15="http://schemas.microsoft.com/office/word/2012/wordml" xmlns:w16cex="http://schemas.microsoft.com/office/word/2018/wordml/cex" xmlns:w16cid="http://schemas.microsoft.com/office/word/2016/wordml/cid" xmlns:w16="http://schemas.microsoft.com/office/word/2018/wordml" xmlns:w16sdtdh="http://schemas.microsoft.com/office/word/2020/wordml/sdtdatahash" xmlns:w16se="http://schemas.microsoft.com/office/word/2015/wordml/symex" xmlns:wpg="http://schemas.microsoft.com/office/word/2010/wordprocessingGroup" xmlns:wpi="http://schemas.microsoft.com/office/word/2010/wordprocessingInk" xmlns:wne="http://schemas.microsoft.com/office/word/2006/wordml" xmlns:wps="http://schemas.microsoft.com/office/word/2010/wordprocessingShape" mc:Ignorable="w14 w15 w16se w16cid w16 w16cex w16sdtdh wp14">
   <w:p>
     <w:pPr>
       <w:pStyle w:val="Header"/>
@@ -3605,6 +3902,7 @@
                               <w:szCs w:val="18"/>
                             </w:rPr>
                           </w:pPr>
+                          <w:proofErr w:type="spellStart"/>
                           <w:r>
                             <w:rPr>
                               <w:rFonts w:ascii="Arial" w:hAnsi="Arial" w:cs="Arial"/>
@@ -3612,7 +3910,57 @@
                               <w:sz w:val="18"/>
                               <w:szCs w:val="18"/>
                             </w:rPr>
-                            <w:t>Akbarpur Channa, Ludhiana-Malerkotla Road, Ahmedgarh - 148021 District, Sangrur</w:t>
+                            <w:t>Akbarpur</w:t>
+                          </w:r>
+                          <w:proofErr w:type="spellEnd"/>
+                          <w:r>
+                            <w:rPr>
+                              <w:rFonts w:ascii="Arial" w:hAnsi="Arial" w:cs="Arial"/>
+                              <w:color w:val="525A5D"/>
+                              <w:sz w:val="18"/>
+                              <w:szCs w:val="18"/>
+                            </w:rPr>
+                            <w:t xml:space="preserve"> Channa, Ludhiana-</w:t>
+                          </w:r>
+                          <w:proofErr w:type="spellStart"/>
+                          <w:r>
+                            <w:rPr>
+                              <w:rFonts w:ascii="Arial" w:hAnsi="Arial" w:cs="Arial"/>
+                              <w:color w:val="525A5D"/>
+                              <w:sz w:val="18"/>
+                              <w:szCs w:val="18"/>
+                            </w:rPr>
+                            <w:t>Malerkotla</w:t>
+                          </w:r>
+                          <w:proofErr w:type="spellEnd"/>
+                          <w:r>
+                            <w:rPr>
+                              <w:rFonts w:ascii="Arial" w:hAnsi="Arial" w:cs="Arial"/>
+                              <w:color w:val="525A5D"/>
+                              <w:sz w:val="18"/>
+                              <w:szCs w:val="18"/>
+                            </w:rPr>
+                            <w:t xml:space="preserve"> Road, </w:t>
+                          </w:r>
+                          <w:proofErr w:type="spellStart"/>
+                          <w:r>
+                            <w:rPr>
+                              <w:rFonts w:ascii="Arial" w:hAnsi="Arial" w:cs="Arial"/>
+                              <w:color w:val="525A5D"/>
+                              <w:sz w:val="18"/>
+                              <w:szCs w:val="18"/>
+                            </w:rPr>
+                            <w:t>Ahmedgarh</w:t>
+                          </w:r>
+                          <w:proofErr w:type="spellEnd"/>
+                          <w:r>
+                            <w:rPr>
+                              <w:rFonts w:ascii="Arial" w:hAnsi="Arial" w:cs="Arial"/>
+                              <w:color w:val="525A5D"/>
+                              <w:sz w:val="18"/>
+                              <w:szCs w:val="18"/>
+                            </w:rPr>
+                            <w:t xml:space="preserve"> - 148021 District, Sangrur</w:t>
                           </w:r>
                           <w:r>
                             <w:rPr>
@@ -3831,7 +4179,7 @@
         </mc:Choice>
         <mc:Fallback>
           <w:pict>
-            <v:rect w14:anchorId="0F3B8F21" id="Rectangle 7" o:spid="_x0000_s1027" style="position:absolute;left:0;text-align:left;margin-left:607.8pt;margin-top:.35pt;width:277.2pt;height:84pt;z-index:251662848;visibility:visible;mso-wrap-style:square;mso-width-percent:0;mso-height-percent:0;mso-wrap-distance-left:9pt;mso-wrap-distance-top:0;mso-wrap-distance-right:9pt;mso-wrap-distance-bottom:0;mso-position-horizontal:absolute;mso-position-horizontal-relative:text;mso-position-vertical:absolute;mso-position-vertical-relative:text;mso-width-percent:0;mso-height-percent:0;mso-width-relative:margin;mso-height-relative:margin;v-text-anchor:middle" o:gfxdata="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" fillcolor="white [3201]" strokecolor="white [3212]" strokeweight="1pt">
+            <v:rect w14:anchorId="0F3B8F21" id="Rectangle 7" o:spid="_x0000_s1027" style="position:absolute;left:0;text-align:left;margin-left:607.8pt;margin-top:.35pt;width:277.2pt;height:84pt;z-index:251662848;visibility:visible;mso-wrap-style:square;mso-width-percent:0;mso-height-percent:0;mso-wrap-distance-left:9pt;mso-wrap-distance-top:0;mso-wrap-distance-right:9pt;mso-wrap-distance-bottom:0;mso-position-horizontal:absolute;mso-position-horizontal-relative:text;mso-position-vertical:absolute;mso-position-vertical-relative:text;mso-width-percent:0;mso-height-percent:0;mso-width-relative:margin;mso-height-relative:margin;v-text-anchor:middle" o:gfxdata="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" fillcolor="white [3201]" strokecolor="white [3212]" strokeweight="1pt">
               <v:textbox>
                 <w:txbxContent>
                   <w:p>
@@ -3846,6 +4194,7 @@
                         <w:szCs w:val="18"/>
                       </w:rPr>
                     </w:pPr>
+                    <w:proofErr w:type="spellStart"/>
                     <w:r>
                       <w:rPr>
                         <w:rFonts w:ascii="Arial" w:hAnsi="Arial" w:cs="Arial"/>
@@ -3853,7 +4202,57 @@
                         <w:sz w:val="18"/>
                         <w:szCs w:val="18"/>
                       </w:rPr>
-                      <w:t>Akbarpur Channa, Ludhiana-Malerkotla Road, Ahmedgarh - 148021 District, Sangrur</w:t>
+                      <w:t>Akbarpur</w:t>
+                    </w:r>
+                    <w:proofErr w:type="spellEnd"/>
+                    <w:r>
+                      <w:rPr>
+                        <w:rFonts w:ascii="Arial" w:hAnsi="Arial" w:cs="Arial"/>
+                        <w:color w:val="525A5D"/>
+                        <w:sz w:val="18"/>
+                        <w:szCs w:val="18"/>
+                      </w:rPr>
+                      <w:t xml:space="preserve"> Channa, Ludhiana-</w:t>
+                    </w:r>
+                    <w:proofErr w:type="spellStart"/>
+                    <w:r>
+                      <w:rPr>
+                        <w:rFonts w:ascii="Arial" w:hAnsi="Arial" w:cs="Arial"/>
+                        <w:color w:val="525A5D"/>
+                        <w:sz w:val="18"/>
+                        <w:szCs w:val="18"/>
+                      </w:rPr>
+                      <w:t>Malerkotla</w:t>
+                    </w:r>
+                    <w:proofErr w:type="spellEnd"/>
+                    <w:r>
+                      <w:rPr>
+                        <w:rFonts w:ascii="Arial" w:hAnsi="Arial" w:cs="Arial"/>
+                        <w:color w:val="525A5D"/>
+                        <w:sz w:val="18"/>
+                        <w:szCs w:val="18"/>
+                      </w:rPr>
+                      <w:t xml:space="preserve"> Road, </w:t>
+                    </w:r>
+                    <w:proofErr w:type="spellStart"/>
+                    <w:r>
+                      <w:rPr>
+                        <w:rFonts w:ascii="Arial" w:hAnsi="Arial" w:cs="Arial"/>
+                        <w:color w:val="525A5D"/>
+                        <w:sz w:val="18"/>
+                        <w:szCs w:val="18"/>
+                      </w:rPr>
+                      <w:t>Ahmedgarh</w:t>
+                    </w:r>
+                    <w:proofErr w:type="spellEnd"/>
+                    <w:r>
+                      <w:rPr>
+                        <w:rFonts w:ascii="Arial" w:hAnsi="Arial" w:cs="Arial"/>
+                        <w:color w:val="525A5D"/>
+                        <w:sz w:val="18"/>
+                        <w:szCs w:val="18"/>
+                      </w:rPr>
+                      <w:t xml:space="preserve"> - 148021 District, Sangrur</w:t>
                     </w:r>
                     <w:r>
                       <w:rPr>
@@ -4135,7 +4534,7 @@
 </file>
 
 <file path=word/header3.xml><?xml version="1.0" encoding="utf-8"?>
-<w:hdr xmlns:wpc="http://schemas.microsoft.com/office/word/2010/wordprocessingCanvas" xmlns:mc="http://schemas.openxmlformats.org/markup-compatibility/2006" xmlns:o="urn:schemas-microsoft-com:office:office" xmlns:r="http://schemas.openxmlformats.org/officeDocument/2006/relationships" xmlns:m="http://schemas.openxmlformats.org/officeDocument/2006/math" xmlns:v="urn:schemas-microsoft-com:vml" xmlns:wp14="http://schemas.microsoft.com/office/word/2010/wordprocessingDrawing" xmlns:wp="http://schemas.openxmlformats.org/drawingml/2006/wordprocessingDrawing" xmlns:w10="urn:schemas-microsoft-com:office:word" xmlns:w="http://schemas.openxmlformats.org/wordprocessingml/2006/main" xmlns:w14="http://schemas.microsoft.com/office/word/2010/wordml" xmlns:w15="http://schemas.microsoft.com/office/word/2012/wordml" xmlns:wpg="http://schemas.microsoft.com/office/word/2010/wordprocessingGroup" xmlns:wpi="http://schemas.microsoft.com/office/word/2010/wordprocessingInk" xmlns:wne="http://schemas.microsoft.com/office/word/2006/wordml" xmlns:wps="http://schemas.microsoft.com/office/word/2010/wordprocessingShape" mc:Ignorable="w14 w15 wp14">
+<w:hdr xmlns:wpc="http://schemas.microsoft.com/office/word/2010/wordprocessingCanvas" xmlns:cx="http://schemas.microsoft.com/office/drawing/2014/chartex" xmlns:cx1="http://schemas.microsoft.com/office/drawing/2015/9/8/chartex" xmlns:cx2="http://schemas.microsoft.com/office/drawing/2015/10/21/chartex" xmlns:cx3="http://schemas.microsoft.com/office/drawing/2016/5/9/chartex" xmlns:cx4="http://schemas.microsoft.com/office/drawing/2016/5/10/chartex" xmlns:cx5="http://schemas.microsoft.com/office/drawing/2016/5/11/chartex" xmlns:cx6="http://schemas.microsoft.com/office/drawing/2016/5/12/chartex" xmlns:cx7="http://schemas.microsoft.com/office/drawing/2016/5/13/chartex" xmlns:cx8="http://schemas.microsoft.com/office/drawing/2016/5/14/chartex" xmlns:mc="http://schemas.openxmlformats.org/markup-compatibility/2006" xmlns:aink="http://schemas.microsoft.com/office/drawing/2016/ink" xmlns:am3d="http://schemas.microsoft.com/office/drawing/2017/model3d" xmlns:o="urn:schemas-microsoft-com:office:office" xmlns:oel="http://schemas.microsoft.com/office/2019/extlst" xmlns:r="http://schemas.openxmlformats.org/officeDocument/2006/relationships" xmlns:m="http://schemas.openxmlformats.org/officeDocument/2006/math" xmlns:v="urn:schemas-microsoft-com:vml" xmlns:wp14="http://schemas.microsoft.com/office/word/2010/wordprocessingDrawing" xmlns:wp="http://schemas.openxmlformats.org/drawingml/2006/wordprocessingDrawing" xmlns:w10="urn:schemas-microsoft-com:office:word" xmlns:w="http://schemas.openxmlformats.org/wordprocessingml/2006/main" xmlns:w14="http://schemas.microsoft.com/office/word/2010/wordml" xmlns:w15="http://schemas.microsoft.com/office/word/2012/wordml" xmlns:w16cex="http://schemas.microsoft.com/office/word/2018/wordml/cex" xmlns:w16cid="http://schemas.microsoft.com/office/word/2016/wordml/cid" xmlns:w16="http://schemas.microsoft.com/office/word/2018/wordml" xmlns:w16sdtdh="http://schemas.microsoft.com/office/word/2020/wordml/sdtdatahash" xmlns:w16se="http://schemas.microsoft.com/office/word/2015/wordml/symex" xmlns:wpg="http://schemas.microsoft.com/office/word/2010/wordprocessingGroup" xmlns:wpi="http://schemas.microsoft.com/office/word/2010/wordprocessingInk" xmlns:wne="http://schemas.microsoft.com/office/word/2006/wordml" xmlns:wps="http://schemas.microsoft.com/office/word/2010/wordprocessingShape" mc:Ignorable="w14 w15 w16se w16cid w16 w16cex w16sdtdh wp14">
   <w:p>
     <w:pPr>
       <w:pStyle w:val="Header"/>
@@ -4145,8 +4544,8 @@
 </file>
 
 <file path=word/numbering.xml><?xml version="1.0" encoding="utf-8"?>
-<w:numbering xmlns:wpc="http://schemas.microsoft.com/office/word/2010/wordprocessingCanvas" xmlns:mc="http://schemas.openxmlformats.org/markup-compatibility/2006" xmlns:o="urn:schemas-microsoft-com:office:office" xmlns:r="http://schemas.openxmlformats.org/officeDocument/2006/relationships" xmlns:m="http://schemas.openxmlformats.org/officeDocument/2006/math" xmlns:v="urn:schemas-microsoft-com:vml" xmlns:wp14="http://schemas.microsoft.com/office/word/2010/wordprocessingDrawing" xmlns:wp="http://schemas.openxmlformats.org/drawingml/2006/wordprocessingDrawing" xmlns:w10="urn:schemas-microsoft-com:office:word" xmlns:w="http://schemas.openxmlformats.org/wordprocessingml/2006/main" xmlns:w14="http://schemas.microsoft.com/office/word/2010/wordml" xmlns:w15="http://schemas.microsoft.com/office/word/2012/wordml" xmlns:wpg="http://schemas.microsoft.com/office/word/2010/wordprocessingGroup" xmlns:wpi="http://schemas.microsoft.com/office/word/2010/wordprocessingInk" xmlns:wne="http://schemas.microsoft.com/office/word/2006/wordml" xmlns:wps="http://schemas.microsoft.com/office/word/2010/wordprocessingShape" mc:Ignorable="w14 w15 wp14">
-  <w:abstractNum w:abstractNumId="0">
+<w:numbering xmlns:wpc="http://schemas.microsoft.com/office/word/2010/wordprocessingCanvas" xmlns:cx="http://schemas.microsoft.com/office/drawing/2014/chartex" xmlns:cx1="http://schemas.microsoft.com/office/drawing/2015/9/8/chartex" xmlns:cx2="http://schemas.microsoft.com/office/drawing/2015/10/21/chartex" xmlns:cx3="http://schemas.microsoft.com/office/drawing/2016/5/9/chartex" xmlns:cx4="http://schemas.microsoft.com/office/drawing/2016/5/10/chartex" xmlns:cx5="http://schemas.microsoft.com/office/drawing/2016/5/11/chartex" xmlns:cx6="http://schemas.microsoft.com/office/drawing/2016/5/12/chartex" xmlns:cx7="http://schemas.microsoft.com/office/drawing/2016/5/13/chartex" xmlns:cx8="http://schemas.microsoft.com/office/drawing/2016/5/14/chartex" xmlns:mc="http://schemas.openxmlformats.org/markup-compatibility/2006" xmlns:aink="http://schemas.microsoft.com/office/drawing/2016/ink" xmlns:am3d="http://schemas.microsoft.com/office/drawing/2017/model3d" xmlns:o="urn:schemas-microsoft-com:office:office" xmlns:oel="http://schemas.microsoft.com/office/2019/extlst" xmlns:r="http://schemas.openxmlformats.org/officeDocument/2006/relationships" xmlns:m="http://schemas.openxmlformats.org/officeDocument/2006/math" xmlns:v="urn:schemas-microsoft-com:vml" xmlns:wp14="http://schemas.microsoft.com/office/word/2010/wordprocessingDrawing" xmlns:wp="http://schemas.openxmlformats.org/drawingml/2006/wordprocessingDrawing" xmlns:w10="urn:schemas-microsoft-com:office:word" xmlns:w="http://schemas.openxmlformats.org/wordprocessingml/2006/main" xmlns:w14="http://schemas.microsoft.com/office/word/2010/wordml" xmlns:w15="http://schemas.microsoft.com/office/word/2012/wordml" xmlns:w16cex="http://schemas.microsoft.com/office/word/2018/wordml/cex" xmlns:w16cid="http://schemas.microsoft.com/office/word/2016/wordml/cid" xmlns:w16="http://schemas.microsoft.com/office/word/2018/wordml" xmlns:w16sdtdh="http://schemas.microsoft.com/office/word/2020/wordml/sdtdatahash" xmlns:w16se="http://schemas.microsoft.com/office/word/2015/wordml/symex" xmlns:wpg="http://schemas.microsoft.com/office/word/2010/wordprocessingGroup" xmlns:wpi="http://schemas.microsoft.com/office/word/2010/wordprocessingInk" xmlns:wne="http://schemas.microsoft.com/office/word/2006/wordml" xmlns:wps="http://schemas.microsoft.com/office/word/2010/wordprocessingShape" mc:Ignorable="w14 w15 w16se w16cid w16 w16cex w16sdtdh wp14">
+  <w:abstractNum w:abstractNumId="0" w15:restartNumberingAfterBreak="0">
     <w:nsid w:val="19365752"/>
     <w:multiLevelType w:val="hybridMultilevel"/>
     <w:tmpl w:val="DFA0A576"/>
@@ -4235,7 +4634,7 @@
       </w:pPr>
     </w:lvl>
   </w:abstractNum>
-  <w:abstractNum w:abstractNumId="1">
+  <w:abstractNum w:abstractNumId="1" w15:restartNumberingAfterBreak="0">
     <w:nsid w:val="19495CFF"/>
     <w:multiLevelType w:val="hybridMultilevel"/>
     <w:tmpl w:val="79CC075A"/>
@@ -4286,7 +4685,7 @@
       <w:lvlJc w:val="left"/>
     </w:lvl>
   </w:abstractNum>
-  <w:abstractNum w:abstractNumId="2">
+  <w:abstractNum w:abstractNumId="2" w15:restartNumberingAfterBreak="0">
     <w:nsid w:val="66334873"/>
     <w:multiLevelType w:val="hybridMultilevel"/>
     <w:tmpl w:val="71B6F7D8"/>
@@ -4337,7 +4736,7 @@
       <w:lvlJc w:val="left"/>
     </w:lvl>
   </w:abstractNum>
-  <w:abstractNum w:abstractNumId="3">
+  <w:abstractNum w:abstractNumId="3" w15:restartNumberingAfterBreak="0">
     <w:nsid w:val="74B0DC51"/>
     <w:multiLevelType w:val="hybridMultilevel"/>
     <w:tmpl w:val="22FA3D1C"/>
@@ -4388,23 +4787,23 @@
       <w:lvlJc w:val="left"/>
     </w:lvl>
   </w:abstractNum>
-  <w:num w:numId="1">
+  <w:num w:numId="1" w16cid:durableId="2132287425">
     <w:abstractNumId w:val="2"/>
   </w:num>
-  <w:num w:numId="2">
+  <w:num w:numId="2" w16cid:durableId="577785060">
     <w:abstractNumId w:val="3"/>
   </w:num>
-  <w:num w:numId="3">
+  <w:num w:numId="3" w16cid:durableId="456678741">
     <w:abstractNumId w:val="1"/>
   </w:num>
-  <w:num w:numId="4">
+  <w:num w:numId="4" w16cid:durableId="574432140">
     <w:abstractNumId w:val="0"/>
   </w:num>
 </w:numbering>
 </file>
 
 <file path=word/styles.xml><?xml version="1.0" encoding="utf-8"?>
-<w:styles xmlns:mc="http://schemas.openxmlformats.org/markup-compatibility/2006" xmlns:r="http://schemas.openxmlformats.org/officeDocument/2006/relationships" xmlns:w="http://schemas.openxmlformats.org/wordprocessingml/2006/main" xmlns:w14="http://schemas.microsoft.com/office/word/2010/wordml" xmlns:w15="http://schemas.microsoft.com/office/word/2012/wordml" mc:Ignorable="w14 w15">
+<w:styles xmlns:mc="http://schemas.openxmlformats.org/markup-compatibility/2006" xmlns:r="http://schemas.openxmlformats.org/officeDocument/2006/relationships" xmlns:w="http://schemas.openxmlformats.org/wordprocessingml/2006/main" xmlns:w14="http://schemas.microsoft.com/office/word/2010/wordml" xmlns:w15="http://schemas.microsoft.com/office/word/2012/wordml" xmlns:w16cex="http://schemas.microsoft.com/office/word/2018/wordml/cex" xmlns:w16cid="http://schemas.microsoft.com/office/word/2016/wordml/cid" xmlns:w16="http://schemas.microsoft.com/office/word/2018/wordml" xmlns:w16sdtdh="http://schemas.microsoft.com/office/word/2020/wordml/sdtdatahash" xmlns:w16se="http://schemas.microsoft.com/office/word/2015/wordml/symex" mc:Ignorable="w14 w15 w16se w16cid w16 w16cex w16sdtdh">
   <w:docDefaults>
     <w:rPrDefault>
       <w:rPr>
@@ -4416,7 +4815,7 @@
     </w:rPrDefault>
     <w:pPrDefault/>
   </w:docDefaults>
-  <w:latentStyles w:defLockedState="0" w:defUIPriority="99" w:defSemiHidden="0" w:defUnhideWhenUsed="0" w:defQFormat="0" w:count="371">
+  <w:latentStyles w:defLockedState="0" w:defUIPriority="99" w:defSemiHidden="0" w:defUnhideWhenUsed="0" w:defQFormat="0" w:count="376">
     <w:lsdException w:name="Normal" w:uiPriority="0" w:qFormat="1"/>
     <w:lsdException w:name="heading 1" w:uiPriority="9" w:qFormat="1"/>
     <w:lsdException w:name="heading 2" w:semiHidden="1" w:uiPriority="9" w:unhideWhenUsed="1" w:qFormat="1"/>
@@ -4788,6 +5187,11 @@
     <w:lsdException w:name="List Table 5 Dark Accent 6" w:uiPriority="50"/>
     <w:lsdException w:name="List Table 6 Colorful Accent 6" w:uiPriority="51"/>
     <w:lsdException w:name="List Table 7 Colorful Accent 6" w:uiPriority="52"/>
+    <w:lsdException w:name="Mention" w:semiHidden="1" w:unhideWhenUsed="1"/>
+    <w:lsdException w:name="Smart Hyperlink" w:semiHidden="1" w:unhideWhenUsed="1"/>
+    <w:lsdException w:name="Hashtag" w:semiHidden="1" w:unhideWhenUsed="1"/>
+    <w:lsdException w:name="Unresolved Mention" w:semiHidden="1" w:unhideWhenUsed="1"/>
+    <w:lsdException w:name="Smart Link" w:semiHidden="1" w:unhideWhenUsed="1"/>
   </w:latentStyles>
   <w:style w:type="paragraph" w:default="1" w:styleId="Normal">
     <w:name w:val="Normal"/>
@@ -4826,7 +5230,6 @@
     <w:uiPriority w:val="39"/>
     <w:rsid w:val="00E11788"/>
     <w:tblPr>
-      <w:tblInd w:w="0" w:type="dxa"/>
       <w:tblBorders>
         <w:top w:val="single" w:sz="4" w:space="0" w:color="auto"/>
         <w:left w:val="single" w:sz="4" w:space="0" w:color="auto"/>
@@ -4835,12 +5238,6 @@
         <w:insideH w:val="single" w:sz="4" w:space="0" w:color="auto"/>
         <w:insideV w:val="single" w:sz="4" w:space="0" w:color="auto"/>
       </w:tblBorders>
-      <w:tblCellMar>
-        <w:top w:w="0" w:type="dxa"/>
-        <w:left w:w="108" w:type="dxa"/>
-        <w:bottom w:w="0" w:type="dxa"/>
-        <w:right w:w="108" w:type="dxa"/>
-      </w:tblCellMar>
     </w:tblPr>
   </w:style>
   <w:style w:type="paragraph" w:styleId="Header">

</xml_diff>

<commit_message>
Out Gate Pass report
</commit_message>
<xml_diff>
--- a/APLOS/POPResources/Templates/IndivisualGatePass202034.docx
+++ b/APLOS/POPResources/Templates/IndivisualGatePass202034.docx
@@ -1,6 +1,6 @@
 
 <file path=word/document.xml><?xml version="1.0" encoding="utf-8"?>
-<w:document xmlns:wpc="http://schemas.microsoft.com/office/word/2010/wordprocessingCanvas" xmlns:cx="http://schemas.microsoft.com/office/drawing/2014/chartex" xmlns:cx1="http://schemas.microsoft.com/office/drawing/2015/9/8/chartex" xmlns:cx2="http://schemas.microsoft.com/office/drawing/2015/10/21/chartex" xmlns:cx3="http://schemas.microsoft.com/office/drawing/2016/5/9/chartex" xmlns:cx4="http://schemas.microsoft.com/office/drawing/2016/5/10/chartex" xmlns:cx5="http://schemas.microsoft.com/office/drawing/2016/5/11/chartex" xmlns:cx6="http://schemas.microsoft.com/office/drawing/2016/5/12/chartex" xmlns:cx7="http://schemas.microsoft.com/office/drawing/2016/5/13/chartex" xmlns:cx8="http://schemas.microsoft.com/office/drawing/2016/5/14/chartex" xmlns:mc="http://schemas.openxmlformats.org/markup-compatibility/2006" xmlns:aink="http://schemas.microsoft.com/office/drawing/2016/ink" xmlns:am3d="http://schemas.microsoft.com/office/drawing/2017/model3d" xmlns:o="urn:schemas-microsoft-com:office:office" xmlns:oel="http://schemas.microsoft.com/office/2019/extlst" xmlns:r="http://schemas.openxmlformats.org/officeDocument/2006/relationships" xmlns:m="http://schemas.openxmlformats.org/officeDocument/2006/math" xmlns:v="urn:schemas-microsoft-com:vml" xmlns:wp14="http://schemas.microsoft.com/office/word/2010/wordprocessingDrawing" xmlns:wp="http://schemas.openxmlformats.org/drawingml/2006/wordprocessingDrawing" xmlns:w10="urn:schemas-microsoft-com:office:word" xmlns:w="http://schemas.openxmlformats.org/wordprocessingml/2006/main" xmlns:w14="http://schemas.microsoft.com/office/word/2010/wordml" xmlns:w15="http://schemas.microsoft.com/office/word/2012/wordml" xmlns:w16cex="http://schemas.microsoft.com/office/word/2018/wordml/cex" xmlns:w16cid="http://schemas.microsoft.com/office/word/2016/wordml/cid" xmlns:w16="http://schemas.microsoft.com/office/word/2018/wordml" xmlns:w16sdtdh="http://schemas.microsoft.com/office/word/2020/wordml/sdtdatahash" xmlns:w16se="http://schemas.microsoft.com/office/word/2015/wordml/symex" xmlns:wpg="http://schemas.microsoft.com/office/word/2010/wordprocessingGroup" xmlns:wpi="http://schemas.microsoft.com/office/word/2010/wordprocessingInk" xmlns:wne="http://schemas.microsoft.com/office/word/2006/wordml" xmlns:wps="http://schemas.microsoft.com/office/word/2010/wordprocessingShape" mc:Ignorable="w14 w15 w16se w16cid w16 w16cex w16sdtdh wp14">
+<w:document xmlns:wpc="http://schemas.microsoft.com/office/word/2010/wordprocessingCanvas" xmlns:cx="http://schemas.microsoft.com/office/drawing/2014/chartex" xmlns:cx1="http://schemas.microsoft.com/office/drawing/2015/9/8/chartex" xmlns:cx2="http://schemas.microsoft.com/office/drawing/2015/10/21/chartex" xmlns:cx3="http://schemas.microsoft.com/office/drawing/2016/5/9/chartex" xmlns:cx4="http://schemas.microsoft.com/office/drawing/2016/5/10/chartex" xmlns:cx5="http://schemas.microsoft.com/office/drawing/2016/5/11/chartex" xmlns:cx6="http://schemas.microsoft.com/office/drawing/2016/5/12/chartex" xmlns:cx7="http://schemas.microsoft.com/office/drawing/2016/5/13/chartex" xmlns:cx8="http://schemas.microsoft.com/office/drawing/2016/5/14/chartex" xmlns:mc="http://schemas.openxmlformats.org/markup-compatibility/2006" xmlns:aink="http://schemas.microsoft.com/office/drawing/2016/ink" xmlns:am3d="http://schemas.microsoft.com/office/drawing/2017/model3d" xmlns:o="urn:schemas-microsoft-com:office:office" xmlns:oel="http://schemas.microsoft.com/office/2019/extlst" xmlns:r="http://schemas.openxmlformats.org/officeDocument/2006/relationships" xmlns:m="http://schemas.openxmlformats.org/officeDocument/2006/math" xmlns:v="urn:schemas-microsoft-com:vml" xmlns:wp14="http://schemas.microsoft.com/office/word/2010/wordprocessingDrawing" xmlns:wp="http://schemas.openxmlformats.org/drawingml/2006/wordprocessingDrawing" xmlns:w10="urn:schemas-microsoft-com:office:word" xmlns:w="http://schemas.openxmlformats.org/wordprocessingml/2006/main" xmlns:w14="http://schemas.microsoft.com/office/word/2010/wordml" xmlns:w15="http://schemas.microsoft.com/office/word/2012/wordml" xmlns:w16cex="http://schemas.microsoft.com/office/word/2018/wordml/cex" xmlns:w16cid="http://schemas.microsoft.com/office/word/2016/wordml/cid" xmlns:w16="http://schemas.microsoft.com/office/word/2018/wordml" xmlns:w16du="http://schemas.microsoft.com/office/word/2023/wordml/word16du" xmlns:w16sdtdh="http://schemas.microsoft.com/office/word/2020/wordml/sdtdatahash" xmlns:w16sdtfl="http://schemas.microsoft.com/office/word/2024/wordml/sdtformatlock" xmlns:w16se="http://schemas.microsoft.com/office/word/2015/wordml/symex" xmlns:wpg="http://schemas.microsoft.com/office/word/2010/wordprocessingGroup" xmlns:wpi="http://schemas.microsoft.com/office/word/2010/wordprocessingInk" xmlns:wne="http://schemas.microsoft.com/office/word/2006/wordml" xmlns:wps="http://schemas.microsoft.com/office/word/2010/wordprocessingShape" mc:Ignorable="w14 w15 w16se w16cid w16 w16cex w16sdtdh w16sdtfl w16du wp14">
   <w:body>
     <w:p>
       <w:pPr>
@@ -201,25 +201,25 @@
       <w:tblPr>
         <w:tblStyle w:val="TableGrid"/>
         <w:tblpPr w:leftFromText="180" w:rightFromText="180" w:vertAnchor="page" w:horzAnchor="margin" w:tblpXSpec="center" w:tblpY="2445"/>
-        <w:tblW w:w="17928" w:type="dxa"/>
+        <w:tblW w:w="17939" w:type="dxa"/>
         <w:tblLayout w:type="fixed"/>
         <w:tblLook w:val="04A0" w:firstRow="1" w:lastRow="0" w:firstColumn="1" w:lastColumn="0" w:noHBand="0" w:noVBand="1"/>
       </w:tblPr>
       <w:tblGrid>
-        <w:gridCol w:w="4482"/>
-        <w:gridCol w:w="1116"/>
-        <w:gridCol w:w="3366"/>
-        <w:gridCol w:w="3204"/>
+        <w:gridCol w:w="4484"/>
+        <w:gridCol w:w="1117"/>
+        <w:gridCol w:w="3367"/>
+        <w:gridCol w:w="3206"/>
         <w:gridCol w:w="1278"/>
-        <w:gridCol w:w="4482"/>
+        <w:gridCol w:w="4487"/>
       </w:tblGrid>
       <w:tr>
         <w:trPr>
-          <w:trHeight w:val="2060"/>
+          <w:trHeight w:val="1588"/>
         </w:trPr>
         <w:tc>
           <w:tcPr>
-            <w:tcW w:w="5598" w:type="dxa"/>
+            <w:tcW w:w="5601" w:type="dxa"/>
             <w:gridSpan w:val="2"/>
           </w:tcPr>
           <w:p>
@@ -310,6 +310,7 @@
               </w:rPr>
               <w:t>Date</w:t>
             </w:r>
+            <w:proofErr w:type="gramStart"/>
             <w:r>
               <w:rPr>
                 <w:rFonts w:ascii="Tahoma" w:eastAsia="Arial" w:hAnsi="Tahoma" w:cs="Tahoma"/>
@@ -330,6 +331,7 @@
               <w:t>{</w:t>
             </w:r>
             <w:proofErr w:type="spellStart"/>
+            <w:proofErr w:type="gramEnd"/>
             <w:r>
               <w:rPr>
                 <w:rFonts w:ascii="Tahoma" w:eastAsia="Times New Roman" w:hAnsi="Tahoma" w:cs="Tahoma"/>
@@ -369,6 +371,7 @@
               </w:rPr>
               <w:t>Material Send/Return</w:t>
             </w:r>
+            <w:proofErr w:type="gramStart"/>
             <w:r>
               <w:rPr>
                 <w:rFonts w:ascii="Tahoma" w:eastAsia="Arial" w:hAnsi="Tahoma" w:cs="Tahoma"/>
@@ -389,6 +392,7 @@
               <w:t>{</w:t>
             </w:r>
             <w:proofErr w:type="spellStart"/>
+            <w:proofErr w:type="gramEnd"/>
             <w:r>
               <w:rPr>
                 <w:rFonts w:ascii="Tahoma" w:eastAsia="Times New Roman" w:hAnsi="Tahoma" w:cs="Tahoma"/>
@@ -428,6 +432,7 @@
               </w:rPr>
               <w:t>Gate Pass Type</w:t>
             </w:r>
+            <w:proofErr w:type="gramStart"/>
             <w:r>
               <w:rPr>
                 <w:rFonts w:ascii="Tahoma" w:eastAsia="Arial" w:hAnsi="Tahoma" w:cs="Tahoma"/>
@@ -448,6 +453,7 @@
               <w:t>{</w:t>
             </w:r>
             <w:proofErr w:type="spellStart"/>
+            <w:proofErr w:type="gramEnd"/>
             <w:r>
               <w:rPr>
                 <w:rFonts w:ascii="Tahoma" w:eastAsia="Times New Roman" w:hAnsi="Tahoma" w:cs="Tahoma"/>
@@ -487,6 +493,7 @@
               </w:rPr>
               <w:t>Returnable Date</w:t>
             </w:r>
+            <w:proofErr w:type="gramStart"/>
             <w:r>
               <w:rPr>
                 <w:rFonts w:ascii="Tahoma" w:eastAsia="Arial" w:hAnsi="Tahoma" w:cs="Tahoma"/>
@@ -507,6 +514,7 @@
               <w:t>{</w:t>
             </w:r>
             <w:proofErr w:type="spellStart"/>
+            <w:proofErr w:type="gramEnd"/>
             <w:r>
               <w:rPr>
                 <w:rFonts w:ascii="Tahoma" w:eastAsia="Times New Roman" w:hAnsi="Tahoma" w:cs="Tahoma"/>
@@ -555,6 +563,7 @@
               </w:rPr>
               <w:t>Invoice No</w:t>
             </w:r>
+            <w:proofErr w:type="gramStart"/>
             <w:r>
               <w:rPr>
                 <w:rFonts w:ascii="Tahoma" w:eastAsia="Arial" w:hAnsi="Tahoma" w:cs="Tahoma"/>
@@ -574,7 +583,7 @@
               </w:rPr>
               <w:t>{</w:t>
             </w:r>
-            <w:proofErr w:type="spellStart"/>
+            <w:proofErr w:type="gramEnd"/>
             <w:r>
               <w:rPr>
                 <w:rFonts w:ascii="Consolas" w:hAnsi="Consolas" w:cs="Consolas"/>
@@ -584,7 +593,6 @@
               </w:rPr>
               <w:t>InvoiceNo</w:t>
             </w:r>
-            <w:proofErr w:type="spellEnd"/>
             <w:r>
               <w:rPr>
                 <w:rFonts w:ascii="Tahoma" w:eastAsia="Times New Roman" w:hAnsi="Tahoma" w:cs="Tahoma"/>
@@ -614,6 +622,7 @@
               </w:rPr>
               <w:t>Invoice Value</w:t>
             </w:r>
+            <w:proofErr w:type="gramStart"/>
             <w:r>
               <w:rPr>
                 <w:rFonts w:ascii="Tahoma" w:eastAsia="Arial" w:hAnsi="Tahoma" w:cs="Tahoma"/>
@@ -634,6 +643,7 @@
               <w:t>{</w:t>
             </w:r>
             <w:proofErr w:type="spellStart"/>
+            <w:proofErr w:type="gramEnd"/>
             <w:r>
               <w:rPr>
                 <w:rFonts w:ascii="Consolas" w:hAnsi="Consolas" w:cs="Consolas"/>
@@ -673,6 +683,7 @@
               </w:rPr>
               <w:t>No Of Packages</w:t>
             </w:r>
+            <w:proofErr w:type="gramStart"/>
             <w:r>
               <w:rPr>
                 <w:rFonts w:ascii="Tahoma" w:eastAsia="Arial" w:hAnsi="Tahoma" w:cs="Tahoma"/>
@@ -693,6 +704,7 @@
               <w:t>{</w:t>
             </w:r>
             <w:proofErr w:type="spellStart"/>
+            <w:proofErr w:type="gramEnd"/>
             <w:r>
               <w:rPr>
                 <w:rFonts w:ascii="Consolas" w:hAnsi="Consolas" w:cs="Consolas"/>
@@ -732,6 +744,7 @@
               </w:rPr>
               <w:t>Remarks</w:t>
             </w:r>
+            <w:proofErr w:type="gramStart"/>
             <w:r>
               <w:rPr>
                 <w:rFonts w:ascii="Tahoma" w:eastAsia="Arial" w:hAnsi="Tahoma" w:cs="Tahoma"/>
@@ -751,6 +764,7 @@
               </w:rPr>
               <w:t>{</w:t>
             </w:r>
+            <w:proofErr w:type="gramEnd"/>
             <w:r>
               <w:rPr>
                 <w:rFonts w:ascii="Tahoma" w:eastAsia="Times New Roman" w:hAnsi="Tahoma" w:cs="Tahoma"/>
@@ -782,7 +796,7 @@
         </w:tc>
         <w:tc>
           <w:tcPr>
-            <w:tcW w:w="6570" w:type="dxa"/>
+            <w:tcW w:w="6573" w:type="dxa"/>
             <w:gridSpan w:val="2"/>
           </w:tcPr>
           <w:p>
@@ -844,6 +858,7 @@
                 <w:szCs w:val="18"/>
               </w:rPr>
             </w:pPr>
+            <w:proofErr w:type="gramStart"/>
             <w:r>
               <w:rPr>
                 <w:rFonts w:ascii="Tahoma" w:eastAsia="Times New Roman" w:hAnsi="Tahoma" w:cs="Tahoma"/>
@@ -854,6 +869,7 @@
               </w:rPr>
               <w:t>Through :</w:t>
             </w:r>
+            <w:proofErr w:type="gramEnd"/>
             <w:r>
               <w:rPr>
                 <w:rFonts w:ascii="Tahoma" w:eastAsia="Times New Roman" w:hAnsi="Tahoma" w:cs="Tahoma"/>
@@ -892,6 +908,7 @@
                 <w:szCs w:val="18"/>
               </w:rPr>
             </w:pPr>
+            <w:proofErr w:type="gramStart"/>
             <w:r>
               <w:rPr>
                 <w:rFonts w:ascii="Tahoma" w:eastAsia="Times New Roman" w:hAnsi="Tahoma" w:cs="Tahoma"/>
@@ -909,7 +926,17 @@
                 <w:sz w:val="18"/>
                 <w:szCs w:val="18"/>
               </w:rPr>
-              <w:t xml:space="preserve"> :{</w:t>
+              <w:t xml:space="preserve"> :</w:t>
+            </w:r>
+            <w:proofErr w:type="gramEnd"/>
+            <w:r>
+              <w:rPr>
+                <w:rFonts w:ascii="Tahoma" w:eastAsia="Times New Roman" w:hAnsi="Tahoma" w:cs="Tahoma"/>
+                <w:bCs/>
+                <w:sz w:val="18"/>
+                <w:szCs w:val="18"/>
+              </w:rPr>
+              <w:t>{</w:t>
             </w:r>
             <w:proofErr w:type="spellStart"/>
             <w:r>
@@ -941,6 +968,7 @@
                 <w:szCs w:val="18"/>
               </w:rPr>
             </w:pPr>
+            <w:proofErr w:type="gramStart"/>
             <w:r>
               <w:rPr>
                 <w:rFonts w:ascii="Tahoma" w:eastAsia="Times New Roman" w:hAnsi="Tahoma" w:cs="Tahoma"/>
@@ -958,7 +986,17 @@
                 <w:sz w:val="18"/>
                 <w:szCs w:val="18"/>
               </w:rPr>
-              <w:t>:{</w:t>
+              <w:t>:</w:t>
+            </w:r>
+            <w:proofErr w:type="gramEnd"/>
+            <w:r>
+              <w:rPr>
+                <w:rFonts w:ascii="Tahoma" w:eastAsia="Times New Roman" w:hAnsi="Tahoma" w:cs="Tahoma"/>
+                <w:bCs/>
+                <w:sz w:val="18"/>
+                <w:szCs w:val="18"/>
+              </w:rPr>
+              <w:t>{</w:t>
             </w:r>
             <w:proofErr w:type="spellStart"/>
             <w:r>
@@ -1009,6 +1047,7 @@
               </w:rPr>
               <w:t>Transport Name</w:t>
             </w:r>
+            <w:proofErr w:type="gramStart"/>
             <w:r>
               <w:rPr>
                 <w:rFonts w:ascii="Tahoma" w:eastAsia="Arial" w:hAnsi="Tahoma" w:cs="Tahoma"/>
@@ -1029,6 +1068,7 @@
               <w:t>{</w:t>
             </w:r>
             <w:proofErr w:type="spellStart"/>
+            <w:proofErr w:type="gramEnd"/>
             <w:r>
               <w:rPr>
                 <w:rFonts w:ascii="Consolas" w:hAnsi="Consolas" w:cs="Consolas"/>
@@ -1068,6 +1108,7 @@
               </w:rPr>
               <w:t>Consignment No</w:t>
             </w:r>
+            <w:proofErr w:type="gramStart"/>
             <w:r>
               <w:rPr>
                 <w:rFonts w:ascii="Tahoma" w:eastAsia="Arial" w:hAnsi="Tahoma" w:cs="Tahoma"/>
@@ -1088,6 +1129,7 @@
               <w:t>{</w:t>
             </w:r>
             <w:proofErr w:type="spellStart"/>
+            <w:proofErr w:type="gramEnd"/>
             <w:r>
               <w:rPr>
                 <w:rFonts w:ascii="Consolas" w:hAnsi="Consolas" w:cs="Consolas"/>
@@ -1127,6 +1169,7 @@
               </w:rPr>
               <w:t>Driver Name</w:t>
             </w:r>
+            <w:proofErr w:type="gramStart"/>
             <w:r>
               <w:rPr>
                 <w:rFonts w:ascii="Tahoma" w:eastAsia="Arial" w:hAnsi="Tahoma" w:cs="Tahoma"/>
@@ -1147,6 +1190,7 @@
               <w:t>{</w:t>
             </w:r>
             <w:proofErr w:type="spellStart"/>
+            <w:proofErr w:type="gramEnd"/>
             <w:r>
               <w:rPr>
                 <w:rFonts w:ascii="Consolas" w:hAnsi="Consolas" w:cs="Consolas"/>
@@ -1186,6 +1230,7 @@
               </w:rPr>
               <w:t>Mobile No</w:t>
             </w:r>
+            <w:proofErr w:type="gramStart"/>
             <w:r>
               <w:rPr>
                 <w:rFonts w:ascii="Tahoma" w:eastAsia="Arial" w:hAnsi="Tahoma" w:cs="Tahoma"/>
@@ -1206,6 +1251,7 @@
               <w:t>{</w:t>
             </w:r>
             <w:proofErr w:type="spellStart"/>
+            <w:proofErr w:type="gramEnd"/>
             <w:r>
               <w:rPr>
                 <w:rFonts w:ascii="Consolas" w:hAnsi="Consolas" w:cs="Consolas"/>
@@ -1245,6 +1291,7 @@
               </w:rPr>
               <w:t>Vehicle No</w:t>
             </w:r>
+            <w:proofErr w:type="gramStart"/>
             <w:r>
               <w:rPr>
                 <w:rFonts w:ascii="Tahoma" w:eastAsia="Arial" w:hAnsi="Tahoma" w:cs="Tahoma"/>
@@ -1265,6 +1312,7 @@
               <w:t>{</w:t>
             </w:r>
             <w:proofErr w:type="spellStart"/>
+            <w:proofErr w:type="gramEnd"/>
             <w:r>
               <w:rPr>
                 <w:rFonts w:ascii="Consolas" w:hAnsi="Consolas" w:cs="Consolas"/>
@@ -1288,7 +1336,7 @@
         </w:tc>
         <w:tc>
           <w:tcPr>
-            <w:tcW w:w="5760" w:type="dxa"/>
+            <w:tcW w:w="5763" w:type="dxa"/>
             <w:gridSpan w:val="2"/>
           </w:tcPr>
           <w:p>
@@ -1342,7 +1390,6 @@
               </w:rPr>
               <w:t>: {</w:t>
             </w:r>
-            <w:proofErr w:type="spellStart"/>
             <w:r>
               <w:rPr>
                 <w:rFonts w:ascii="Tahoma" w:hAnsi="Tahoma" w:cs="Tahoma"/>
@@ -1352,7 +1399,6 @@
               </w:rPr>
               <w:t>PartyName</w:t>
             </w:r>
-            <w:proofErr w:type="spellEnd"/>
             <w:r>
               <w:rPr>
                 <w:rFonts w:ascii="Tahoma" w:hAnsi="Tahoma" w:cs="Tahoma"/>
@@ -1372,6 +1418,7 @@
                 <w:shd w:val="clear" w:color="auto" w:fill="FFFFFF"/>
               </w:rPr>
             </w:pPr>
+            <w:proofErr w:type="gramStart"/>
             <w:r>
               <w:rPr>
                 <w:rFonts w:ascii="Tahoma" w:hAnsi="Tahoma" w:cs="Tahoma"/>
@@ -1391,6 +1438,7 @@
               </w:rPr>
               <w:t>:{</w:t>
             </w:r>
+            <w:proofErr w:type="gramEnd"/>
             <w:r>
               <w:rPr>
                 <w:rFonts w:ascii="Consolas" w:hAnsi="Consolas" w:cs="Consolas"/>
@@ -1421,6 +1469,7 @@
                 <w:shd w:val="clear" w:color="auto" w:fill="FFFFFF"/>
               </w:rPr>
             </w:pPr>
+            <w:proofErr w:type="gramStart"/>
             <w:r>
               <w:rPr>
                 <w:rFonts w:ascii="Tahoma" w:hAnsi="Tahoma" w:cs="Tahoma"/>
@@ -1440,6 +1489,7 @@
               </w:rPr>
               <w:t>:{</w:t>
             </w:r>
+            <w:proofErr w:type="gramEnd"/>
             <w:r>
               <w:rPr>
                 <w:rFonts w:ascii="Consolas" w:hAnsi="Consolas" w:cs="Consolas"/>
@@ -1497,19 +1547,32 @@
                 <w:szCs w:val="18"/>
                 <w:shd w:val="clear" w:color="auto" w:fill="FFFFFF"/>
               </w:rPr>
-              <w:t xml:space="preserve"> Buyer</w:t>
-            </w:r>
+              <w:t xml:space="preserve"> </w:t>
+            </w:r>
+            <w:proofErr w:type="gramStart"/>
             <w:r>
               <w:rPr>
                 <w:rFonts w:ascii="Tahoma" w:hAnsi="Tahoma" w:cs="Tahoma"/>
+                <w:b/>
                 <w:color w:val="000000"/>
                 <w:sz w:val="18"/>
                 <w:szCs w:val="18"/>
                 <w:shd w:val="clear" w:color="auto" w:fill="FFFFFF"/>
               </w:rPr>
+              <w:t>Buyer</w:t>
+            </w:r>
+            <w:r>
+              <w:rPr>
+                <w:rFonts w:ascii="Tahoma" w:hAnsi="Tahoma" w:cs="Tahoma"/>
+                <w:color w:val="000000"/>
+                <w:sz w:val="18"/>
+                <w:szCs w:val="18"/>
+                <w:shd w:val="clear" w:color="auto" w:fill="FFFFFF"/>
+              </w:rPr>
               <w:t>:{</w:t>
             </w:r>
             <w:proofErr w:type="spellStart"/>
+            <w:proofErr w:type="gramEnd"/>
             <w:r>
               <w:rPr>
                 <w:rFonts w:ascii="Consolas" w:hAnsi="Consolas" w:cs="Consolas"/>
@@ -1578,12 +1641,22 @@
                 <w:sz w:val="18"/>
                 <w:szCs w:val="18"/>
               </w:rPr>
-              <w:t>Other Plant</w:t>
-            </w:r>
+              <w:t xml:space="preserve">Other </w:t>
+            </w:r>
+            <w:proofErr w:type="gramStart"/>
             <w:r>
               <w:rPr>
                 <w:rFonts w:ascii="Tahoma" w:hAnsi="Tahoma" w:cs="Tahoma"/>
                 <w:b/>
+                <w:sz w:val="18"/>
+                <w:szCs w:val="18"/>
+              </w:rPr>
+              <w:t>Plant</w:t>
+            </w:r>
+            <w:r>
+              <w:rPr>
+                <w:rFonts w:ascii="Tahoma" w:hAnsi="Tahoma" w:cs="Tahoma"/>
+                <w:b/>
                 <w:color w:val="000000"/>
                 <w:sz w:val="18"/>
                 <w:szCs w:val="18"/>
@@ -1591,6 +1664,7 @@
               </w:rPr>
               <w:t> :</w:t>
             </w:r>
+            <w:proofErr w:type="gramEnd"/>
             <w:r>
               <w:rPr>
                 <w:rFonts w:ascii="Tahoma" w:hAnsi="Tahoma" w:cs="Tahoma"/>
@@ -1642,19 +1716,32 @@
                 <w:szCs w:val="18"/>
                 <w:shd w:val="clear" w:color="auto" w:fill="FFFFFF"/>
               </w:rPr>
-              <w:t>Other Company:</w:t>
-            </w:r>
+              <w:t xml:space="preserve">Other </w:t>
+            </w:r>
+            <w:proofErr w:type="gramStart"/>
             <w:r>
               <w:rPr>
                 <w:rFonts w:ascii="Tahoma" w:hAnsi="Tahoma" w:cs="Tahoma"/>
+                <w:b/>
                 <w:color w:val="000000"/>
                 <w:sz w:val="18"/>
                 <w:szCs w:val="18"/>
                 <w:shd w:val="clear" w:color="auto" w:fill="FFFFFF"/>
               </w:rPr>
+              <w:t>Company:</w:t>
+            </w:r>
+            <w:r>
+              <w:rPr>
+                <w:rFonts w:ascii="Tahoma" w:hAnsi="Tahoma" w:cs="Tahoma"/>
+                <w:color w:val="000000"/>
+                <w:sz w:val="18"/>
+                <w:szCs w:val="18"/>
+                <w:shd w:val="clear" w:color="auto" w:fill="FFFFFF"/>
+              </w:rPr>
               <w:t>{</w:t>
             </w:r>
             <w:proofErr w:type="spellStart"/>
+            <w:proofErr w:type="gramEnd"/>
             <w:r>
               <w:rPr>
                 <w:rFonts w:ascii="Consolas" w:hAnsi="Consolas" w:cs="Consolas"/>
@@ -1696,8 +1783,9 @@
                 <w:szCs w:val="18"/>
                 <w:shd w:val="clear" w:color="auto" w:fill="FFFFFF"/>
               </w:rPr>
-              <w:t>Person Name:</w:t>
-            </w:r>
+              <w:t xml:space="preserve">Person </w:t>
+            </w:r>
+            <w:proofErr w:type="gramStart"/>
             <w:r>
               <w:rPr>
                 <w:rFonts w:ascii="Tahoma" w:hAnsi="Tahoma" w:cs="Tahoma"/>
@@ -1707,9 +1795,21 @@
                 <w:szCs w:val="18"/>
                 <w:shd w:val="clear" w:color="auto" w:fill="FFFFFF"/>
               </w:rPr>
+              <w:t>Name:</w:t>
+            </w:r>
+            <w:r>
+              <w:rPr>
+                <w:rFonts w:ascii="Tahoma" w:hAnsi="Tahoma" w:cs="Tahoma"/>
+                <w:b/>
+                <w:color w:val="000000"/>
+                <w:sz w:val="18"/>
+                <w:szCs w:val="18"/>
+                <w:shd w:val="clear" w:color="auto" w:fill="FFFFFF"/>
+              </w:rPr>
               <w:t>{</w:t>
             </w:r>
             <w:proofErr w:type="spellStart"/>
+            <w:proofErr w:type="gramEnd"/>
             <w:r>
               <w:rPr>
                 <w:rFonts w:ascii="Consolas" w:hAnsi="Consolas" w:cs="Consolas"/>
@@ -1752,9 +1852,22 @@
                 <w:szCs w:val="18"/>
                 <w:shd w:val="clear" w:color="auto" w:fill="FFFFFF"/>
               </w:rPr>
-              <w:t>Mobile No:{</w:t>
+              <w:t xml:space="preserve">Mobile </w:t>
+            </w:r>
+            <w:proofErr w:type="gramStart"/>
+            <w:r>
+              <w:rPr>
+                <w:rFonts w:ascii="Tahoma" w:hAnsi="Tahoma" w:cs="Tahoma"/>
+                <w:b/>
+                <w:color w:val="000000"/>
+                <w:sz w:val="18"/>
+                <w:szCs w:val="18"/>
+                <w:shd w:val="clear" w:color="auto" w:fill="FFFFFF"/>
+              </w:rPr>
+              <w:t>No:{</w:t>
             </w:r>
             <w:proofErr w:type="spellStart"/>
+            <w:proofErr w:type="gramEnd"/>
             <w:r>
               <w:rPr>
                 <w:rFonts w:ascii="Consolas" w:hAnsi="Consolas" w:cs="Consolas"/>
@@ -1787,6 +1900,7 @@
                 <w:szCs w:val="19"/>
               </w:rPr>
             </w:pPr>
+            <w:proofErr w:type="gramStart"/>
             <w:r>
               <w:rPr>
                 <w:rFonts w:ascii="Tahoma" w:hAnsi="Tahoma" w:cs="Tahoma"/>
@@ -1807,6 +1921,7 @@
               </w:rPr>
               <w:t>:{</w:t>
             </w:r>
+            <w:proofErr w:type="gramEnd"/>
             <w:r>
               <w:rPr>
                 <w:rFonts w:ascii="Consolas" w:hAnsi="Consolas" w:cs="Consolas"/>
@@ -1846,6 +1961,7 @@
               </w:rPr>
               <w:t>Purpose Of Gate Pass</w:t>
             </w:r>
+            <w:proofErr w:type="gramStart"/>
             <w:r>
               <w:rPr>
                 <w:rFonts w:ascii="Tahoma" w:eastAsia="Arial" w:hAnsi="Tahoma" w:cs="Tahoma"/>
@@ -1866,6 +1982,7 @@
               <w:t>{</w:t>
             </w:r>
             <w:proofErr w:type="spellStart"/>
+            <w:proofErr w:type="gramEnd"/>
             <w:r>
               <w:rPr>
                 <w:rFonts w:ascii="Consolas" w:hAnsi="Consolas" w:cs="Consolas"/>
@@ -1893,11 +2010,11 @@
           <w:tblLook w:val="0000" w:firstRow="0" w:lastRow="0" w:firstColumn="0" w:lastColumn="0" w:noHBand="0" w:noVBand="0"/>
         </w:tblPrEx>
         <w:trPr>
-          <w:trHeight w:val="1138"/>
+          <w:trHeight w:val="1043"/>
         </w:trPr>
         <w:tc>
           <w:tcPr>
-            <w:tcW w:w="17928" w:type="dxa"/>
+            <w:tcW w:w="17939" w:type="dxa"/>
             <w:gridSpan w:val="6"/>
             <w:tcBorders>
               <w:left w:val="single" w:sz="4" w:space="0" w:color="auto"/>
@@ -1962,75 +2079,20 @@
           <w:tblLook w:val="0000" w:firstRow="0" w:lastRow="0" w:firstColumn="0" w:lastColumn="0" w:noHBand="0" w:noVBand="0"/>
         </w:tblPrEx>
         <w:trPr>
-          <w:trHeight w:val="1799"/>
+          <w:trHeight w:val="1241"/>
         </w:trPr>
         <w:tc>
           <w:tcPr>
-            <w:tcW w:w="17928" w:type="dxa"/>
+            <w:tcW w:w="17939" w:type="dxa"/>
             <w:gridSpan w:val="6"/>
             <w:tcBorders>
               <w:left w:val="single" w:sz="4" w:space="0" w:color="auto"/>
             </w:tcBorders>
           </w:tcPr>
-          <w:p>
-            <w:pPr>
-              <w:rPr>
-                <w:rFonts w:ascii="Tahoma" w:eastAsia="Arial" w:hAnsi="Tahoma" w:cs="Tahoma"/>
-                <w:b/>
-                <w:bCs/>
-                <w:sz w:val="16"/>
-                <w:szCs w:val="16"/>
-              </w:rPr>
-            </w:pPr>
-            <w:r>
-              <w:rPr>
-                <w:rFonts w:ascii="Tahoma" w:eastAsia="Arial" w:hAnsi="Tahoma" w:cs="Tahoma"/>
-                <w:b/>
-                <w:bCs/>
-                <w:sz w:val="16"/>
-                <w:szCs w:val="16"/>
-              </w:rPr>
-              <w:t>In Words: {</w:t>
-            </w:r>
-            <w:proofErr w:type="spellStart"/>
-            <w:r>
-              <w:rPr>
-                <w:rFonts w:ascii="Tahoma" w:eastAsia="Arial" w:hAnsi="Tahoma" w:cs="Tahoma"/>
-                <w:b/>
-                <w:bCs/>
-                <w:sz w:val="16"/>
-                <w:szCs w:val="16"/>
-              </w:rPr>
-              <w:t>TotalInWords</w:t>
-            </w:r>
-            <w:proofErr w:type="spellEnd"/>
-            <w:r>
-              <w:rPr>
-                <w:rFonts w:ascii="Tahoma" w:eastAsia="Arial" w:hAnsi="Tahoma" w:cs="Tahoma"/>
-                <w:b/>
-                <w:bCs/>
-                <w:sz w:val="16"/>
-                <w:szCs w:val="16"/>
-              </w:rPr>
-              <w:t>}</w:t>
-            </w:r>
-          </w:p>
-          <w:p>
-            <w:pPr>
-              <w:rPr>
-                <w:rFonts w:ascii="Tahoma" w:hAnsi="Tahoma" w:cs="Tahoma"/>
-                <w:sz w:val="16"/>
-                <w:szCs w:val="16"/>
-                <w:u w:val="single"/>
-              </w:rPr>
-            </w:pPr>
-          </w:p>
-          <w:p/>
-          <w:p/>
           <w:tbl>
             <w:tblPr>
               <w:tblStyle w:val="TableGrid"/>
-              <w:tblpPr w:leftFromText="180" w:rightFromText="180" w:vertAnchor="text" w:horzAnchor="margin" w:tblpXSpec="center" w:tblpY="-310"/>
+              <w:tblpPr w:leftFromText="180" w:rightFromText="180" w:vertAnchor="text" w:horzAnchor="margin" w:tblpXSpec="right" w:tblpY="-264"/>
               <w:tblOverlap w:val="never"/>
               <w:tblW w:w="0" w:type="auto"/>
               <w:tblBorders>
@@ -2045,16 +2107,16 @@
               <w:tblLook w:val="04A0" w:firstRow="1" w:lastRow="0" w:firstColumn="1" w:lastColumn="0" w:noHBand="0" w:noVBand="1"/>
             </w:tblPr>
             <w:tblGrid>
-              <w:gridCol w:w="5512"/>
-              <w:gridCol w:w="5513"/>
+              <w:gridCol w:w="5658"/>
+              <w:gridCol w:w="5659"/>
             </w:tblGrid>
             <w:tr>
               <w:trPr>
-                <w:trHeight w:val="1080"/>
+                <w:trHeight w:val="1170"/>
               </w:trPr>
               <w:tc>
                 <w:tcPr>
-                  <w:tcW w:w="5512" w:type="dxa"/>
+                  <w:tcW w:w="5658" w:type="dxa"/>
                 </w:tcPr>
                 <w:p>
                   <w:pPr>
@@ -2107,6 +2169,7 @@
                       <w:szCs w:val="16"/>
                     </w:rPr>
                   </w:pPr>
+                  <w:proofErr w:type="gramStart"/>
                   <w:r>
                     <w:rPr>
                       <w:rFonts w:ascii="Tahoma" w:eastAsia="Arial" w:hAnsi="Tahoma" w:cs="Tahoma"/>
@@ -2135,7 +2198,18 @@
                       <w:sz w:val="16"/>
                       <w:szCs w:val="16"/>
                     </w:rPr>
-                    <w:t xml:space="preserve">Cedaar Textile </w:t>
+                    <w:t>Cedaar</w:t>
+                  </w:r>
+                  <w:proofErr w:type="gramEnd"/>
+                  <w:r>
+                    <w:rPr>
+                      <w:rFonts w:ascii="Tahoma" w:hAnsi="Tahoma" w:cs="Tahoma"/>
+                      <w:b/>
+                      <w:color w:val="000000" w:themeColor="text1"/>
+                      <w:sz w:val="16"/>
+                      <w:szCs w:val="16"/>
+                    </w:rPr>
+                    <w:t xml:space="preserve"> Textile </w:t>
                   </w:r>
                   <w:proofErr w:type="spellStart"/>
                   <w:r>
@@ -2231,7 +2305,7 @@
               </w:tc>
               <w:tc>
                 <w:tcPr>
-                  <w:tcW w:w="5513" w:type="dxa"/>
+                  <w:tcW w:w="5659" w:type="dxa"/>
                 </w:tcPr>
                 <w:p>
                   <w:pPr>
@@ -2379,6 +2453,39 @@
           </w:tbl>
           <w:p>
             <w:pPr>
+              <w:rPr>
+                <w:rFonts w:ascii="Tahoma" w:eastAsia="Arial" w:hAnsi="Tahoma" w:cs="Tahoma"/>
+                <w:b/>
+                <w:bCs/>
+                <w:sz w:val="16"/>
+                <w:szCs w:val="16"/>
+              </w:rPr>
+            </w:pPr>
+            <w:r>
+              <w:rPr>
+                <w:rFonts w:ascii="Tahoma" w:eastAsia="Arial" w:hAnsi="Tahoma" w:cs="Tahoma"/>
+                <w:b/>
+                <w:bCs/>
+                <w:sz w:val="16"/>
+                <w:szCs w:val="16"/>
+              </w:rPr>
+              <w:t>In Words: {TotalInWords}</w:t>
+            </w:r>
+          </w:p>
+          <w:p>
+            <w:pPr>
+              <w:rPr>
+                <w:rFonts w:ascii="Tahoma" w:hAnsi="Tahoma" w:cs="Tahoma"/>
+                <w:sz w:val="16"/>
+                <w:szCs w:val="16"/>
+                <w:u w:val="single"/>
+              </w:rPr>
+            </w:pPr>
+          </w:p>
+          <w:p/>
+          <w:p/>
+          <w:p>
+            <w:pPr>
               <w:jc w:val="both"/>
               <w:rPr>
                 <w:rFonts w:ascii="Tahoma" w:eastAsia="Arial" w:hAnsi="Tahoma" w:cs="Tahoma"/>
@@ -2396,11 +2503,11 @@
           <w:tblLook w:val="0000" w:firstRow="0" w:lastRow="0" w:firstColumn="0" w:lastColumn="0" w:noHBand="0" w:noVBand="0"/>
         </w:tblPrEx>
         <w:trPr>
-          <w:trHeight w:val="1034"/>
+          <w:trHeight w:val="797"/>
         </w:trPr>
         <w:tc>
           <w:tcPr>
-            <w:tcW w:w="4482" w:type="dxa"/>
+            <w:tcW w:w="4484" w:type="dxa"/>
             <w:tcBorders>
               <w:left w:val="single" w:sz="4" w:space="0" w:color="auto"/>
             </w:tcBorders>
@@ -2517,7 +2624,7 @@
               <mc:AlternateContent>
                 <mc:Choice Requires="wps">
                   <w:drawing>
-                    <wp:anchor distT="0" distB="0" distL="114300" distR="114300" simplePos="0" relativeHeight="251665920" behindDoc="0" locked="0" layoutInCell="1" allowOverlap="1" wp14:anchorId="21E94EA8" wp14:editId="4DEED5C0">
+                    <wp:anchor distT="0" distB="0" distL="114300" distR="114300" simplePos="0" relativeHeight="251655168" behindDoc="0" locked="0" layoutInCell="1" allowOverlap="1" wp14:anchorId="21E94EA8" wp14:editId="4DEED5C0">
                       <wp:simplePos x="0" y="0"/>
                       <wp:positionH relativeFrom="column">
                         <wp:posOffset>673100</wp:posOffset>
@@ -2567,7 +2674,7 @@
                 </mc:Choice>
                 <mc:Fallback>
                   <w:pict>
-                    <v:line w14:anchorId="41A23CC9" id="Straight Connector 3" o:spid="_x0000_s1026" style="position:absolute;flip:x;z-index:251665920;visibility:visible;mso-wrap-style:square;mso-width-percent:0;mso-height-percent:0;mso-wrap-distance-left:9pt;mso-wrap-distance-top:0;mso-wrap-distance-right:9pt;mso-wrap-distance-bottom:0;mso-position-horizontal:absolute;mso-position-horizontal-relative:text;mso-position-vertical:absolute;mso-position-vertical-relative:text;mso-width-percent:0;mso-height-percent:0;mso-width-relative:margin;mso-height-relative:margin" from="53pt,5.1pt" to="162.55pt,5.1pt" o:gfxdata="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" strokecolor="windowText" strokeweight=".5pt">
+                    <v:line w14:anchorId="1C02CDAC" id="Straight Connector 3" o:spid="_x0000_s1026" style="position:absolute;flip:x;z-index:251655168;visibility:visible;mso-wrap-style:square;mso-width-percent:0;mso-height-percent:0;mso-wrap-distance-left:9pt;mso-wrap-distance-top:0;mso-wrap-distance-right:9pt;mso-wrap-distance-bottom:0;mso-position-horizontal:absolute;mso-position-horizontal-relative:text;mso-position-vertical:absolute;mso-position-vertical-relative:text;mso-width-percent:0;mso-height-percent:0;mso-width-relative:margin;mso-height-relative:margin" from="53pt,5.1pt" to="162.55pt,5.1pt" o:gfxdata="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" strokecolor="windowText" strokeweight=".5pt">
                       <v:stroke joinstyle="miter"/>
                     </v:line>
                   </w:pict>
@@ -2648,7 +2755,7 @@
         </w:tc>
         <w:tc>
           <w:tcPr>
-            <w:tcW w:w="4482" w:type="dxa"/>
+            <w:tcW w:w="4484" w:type="dxa"/>
             <w:gridSpan w:val="2"/>
             <w:tcBorders>
               <w:left w:val="single" w:sz="4" w:space="0" w:color="auto"/>
@@ -2753,7 +2860,7 @@
               <mc:AlternateContent>
                 <mc:Choice Requires="wps">
                   <w:drawing>
-                    <wp:anchor distT="0" distB="0" distL="114300" distR="114300" simplePos="0" relativeHeight="251667968" behindDoc="0" locked="0" layoutInCell="1" allowOverlap="1" wp14:anchorId="248B6302" wp14:editId="1D2BF8FF">
+                    <wp:anchor distT="0" distB="0" distL="114300" distR="114300" simplePos="0" relativeHeight="251659264" behindDoc="0" locked="0" layoutInCell="1" allowOverlap="1" wp14:anchorId="248B6302" wp14:editId="1D2BF8FF">
                       <wp:simplePos x="0" y="0"/>
                       <wp:positionH relativeFrom="column">
                         <wp:posOffset>608330</wp:posOffset>
@@ -2803,7 +2910,7 @@
                 </mc:Choice>
                 <mc:Fallback>
                   <w:pict>
-                    <v:line w14:anchorId="3CF0060F" id="Straight Connector 6" o:spid="_x0000_s1026" style="position:absolute;flip:x;z-index:251667968;visibility:visible;mso-wrap-style:square;mso-width-percent:0;mso-height-percent:0;mso-wrap-distance-left:9pt;mso-wrap-distance-top:0;mso-wrap-distance-right:9pt;mso-wrap-distance-bottom:0;mso-position-horizontal:absolute;mso-position-horizontal-relative:text;mso-position-vertical:absolute;mso-position-vertical-relative:text;mso-width-percent:0;mso-height-percent:0;mso-width-relative:margin;mso-height-relative:margin" from="47.9pt,1.35pt" to="157.45pt,1.35pt" o:gfxdata="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" strokecolor="windowText" strokeweight=".5pt">
+                    <v:line w14:anchorId="45648116" id="Straight Connector 6" o:spid="_x0000_s1026" style="position:absolute;flip:x;z-index:251659264;visibility:visible;mso-wrap-style:square;mso-width-percent:0;mso-height-percent:0;mso-wrap-distance-left:9pt;mso-wrap-distance-top:0;mso-wrap-distance-right:9pt;mso-wrap-distance-bottom:0;mso-position-horizontal:absolute;mso-position-horizontal-relative:text;mso-position-vertical:absolute;mso-position-vertical-relative:text;mso-width-percent:0;mso-height-percent:0;mso-width-relative:margin;mso-height-relative:margin" from="47.9pt,1.35pt" to="157.45pt,1.35pt" o:gfxdata="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" strokecolor="windowText" strokeweight=".5pt">
                       <v:stroke joinstyle="miter"/>
                     </v:line>
                   </w:pict>
@@ -2907,7 +3014,7 @@
         </w:tc>
         <w:tc>
           <w:tcPr>
-            <w:tcW w:w="4482" w:type="dxa"/>
+            <w:tcW w:w="4484" w:type="dxa"/>
             <w:gridSpan w:val="2"/>
             <w:tcBorders>
               <w:left w:val="single" w:sz="4" w:space="0" w:color="auto"/>
@@ -3008,7 +3115,7 @@
               <mc:AlternateContent>
                 <mc:Choice Requires="wps">
                   <w:drawing>
-                    <wp:anchor distT="0" distB="0" distL="114300" distR="114300" simplePos="0" relativeHeight="251668992" behindDoc="0" locked="0" layoutInCell="1" allowOverlap="1" wp14:anchorId="296259D4" wp14:editId="6E23320E">
+                    <wp:anchor distT="0" distB="0" distL="114300" distR="114300" simplePos="0" relativeHeight="251661312" behindDoc="0" locked="0" layoutInCell="1" allowOverlap="1" wp14:anchorId="296259D4" wp14:editId="6E23320E">
                       <wp:simplePos x="0" y="0"/>
                       <wp:positionH relativeFrom="column">
                         <wp:posOffset>482600</wp:posOffset>
@@ -3058,7 +3165,7 @@
                 </mc:Choice>
                 <mc:Fallback>
                   <w:pict>
-                    <v:line w14:anchorId="2A1AADDC" id="Straight Connector 8" o:spid="_x0000_s1026" style="position:absolute;flip:x;z-index:251668992;visibility:visible;mso-wrap-style:square;mso-width-percent:0;mso-height-percent:0;mso-wrap-distance-left:9pt;mso-wrap-distance-top:0;mso-wrap-distance-right:9pt;mso-wrap-distance-bottom:0;mso-position-horizontal:absolute;mso-position-horizontal-relative:text;mso-position-vertical:absolute;mso-position-vertical-relative:text;mso-width-percent:0;mso-height-percent:0;mso-width-relative:margin;mso-height-relative:margin" from="38pt,7.65pt" to="147.55pt,7.65pt" o:gfxdata="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" strokecolor="windowText" strokeweight=".5pt">
+                    <v:line w14:anchorId="0970F04F" id="Straight Connector 8" o:spid="_x0000_s1026" style="position:absolute;flip:x;z-index:251661312;visibility:visible;mso-wrap-style:square;mso-width-percent:0;mso-height-percent:0;mso-wrap-distance-left:9pt;mso-wrap-distance-top:0;mso-wrap-distance-right:9pt;mso-wrap-distance-bottom:0;mso-position-horizontal:absolute;mso-position-horizontal-relative:text;mso-position-vertical:absolute;mso-position-vertical-relative:text;mso-width-percent:0;mso-height-percent:0;mso-width-relative:margin;mso-height-relative:margin" from="38pt,7.65pt" to="147.55pt,7.65pt" o:gfxdata="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" strokecolor="windowText" strokeweight=".5pt">
                       <v:stroke joinstyle="miter"/>
                     </v:line>
                   </w:pict>
@@ -3123,7 +3230,7 @@
         </w:tc>
         <w:tc>
           <w:tcPr>
-            <w:tcW w:w="4482" w:type="dxa"/>
+            <w:tcW w:w="4486" w:type="dxa"/>
             <w:tcBorders>
               <w:left w:val="single" w:sz="4" w:space="0" w:color="auto"/>
             </w:tcBorders>
@@ -3211,7 +3318,7 @@
               <mc:AlternateContent>
                 <mc:Choice Requires="wps">
                   <w:drawing>
-                    <wp:anchor distT="0" distB="0" distL="114300" distR="114300" simplePos="0" relativeHeight="251666944" behindDoc="0" locked="0" layoutInCell="1" allowOverlap="1" wp14:anchorId="19AA36E8" wp14:editId="33882E6E">
+                    <wp:anchor distT="0" distB="0" distL="114300" distR="114300" simplePos="0" relativeHeight="251657216" behindDoc="0" locked="0" layoutInCell="1" allowOverlap="1" wp14:anchorId="19AA36E8" wp14:editId="33882E6E">
                       <wp:simplePos x="0" y="0"/>
                       <wp:positionH relativeFrom="column">
                         <wp:posOffset>470535</wp:posOffset>
@@ -3255,7 +3362,7 @@
                 </mc:Choice>
                 <mc:Fallback>
                   <w:pict>
-                    <v:line w14:anchorId="36CD5378" id="Straight Connector 2" o:spid="_x0000_s1026" style="position:absolute;z-index:251666944;visibility:visible;mso-wrap-style:square;mso-wrap-distance-left:9pt;mso-wrap-distance-top:0;mso-wrap-distance-right:9pt;mso-wrap-distance-bottom:0;mso-position-horizontal:absolute;mso-position-horizontal-relative:text;mso-position-vertical:absolute;mso-position-vertical-relative:text" from="37.05pt,7.45pt" to="149.1pt,7.45pt" o:gfxdata="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" strokecolor="windowText" strokeweight=".5pt">
+                    <v:line w14:anchorId="08B9BD38" id="Straight Connector 2" o:spid="_x0000_s1026" style="position:absolute;z-index:251657216;visibility:visible;mso-wrap-style:square;mso-wrap-distance-left:9pt;mso-wrap-distance-top:0;mso-wrap-distance-right:9pt;mso-wrap-distance-bottom:0;mso-position-horizontal:absolute;mso-position-horizontal-relative:text;mso-position-vertical:absolute;mso-position-vertical-relative:text" from="37.05pt,7.45pt" to="149.1pt,7.45pt" o:gfxdata="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" strokecolor="windowText" strokeweight=".5pt">
                       <v:stroke joinstyle="miter"/>
                     </v:line>
                   </w:pict>
@@ -3595,7 +3702,7 @@
 </file>
 
 <file path=word/endnotes.xml><?xml version="1.0" encoding="utf-8"?>
-<w:endnotes xmlns:wpc="http://schemas.microsoft.com/office/word/2010/wordprocessingCanvas" xmlns:cx="http://schemas.microsoft.com/office/drawing/2014/chartex" xmlns:cx1="http://schemas.microsoft.com/office/drawing/2015/9/8/chartex" xmlns:cx2="http://schemas.microsoft.com/office/drawing/2015/10/21/chartex" xmlns:cx3="http://schemas.microsoft.com/office/drawing/2016/5/9/chartex" xmlns:cx4="http://schemas.microsoft.com/office/drawing/2016/5/10/chartex" xmlns:cx5="http://schemas.microsoft.com/office/drawing/2016/5/11/chartex" xmlns:cx6="http://schemas.microsoft.com/office/drawing/2016/5/12/chartex" xmlns:cx7="http://schemas.microsoft.com/office/drawing/2016/5/13/chartex" xmlns:cx8="http://schemas.microsoft.com/office/drawing/2016/5/14/chartex" xmlns:mc="http://schemas.openxmlformats.org/markup-compatibility/2006" xmlns:aink="http://schemas.microsoft.com/office/drawing/2016/ink" xmlns:am3d="http://schemas.microsoft.com/office/drawing/2017/model3d" xmlns:o="urn:schemas-microsoft-com:office:office" xmlns:oel="http://schemas.microsoft.com/office/2019/extlst" xmlns:r="http://schemas.openxmlformats.org/officeDocument/2006/relationships" xmlns:m="http://schemas.openxmlformats.org/officeDocument/2006/math" xmlns:v="urn:schemas-microsoft-com:vml" xmlns:wp14="http://schemas.microsoft.com/office/word/2010/wordprocessingDrawing" xmlns:wp="http://schemas.openxmlformats.org/drawingml/2006/wordprocessingDrawing" xmlns:w10="urn:schemas-microsoft-com:office:word" xmlns:w="http://schemas.openxmlformats.org/wordprocessingml/2006/main" xmlns:w14="http://schemas.microsoft.com/office/word/2010/wordml" xmlns:w15="http://schemas.microsoft.com/office/word/2012/wordml" xmlns:w16cex="http://schemas.microsoft.com/office/word/2018/wordml/cex" xmlns:w16cid="http://schemas.microsoft.com/office/word/2016/wordml/cid" xmlns:w16="http://schemas.microsoft.com/office/word/2018/wordml" xmlns:w16sdtdh="http://schemas.microsoft.com/office/word/2020/wordml/sdtdatahash" xmlns:w16se="http://schemas.microsoft.com/office/word/2015/wordml/symex" xmlns:wpg="http://schemas.microsoft.com/office/word/2010/wordprocessingGroup" xmlns:wpi="http://schemas.microsoft.com/office/word/2010/wordprocessingInk" xmlns:wne="http://schemas.microsoft.com/office/word/2006/wordml" xmlns:wps="http://schemas.microsoft.com/office/word/2010/wordprocessingShape" mc:Ignorable="w14 w15 w16se w16cid w16 w16cex w16sdtdh wp14">
+<w:endnotes xmlns:wpc="http://schemas.microsoft.com/office/word/2010/wordprocessingCanvas" xmlns:cx="http://schemas.microsoft.com/office/drawing/2014/chartex" xmlns:cx1="http://schemas.microsoft.com/office/drawing/2015/9/8/chartex" xmlns:cx2="http://schemas.microsoft.com/office/drawing/2015/10/21/chartex" xmlns:cx3="http://schemas.microsoft.com/office/drawing/2016/5/9/chartex" xmlns:cx4="http://schemas.microsoft.com/office/drawing/2016/5/10/chartex" xmlns:cx5="http://schemas.microsoft.com/office/drawing/2016/5/11/chartex" xmlns:cx6="http://schemas.microsoft.com/office/drawing/2016/5/12/chartex" xmlns:cx7="http://schemas.microsoft.com/office/drawing/2016/5/13/chartex" xmlns:cx8="http://schemas.microsoft.com/office/drawing/2016/5/14/chartex" xmlns:mc="http://schemas.openxmlformats.org/markup-compatibility/2006" xmlns:aink="http://schemas.microsoft.com/office/drawing/2016/ink" xmlns:am3d="http://schemas.microsoft.com/office/drawing/2017/model3d" xmlns:o="urn:schemas-microsoft-com:office:office" xmlns:oel="http://schemas.microsoft.com/office/2019/extlst" xmlns:r="http://schemas.openxmlformats.org/officeDocument/2006/relationships" xmlns:m="http://schemas.openxmlformats.org/officeDocument/2006/math" xmlns:v="urn:schemas-microsoft-com:vml" xmlns:wp14="http://schemas.microsoft.com/office/word/2010/wordprocessingDrawing" xmlns:wp="http://schemas.openxmlformats.org/drawingml/2006/wordprocessingDrawing" xmlns:w10="urn:schemas-microsoft-com:office:word" xmlns:w="http://schemas.openxmlformats.org/wordprocessingml/2006/main" xmlns:w14="http://schemas.microsoft.com/office/word/2010/wordml" xmlns:w15="http://schemas.microsoft.com/office/word/2012/wordml" xmlns:w16cex="http://schemas.microsoft.com/office/word/2018/wordml/cex" xmlns:w16cid="http://schemas.microsoft.com/office/word/2016/wordml/cid" xmlns:w16="http://schemas.microsoft.com/office/word/2018/wordml" xmlns:w16du="http://schemas.microsoft.com/office/word/2023/wordml/word16du" xmlns:w16sdtdh="http://schemas.microsoft.com/office/word/2020/wordml/sdtdatahash" xmlns:w16sdtfl="http://schemas.microsoft.com/office/word/2024/wordml/sdtformatlock" xmlns:w16se="http://schemas.microsoft.com/office/word/2015/wordml/symex" xmlns:wpg="http://schemas.microsoft.com/office/word/2010/wordprocessingGroup" xmlns:wpi="http://schemas.microsoft.com/office/word/2010/wordprocessingInk" xmlns:wne="http://schemas.microsoft.com/office/word/2006/wordml" xmlns:wps="http://schemas.microsoft.com/office/word/2010/wordprocessingShape" mc:Ignorable="w14 w15 w16se w16cid w16 w16cex w16sdtdh w16sdtfl w16du wp14">
   <w:endnote w:type="separator" w:id="-1">
     <w:p>
       <w:r>
@@ -3614,7 +3721,7 @@
 </file>
 
 <file path=word/footer1.xml><?xml version="1.0" encoding="utf-8"?>
-<w:ftr xmlns:wpc="http://schemas.microsoft.com/office/word/2010/wordprocessingCanvas" xmlns:cx="http://schemas.microsoft.com/office/drawing/2014/chartex" xmlns:cx1="http://schemas.microsoft.com/office/drawing/2015/9/8/chartex" xmlns:cx2="http://schemas.microsoft.com/office/drawing/2015/10/21/chartex" xmlns:cx3="http://schemas.microsoft.com/office/drawing/2016/5/9/chartex" xmlns:cx4="http://schemas.microsoft.com/office/drawing/2016/5/10/chartex" xmlns:cx5="http://schemas.microsoft.com/office/drawing/2016/5/11/chartex" xmlns:cx6="http://schemas.microsoft.com/office/drawing/2016/5/12/chartex" xmlns:cx7="http://schemas.microsoft.com/office/drawing/2016/5/13/chartex" xmlns:cx8="http://schemas.microsoft.com/office/drawing/2016/5/14/chartex" xmlns:mc="http://schemas.openxmlformats.org/markup-compatibility/2006" xmlns:aink="http://schemas.microsoft.com/office/drawing/2016/ink" xmlns:am3d="http://schemas.microsoft.com/office/drawing/2017/model3d" xmlns:o="urn:schemas-microsoft-com:office:office" xmlns:oel="http://schemas.microsoft.com/office/2019/extlst" xmlns:r="http://schemas.openxmlformats.org/officeDocument/2006/relationships" xmlns:m="http://schemas.openxmlformats.org/officeDocument/2006/math" xmlns:v="urn:schemas-microsoft-com:vml" xmlns:wp14="http://schemas.microsoft.com/office/word/2010/wordprocessingDrawing" xmlns:wp="http://schemas.openxmlformats.org/drawingml/2006/wordprocessingDrawing" xmlns:w10="urn:schemas-microsoft-com:office:word" xmlns:w="http://schemas.openxmlformats.org/wordprocessingml/2006/main" xmlns:w14="http://schemas.microsoft.com/office/word/2010/wordml" xmlns:w15="http://schemas.microsoft.com/office/word/2012/wordml" xmlns:w16cex="http://schemas.microsoft.com/office/word/2018/wordml/cex" xmlns:w16cid="http://schemas.microsoft.com/office/word/2016/wordml/cid" xmlns:w16="http://schemas.microsoft.com/office/word/2018/wordml" xmlns:w16sdtdh="http://schemas.microsoft.com/office/word/2020/wordml/sdtdatahash" xmlns:w16se="http://schemas.microsoft.com/office/word/2015/wordml/symex" xmlns:wpg="http://schemas.microsoft.com/office/word/2010/wordprocessingGroup" xmlns:wpi="http://schemas.microsoft.com/office/word/2010/wordprocessingInk" xmlns:wne="http://schemas.microsoft.com/office/word/2006/wordml" xmlns:wps="http://schemas.microsoft.com/office/word/2010/wordprocessingShape" mc:Ignorable="w14 w15 w16se w16cid w16 w16cex w16sdtdh wp14">
+<w:ftr xmlns:wpc="http://schemas.microsoft.com/office/word/2010/wordprocessingCanvas" xmlns:cx="http://schemas.microsoft.com/office/drawing/2014/chartex" xmlns:cx1="http://schemas.microsoft.com/office/drawing/2015/9/8/chartex" xmlns:cx2="http://schemas.microsoft.com/office/drawing/2015/10/21/chartex" xmlns:cx3="http://schemas.microsoft.com/office/drawing/2016/5/9/chartex" xmlns:cx4="http://schemas.microsoft.com/office/drawing/2016/5/10/chartex" xmlns:cx5="http://schemas.microsoft.com/office/drawing/2016/5/11/chartex" xmlns:cx6="http://schemas.microsoft.com/office/drawing/2016/5/12/chartex" xmlns:cx7="http://schemas.microsoft.com/office/drawing/2016/5/13/chartex" xmlns:cx8="http://schemas.microsoft.com/office/drawing/2016/5/14/chartex" xmlns:mc="http://schemas.openxmlformats.org/markup-compatibility/2006" xmlns:aink="http://schemas.microsoft.com/office/drawing/2016/ink" xmlns:am3d="http://schemas.microsoft.com/office/drawing/2017/model3d" xmlns:o="urn:schemas-microsoft-com:office:office" xmlns:oel="http://schemas.microsoft.com/office/2019/extlst" xmlns:r="http://schemas.openxmlformats.org/officeDocument/2006/relationships" xmlns:m="http://schemas.openxmlformats.org/officeDocument/2006/math" xmlns:v="urn:schemas-microsoft-com:vml" xmlns:wp14="http://schemas.microsoft.com/office/word/2010/wordprocessingDrawing" xmlns:wp="http://schemas.openxmlformats.org/drawingml/2006/wordprocessingDrawing" xmlns:w10="urn:schemas-microsoft-com:office:word" xmlns:w="http://schemas.openxmlformats.org/wordprocessingml/2006/main" xmlns:w14="http://schemas.microsoft.com/office/word/2010/wordml" xmlns:w15="http://schemas.microsoft.com/office/word/2012/wordml" xmlns:w16cex="http://schemas.microsoft.com/office/word/2018/wordml/cex" xmlns:w16cid="http://schemas.microsoft.com/office/word/2016/wordml/cid" xmlns:w16="http://schemas.microsoft.com/office/word/2018/wordml" xmlns:w16du="http://schemas.microsoft.com/office/word/2023/wordml/word16du" xmlns:w16sdtdh="http://schemas.microsoft.com/office/word/2020/wordml/sdtdatahash" xmlns:w16sdtfl="http://schemas.microsoft.com/office/word/2024/wordml/sdtformatlock" xmlns:w16se="http://schemas.microsoft.com/office/word/2015/wordml/symex" xmlns:wpg="http://schemas.microsoft.com/office/word/2010/wordprocessingGroup" xmlns:wpi="http://schemas.microsoft.com/office/word/2010/wordprocessingInk" xmlns:wne="http://schemas.microsoft.com/office/word/2006/wordml" xmlns:wps="http://schemas.microsoft.com/office/word/2010/wordprocessingShape" mc:Ignorable="w14 w15 w16se w16cid w16 w16cex w16sdtdh w16sdtfl w16du wp14">
   <w:p>
     <w:pPr>
       <w:pStyle w:val="Footer"/>
@@ -3624,7 +3731,7 @@
 </file>
 
 <file path=word/footer2.xml><?xml version="1.0" encoding="utf-8"?>
-<w:ftr xmlns:wpc="http://schemas.microsoft.com/office/word/2010/wordprocessingCanvas" xmlns:cx="http://schemas.microsoft.com/office/drawing/2014/chartex" xmlns:cx1="http://schemas.microsoft.com/office/drawing/2015/9/8/chartex" xmlns:cx2="http://schemas.microsoft.com/office/drawing/2015/10/21/chartex" xmlns:cx3="http://schemas.microsoft.com/office/drawing/2016/5/9/chartex" xmlns:cx4="http://schemas.microsoft.com/office/drawing/2016/5/10/chartex" xmlns:cx5="http://schemas.microsoft.com/office/drawing/2016/5/11/chartex" xmlns:cx6="http://schemas.microsoft.com/office/drawing/2016/5/12/chartex" xmlns:cx7="http://schemas.microsoft.com/office/drawing/2016/5/13/chartex" xmlns:cx8="http://schemas.microsoft.com/office/drawing/2016/5/14/chartex" xmlns:mc="http://schemas.openxmlformats.org/markup-compatibility/2006" xmlns:aink="http://schemas.microsoft.com/office/drawing/2016/ink" xmlns:am3d="http://schemas.microsoft.com/office/drawing/2017/model3d" xmlns:o="urn:schemas-microsoft-com:office:office" xmlns:oel="http://schemas.microsoft.com/office/2019/extlst" xmlns:r="http://schemas.openxmlformats.org/officeDocument/2006/relationships" xmlns:m="http://schemas.openxmlformats.org/officeDocument/2006/math" xmlns:v="urn:schemas-microsoft-com:vml" xmlns:wp14="http://schemas.microsoft.com/office/word/2010/wordprocessingDrawing" xmlns:wp="http://schemas.openxmlformats.org/drawingml/2006/wordprocessingDrawing" xmlns:w10="urn:schemas-microsoft-com:office:word" xmlns:w="http://schemas.openxmlformats.org/wordprocessingml/2006/main" xmlns:w14="http://schemas.microsoft.com/office/word/2010/wordml" xmlns:w15="http://schemas.microsoft.com/office/word/2012/wordml" xmlns:w16cex="http://schemas.microsoft.com/office/word/2018/wordml/cex" xmlns:w16cid="http://schemas.microsoft.com/office/word/2016/wordml/cid" xmlns:w16="http://schemas.microsoft.com/office/word/2018/wordml" xmlns:w16sdtdh="http://schemas.microsoft.com/office/word/2020/wordml/sdtdatahash" xmlns:w16se="http://schemas.microsoft.com/office/word/2015/wordml/symex" xmlns:wpg="http://schemas.microsoft.com/office/word/2010/wordprocessingGroup" xmlns:wpi="http://schemas.microsoft.com/office/word/2010/wordprocessingInk" xmlns:wne="http://schemas.microsoft.com/office/word/2006/wordml" xmlns:wps="http://schemas.microsoft.com/office/word/2010/wordprocessingShape" mc:Ignorable="w14 w15 w16se w16cid w16 w16cex w16sdtdh wp14">
+<w:ftr xmlns:wpc="http://schemas.microsoft.com/office/word/2010/wordprocessingCanvas" xmlns:cx="http://schemas.microsoft.com/office/drawing/2014/chartex" xmlns:cx1="http://schemas.microsoft.com/office/drawing/2015/9/8/chartex" xmlns:cx2="http://schemas.microsoft.com/office/drawing/2015/10/21/chartex" xmlns:cx3="http://schemas.microsoft.com/office/drawing/2016/5/9/chartex" xmlns:cx4="http://schemas.microsoft.com/office/drawing/2016/5/10/chartex" xmlns:cx5="http://schemas.microsoft.com/office/drawing/2016/5/11/chartex" xmlns:cx6="http://schemas.microsoft.com/office/drawing/2016/5/12/chartex" xmlns:cx7="http://schemas.microsoft.com/office/drawing/2016/5/13/chartex" xmlns:cx8="http://schemas.microsoft.com/office/drawing/2016/5/14/chartex" xmlns:mc="http://schemas.openxmlformats.org/markup-compatibility/2006" xmlns:aink="http://schemas.microsoft.com/office/drawing/2016/ink" xmlns:am3d="http://schemas.microsoft.com/office/drawing/2017/model3d" xmlns:o="urn:schemas-microsoft-com:office:office" xmlns:oel="http://schemas.microsoft.com/office/2019/extlst" xmlns:r="http://schemas.openxmlformats.org/officeDocument/2006/relationships" xmlns:m="http://schemas.openxmlformats.org/officeDocument/2006/math" xmlns:v="urn:schemas-microsoft-com:vml" xmlns:wp14="http://schemas.microsoft.com/office/word/2010/wordprocessingDrawing" xmlns:wp="http://schemas.openxmlformats.org/drawingml/2006/wordprocessingDrawing" xmlns:w10="urn:schemas-microsoft-com:office:word" xmlns:w="http://schemas.openxmlformats.org/wordprocessingml/2006/main" xmlns:w14="http://schemas.microsoft.com/office/word/2010/wordml" xmlns:w15="http://schemas.microsoft.com/office/word/2012/wordml" xmlns:w16cex="http://schemas.microsoft.com/office/word/2018/wordml/cex" xmlns:w16cid="http://schemas.microsoft.com/office/word/2016/wordml/cid" xmlns:w16="http://schemas.microsoft.com/office/word/2018/wordml" xmlns:w16du="http://schemas.microsoft.com/office/word/2023/wordml/word16du" xmlns:w16sdtdh="http://schemas.microsoft.com/office/word/2020/wordml/sdtdatahash" xmlns:w16sdtfl="http://schemas.microsoft.com/office/word/2024/wordml/sdtformatlock" xmlns:w16se="http://schemas.microsoft.com/office/word/2015/wordml/symex" xmlns:wpg="http://schemas.microsoft.com/office/word/2010/wordprocessingGroup" xmlns:wpi="http://schemas.microsoft.com/office/word/2010/wordprocessingInk" xmlns:wne="http://schemas.microsoft.com/office/word/2006/wordml" xmlns:wps="http://schemas.microsoft.com/office/word/2010/wordprocessingShape" mc:Ignorable="w14 w15 w16se w16cid w16 w16cex w16sdtdh w16sdtfl w16du wp14">
   <w:sdt>
     <w:sdtPr>
       <w:id w:val="-901824678"/>
@@ -3701,7 +3808,25 @@
         <w:sz w:val="16"/>
         <w:szCs w:val="16"/>
       </w:rPr>
-      <w:t xml:space="preserve">, U.P: </w:t>
+      <w:t xml:space="preserve">, </w:t>
+    </w:r>
+    <w:proofErr w:type="gramStart"/>
+    <w:r>
+      <w:rPr>
+        <w:rFonts w:ascii="Tahoma" w:hAnsi="Tahoma" w:cs="Tahoma"/>
+        <w:sz w:val="16"/>
+        <w:szCs w:val="16"/>
+      </w:rPr>
+      <w:t>U.P</w:t>
+    </w:r>
+    <w:proofErr w:type="gramEnd"/>
+    <w:r>
+      <w:rPr>
+        <w:rFonts w:ascii="Tahoma" w:hAnsi="Tahoma" w:cs="Tahoma"/>
+        <w:sz w:val="16"/>
+        <w:szCs w:val="16"/>
+      </w:rPr>
+      <w:t xml:space="preserve">: </w:t>
     </w:r>
     <w:proofErr w:type="spellStart"/>
     <w:r>
@@ -3780,7 +3905,7 @@
 </file>
 
 <file path=word/footer3.xml><?xml version="1.0" encoding="utf-8"?>
-<w:ftr xmlns:wpc="http://schemas.microsoft.com/office/word/2010/wordprocessingCanvas" xmlns:cx="http://schemas.microsoft.com/office/drawing/2014/chartex" xmlns:cx1="http://schemas.microsoft.com/office/drawing/2015/9/8/chartex" xmlns:cx2="http://schemas.microsoft.com/office/drawing/2015/10/21/chartex" xmlns:cx3="http://schemas.microsoft.com/office/drawing/2016/5/9/chartex" xmlns:cx4="http://schemas.microsoft.com/office/drawing/2016/5/10/chartex" xmlns:cx5="http://schemas.microsoft.com/office/drawing/2016/5/11/chartex" xmlns:cx6="http://schemas.microsoft.com/office/drawing/2016/5/12/chartex" xmlns:cx7="http://schemas.microsoft.com/office/drawing/2016/5/13/chartex" xmlns:cx8="http://schemas.microsoft.com/office/drawing/2016/5/14/chartex" xmlns:mc="http://schemas.openxmlformats.org/markup-compatibility/2006" xmlns:aink="http://schemas.microsoft.com/office/drawing/2016/ink" xmlns:am3d="http://schemas.microsoft.com/office/drawing/2017/model3d" xmlns:o="urn:schemas-microsoft-com:office:office" xmlns:oel="http://schemas.microsoft.com/office/2019/extlst" xmlns:r="http://schemas.openxmlformats.org/officeDocument/2006/relationships" xmlns:m="http://schemas.openxmlformats.org/officeDocument/2006/math" xmlns:v="urn:schemas-microsoft-com:vml" xmlns:wp14="http://schemas.microsoft.com/office/word/2010/wordprocessingDrawing" xmlns:wp="http://schemas.openxmlformats.org/drawingml/2006/wordprocessingDrawing" xmlns:w10="urn:schemas-microsoft-com:office:word" xmlns:w="http://schemas.openxmlformats.org/wordprocessingml/2006/main" xmlns:w14="http://schemas.microsoft.com/office/word/2010/wordml" xmlns:w15="http://schemas.microsoft.com/office/word/2012/wordml" xmlns:w16cex="http://schemas.microsoft.com/office/word/2018/wordml/cex" xmlns:w16cid="http://schemas.microsoft.com/office/word/2016/wordml/cid" xmlns:w16="http://schemas.microsoft.com/office/word/2018/wordml" xmlns:w16sdtdh="http://schemas.microsoft.com/office/word/2020/wordml/sdtdatahash" xmlns:w16se="http://schemas.microsoft.com/office/word/2015/wordml/symex" xmlns:wpg="http://schemas.microsoft.com/office/word/2010/wordprocessingGroup" xmlns:wpi="http://schemas.microsoft.com/office/word/2010/wordprocessingInk" xmlns:wne="http://schemas.microsoft.com/office/word/2006/wordml" xmlns:wps="http://schemas.microsoft.com/office/word/2010/wordprocessingShape" mc:Ignorable="w14 w15 w16se w16cid w16 w16cex w16sdtdh wp14">
+<w:ftr xmlns:wpc="http://schemas.microsoft.com/office/word/2010/wordprocessingCanvas" xmlns:cx="http://schemas.microsoft.com/office/drawing/2014/chartex" xmlns:cx1="http://schemas.microsoft.com/office/drawing/2015/9/8/chartex" xmlns:cx2="http://schemas.microsoft.com/office/drawing/2015/10/21/chartex" xmlns:cx3="http://schemas.microsoft.com/office/drawing/2016/5/9/chartex" xmlns:cx4="http://schemas.microsoft.com/office/drawing/2016/5/10/chartex" xmlns:cx5="http://schemas.microsoft.com/office/drawing/2016/5/11/chartex" xmlns:cx6="http://schemas.microsoft.com/office/drawing/2016/5/12/chartex" xmlns:cx7="http://schemas.microsoft.com/office/drawing/2016/5/13/chartex" xmlns:cx8="http://schemas.microsoft.com/office/drawing/2016/5/14/chartex" xmlns:mc="http://schemas.openxmlformats.org/markup-compatibility/2006" xmlns:aink="http://schemas.microsoft.com/office/drawing/2016/ink" xmlns:am3d="http://schemas.microsoft.com/office/drawing/2017/model3d" xmlns:o="urn:schemas-microsoft-com:office:office" xmlns:oel="http://schemas.microsoft.com/office/2019/extlst" xmlns:r="http://schemas.openxmlformats.org/officeDocument/2006/relationships" xmlns:m="http://schemas.openxmlformats.org/officeDocument/2006/math" xmlns:v="urn:schemas-microsoft-com:vml" xmlns:wp14="http://schemas.microsoft.com/office/word/2010/wordprocessingDrawing" xmlns:wp="http://schemas.openxmlformats.org/drawingml/2006/wordprocessingDrawing" xmlns:w10="urn:schemas-microsoft-com:office:word" xmlns:w="http://schemas.openxmlformats.org/wordprocessingml/2006/main" xmlns:w14="http://schemas.microsoft.com/office/word/2010/wordml" xmlns:w15="http://schemas.microsoft.com/office/word/2012/wordml" xmlns:w16cex="http://schemas.microsoft.com/office/word/2018/wordml/cex" xmlns:w16cid="http://schemas.microsoft.com/office/word/2016/wordml/cid" xmlns:w16="http://schemas.microsoft.com/office/word/2018/wordml" xmlns:w16du="http://schemas.microsoft.com/office/word/2023/wordml/word16du" xmlns:w16sdtdh="http://schemas.microsoft.com/office/word/2020/wordml/sdtdatahash" xmlns:w16sdtfl="http://schemas.microsoft.com/office/word/2024/wordml/sdtformatlock" xmlns:w16se="http://schemas.microsoft.com/office/word/2015/wordml/symex" xmlns:wpg="http://schemas.microsoft.com/office/word/2010/wordprocessingGroup" xmlns:wpi="http://schemas.microsoft.com/office/word/2010/wordprocessingInk" xmlns:wne="http://schemas.microsoft.com/office/word/2006/wordml" xmlns:wps="http://schemas.microsoft.com/office/word/2010/wordprocessingShape" mc:Ignorable="w14 w15 w16se w16cid w16 w16cex w16sdtdh w16sdtfl w16du wp14">
   <w:p>
     <w:pPr>
       <w:pStyle w:val="Footer"/>
@@ -3790,7 +3915,7 @@
 </file>
 
 <file path=word/footnotes.xml><?xml version="1.0" encoding="utf-8"?>
-<w:footnotes xmlns:wpc="http://schemas.microsoft.com/office/word/2010/wordprocessingCanvas" xmlns:cx="http://schemas.microsoft.com/office/drawing/2014/chartex" xmlns:cx1="http://schemas.microsoft.com/office/drawing/2015/9/8/chartex" xmlns:cx2="http://schemas.microsoft.com/office/drawing/2015/10/21/chartex" xmlns:cx3="http://schemas.microsoft.com/office/drawing/2016/5/9/chartex" xmlns:cx4="http://schemas.microsoft.com/office/drawing/2016/5/10/chartex" xmlns:cx5="http://schemas.microsoft.com/office/drawing/2016/5/11/chartex" xmlns:cx6="http://schemas.microsoft.com/office/drawing/2016/5/12/chartex" xmlns:cx7="http://schemas.microsoft.com/office/drawing/2016/5/13/chartex" xmlns:cx8="http://schemas.microsoft.com/office/drawing/2016/5/14/chartex" xmlns:mc="http://schemas.openxmlformats.org/markup-compatibility/2006" xmlns:aink="http://schemas.microsoft.com/office/drawing/2016/ink" xmlns:am3d="http://schemas.microsoft.com/office/drawing/2017/model3d" xmlns:o="urn:schemas-microsoft-com:office:office" xmlns:oel="http://schemas.microsoft.com/office/2019/extlst" xmlns:r="http://schemas.openxmlformats.org/officeDocument/2006/relationships" xmlns:m="http://schemas.openxmlformats.org/officeDocument/2006/math" xmlns:v="urn:schemas-microsoft-com:vml" xmlns:wp14="http://schemas.microsoft.com/office/word/2010/wordprocessingDrawing" xmlns:wp="http://schemas.openxmlformats.org/drawingml/2006/wordprocessingDrawing" xmlns:w10="urn:schemas-microsoft-com:office:word" xmlns:w="http://schemas.openxmlformats.org/wordprocessingml/2006/main" xmlns:w14="http://schemas.microsoft.com/office/word/2010/wordml" xmlns:w15="http://schemas.microsoft.com/office/word/2012/wordml" xmlns:w16cex="http://schemas.microsoft.com/office/word/2018/wordml/cex" xmlns:w16cid="http://schemas.microsoft.com/office/word/2016/wordml/cid" xmlns:w16="http://schemas.microsoft.com/office/word/2018/wordml" xmlns:w16sdtdh="http://schemas.microsoft.com/office/word/2020/wordml/sdtdatahash" xmlns:w16se="http://schemas.microsoft.com/office/word/2015/wordml/symex" xmlns:wpg="http://schemas.microsoft.com/office/word/2010/wordprocessingGroup" xmlns:wpi="http://schemas.microsoft.com/office/word/2010/wordprocessingInk" xmlns:wne="http://schemas.microsoft.com/office/word/2006/wordml" xmlns:wps="http://schemas.microsoft.com/office/word/2010/wordprocessingShape" mc:Ignorable="w14 w15 w16se w16cid w16 w16cex w16sdtdh wp14">
+<w:footnotes xmlns:wpc="http://schemas.microsoft.com/office/word/2010/wordprocessingCanvas" xmlns:cx="http://schemas.microsoft.com/office/drawing/2014/chartex" xmlns:cx1="http://schemas.microsoft.com/office/drawing/2015/9/8/chartex" xmlns:cx2="http://schemas.microsoft.com/office/drawing/2015/10/21/chartex" xmlns:cx3="http://schemas.microsoft.com/office/drawing/2016/5/9/chartex" xmlns:cx4="http://schemas.microsoft.com/office/drawing/2016/5/10/chartex" xmlns:cx5="http://schemas.microsoft.com/office/drawing/2016/5/11/chartex" xmlns:cx6="http://schemas.microsoft.com/office/drawing/2016/5/12/chartex" xmlns:cx7="http://schemas.microsoft.com/office/drawing/2016/5/13/chartex" xmlns:cx8="http://schemas.microsoft.com/office/drawing/2016/5/14/chartex" xmlns:mc="http://schemas.openxmlformats.org/markup-compatibility/2006" xmlns:aink="http://schemas.microsoft.com/office/drawing/2016/ink" xmlns:am3d="http://schemas.microsoft.com/office/drawing/2017/model3d" xmlns:o="urn:schemas-microsoft-com:office:office" xmlns:oel="http://schemas.microsoft.com/office/2019/extlst" xmlns:r="http://schemas.openxmlformats.org/officeDocument/2006/relationships" xmlns:m="http://schemas.openxmlformats.org/officeDocument/2006/math" xmlns:v="urn:schemas-microsoft-com:vml" xmlns:wp14="http://schemas.microsoft.com/office/word/2010/wordprocessingDrawing" xmlns:wp="http://schemas.openxmlformats.org/drawingml/2006/wordprocessingDrawing" xmlns:w10="urn:schemas-microsoft-com:office:word" xmlns:w="http://schemas.openxmlformats.org/wordprocessingml/2006/main" xmlns:w14="http://schemas.microsoft.com/office/word/2010/wordml" xmlns:w15="http://schemas.microsoft.com/office/word/2012/wordml" xmlns:w16cex="http://schemas.microsoft.com/office/word/2018/wordml/cex" xmlns:w16cid="http://schemas.microsoft.com/office/word/2016/wordml/cid" xmlns:w16="http://schemas.microsoft.com/office/word/2018/wordml" xmlns:w16du="http://schemas.microsoft.com/office/word/2023/wordml/word16du" xmlns:w16sdtdh="http://schemas.microsoft.com/office/word/2020/wordml/sdtdatahash" xmlns:w16sdtfl="http://schemas.microsoft.com/office/word/2024/wordml/sdtformatlock" xmlns:w16se="http://schemas.microsoft.com/office/word/2015/wordml/symex" xmlns:wpg="http://schemas.microsoft.com/office/word/2010/wordprocessingGroup" xmlns:wpi="http://schemas.microsoft.com/office/word/2010/wordprocessingInk" xmlns:wne="http://schemas.microsoft.com/office/word/2006/wordml" xmlns:wps="http://schemas.microsoft.com/office/word/2010/wordprocessingShape" mc:Ignorable="w14 w15 w16se w16cid w16 w16cex w16sdtdh w16sdtfl w16du wp14">
   <w:footnote w:type="separator" w:id="-1">
     <w:p>
       <w:r>
@@ -3809,7 +3934,7 @@
 </file>
 
 <file path=word/header1.xml><?xml version="1.0" encoding="utf-8"?>
-<w:hdr xmlns:wpc="http://schemas.microsoft.com/office/word/2010/wordprocessingCanvas" xmlns:cx="http://schemas.microsoft.com/office/drawing/2014/chartex" xmlns:cx1="http://schemas.microsoft.com/office/drawing/2015/9/8/chartex" xmlns:cx2="http://schemas.microsoft.com/office/drawing/2015/10/21/chartex" xmlns:cx3="http://schemas.microsoft.com/office/drawing/2016/5/9/chartex" xmlns:cx4="http://schemas.microsoft.com/office/drawing/2016/5/10/chartex" xmlns:cx5="http://schemas.microsoft.com/office/drawing/2016/5/11/chartex" xmlns:cx6="http://schemas.microsoft.com/office/drawing/2016/5/12/chartex" xmlns:cx7="http://schemas.microsoft.com/office/drawing/2016/5/13/chartex" xmlns:cx8="http://schemas.microsoft.com/office/drawing/2016/5/14/chartex" xmlns:mc="http://schemas.openxmlformats.org/markup-compatibility/2006" xmlns:aink="http://schemas.microsoft.com/office/drawing/2016/ink" xmlns:am3d="http://schemas.microsoft.com/office/drawing/2017/model3d" xmlns:o="urn:schemas-microsoft-com:office:office" xmlns:oel="http://schemas.microsoft.com/office/2019/extlst" xmlns:r="http://schemas.openxmlformats.org/officeDocument/2006/relationships" xmlns:m="http://schemas.openxmlformats.org/officeDocument/2006/math" xmlns:v="urn:schemas-microsoft-com:vml" xmlns:wp14="http://schemas.microsoft.com/office/word/2010/wordprocessingDrawing" xmlns:wp="http://schemas.openxmlformats.org/drawingml/2006/wordprocessingDrawing" xmlns:w10="urn:schemas-microsoft-com:office:word" xmlns:w="http://schemas.openxmlformats.org/wordprocessingml/2006/main" xmlns:w14="http://schemas.microsoft.com/office/word/2010/wordml" xmlns:w15="http://schemas.microsoft.com/office/word/2012/wordml" xmlns:w16cex="http://schemas.microsoft.com/office/word/2018/wordml/cex" xmlns:w16cid="http://schemas.microsoft.com/office/word/2016/wordml/cid" xmlns:w16="http://schemas.microsoft.com/office/word/2018/wordml" xmlns:w16sdtdh="http://schemas.microsoft.com/office/word/2020/wordml/sdtdatahash" xmlns:w16se="http://schemas.microsoft.com/office/word/2015/wordml/symex" xmlns:wpg="http://schemas.microsoft.com/office/word/2010/wordprocessingGroup" xmlns:wpi="http://schemas.microsoft.com/office/word/2010/wordprocessingInk" xmlns:wne="http://schemas.microsoft.com/office/word/2006/wordml" xmlns:wps="http://schemas.microsoft.com/office/word/2010/wordprocessingShape" mc:Ignorable="w14 w15 w16se w16cid w16 w16cex w16sdtdh wp14">
+<w:hdr xmlns:wpc="http://schemas.microsoft.com/office/word/2010/wordprocessingCanvas" xmlns:cx="http://schemas.microsoft.com/office/drawing/2014/chartex" xmlns:cx1="http://schemas.microsoft.com/office/drawing/2015/9/8/chartex" xmlns:cx2="http://schemas.microsoft.com/office/drawing/2015/10/21/chartex" xmlns:cx3="http://schemas.microsoft.com/office/drawing/2016/5/9/chartex" xmlns:cx4="http://schemas.microsoft.com/office/drawing/2016/5/10/chartex" xmlns:cx5="http://schemas.microsoft.com/office/drawing/2016/5/11/chartex" xmlns:cx6="http://schemas.microsoft.com/office/drawing/2016/5/12/chartex" xmlns:cx7="http://schemas.microsoft.com/office/drawing/2016/5/13/chartex" xmlns:cx8="http://schemas.microsoft.com/office/drawing/2016/5/14/chartex" xmlns:mc="http://schemas.openxmlformats.org/markup-compatibility/2006" xmlns:aink="http://schemas.microsoft.com/office/drawing/2016/ink" xmlns:am3d="http://schemas.microsoft.com/office/drawing/2017/model3d" xmlns:o="urn:schemas-microsoft-com:office:office" xmlns:oel="http://schemas.microsoft.com/office/2019/extlst" xmlns:r="http://schemas.openxmlformats.org/officeDocument/2006/relationships" xmlns:m="http://schemas.openxmlformats.org/officeDocument/2006/math" xmlns:v="urn:schemas-microsoft-com:vml" xmlns:wp14="http://schemas.microsoft.com/office/word/2010/wordprocessingDrawing" xmlns:wp="http://schemas.openxmlformats.org/drawingml/2006/wordprocessingDrawing" xmlns:w10="urn:schemas-microsoft-com:office:word" xmlns:w="http://schemas.openxmlformats.org/wordprocessingml/2006/main" xmlns:w14="http://schemas.microsoft.com/office/word/2010/wordml" xmlns:w15="http://schemas.microsoft.com/office/word/2012/wordml" xmlns:w16cex="http://schemas.microsoft.com/office/word/2018/wordml/cex" xmlns:w16cid="http://schemas.microsoft.com/office/word/2016/wordml/cid" xmlns:w16="http://schemas.microsoft.com/office/word/2018/wordml" xmlns:w16du="http://schemas.microsoft.com/office/word/2023/wordml/word16du" xmlns:w16sdtdh="http://schemas.microsoft.com/office/word/2020/wordml/sdtdatahash" xmlns:w16sdtfl="http://schemas.microsoft.com/office/word/2024/wordml/sdtformatlock" xmlns:w16se="http://schemas.microsoft.com/office/word/2015/wordml/symex" xmlns:wpg="http://schemas.microsoft.com/office/word/2010/wordprocessingGroup" xmlns:wpi="http://schemas.microsoft.com/office/word/2010/wordprocessingInk" xmlns:wne="http://schemas.microsoft.com/office/word/2006/wordml" xmlns:wps="http://schemas.microsoft.com/office/word/2010/wordprocessingShape" mc:Ignorable="w14 w15 w16se w16cid w16 w16cex w16sdtdh w16sdtfl w16du wp14">
   <w:p>
     <w:pPr>
       <w:pStyle w:val="Header"/>
@@ -3819,7 +3944,7 @@
 </file>
 
 <file path=word/header2.xml><?xml version="1.0" encoding="utf-8"?>
-<w:hdr xmlns:wpc="http://schemas.microsoft.com/office/word/2010/wordprocessingCanvas" xmlns:cx="http://schemas.microsoft.com/office/drawing/2014/chartex" xmlns:cx1="http://schemas.microsoft.com/office/drawing/2015/9/8/chartex" xmlns:cx2="http://schemas.microsoft.com/office/drawing/2015/10/21/chartex" xmlns:cx3="http://schemas.microsoft.com/office/drawing/2016/5/9/chartex" xmlns:cx4="http://schemas.microsoft.com/office/drawing/2016/5/10/chartex" xmlns:cx5="http://schemas.microsoft.com/office/drawing/2016/5/11/chartex" xmlns:cx6="http://schemas.microsoft.com/office/drawing/2016/5/12/chartex" xmlns:cx7="http://schemas.microsoft.com/office/drawing/2016/5/13/chartex" xmlns:cx8="http://schemas.microsoft.com/office/drawing/2016/5/14/chartex" xmlns:mc="http://schemas.openxmlformats.org/markup-compatibility/2006" xmlns:aink="http://schemas.microsoft.com/office/drawing/2016/ink" xmlns:am3d="http://schemas.microsoft.com/office/drawing/2017/model3d" xmlns:o="urn:schemas-microsoft-com:office:office" xmlns:oel="http://schemas.microsoft.com/office/2019/extlst" xmlns:r="http://schemas.openxmlformats.org/officeDocument/2006/relationships" xmlns:m="http://schemas.openxmlformats.org/officeDocument/2006/math" xmlns:v="urn:schemas-microsoft-com:vml" xmlns:wp14="http://schemas.microsoft.com/office/word/2010/wordprocessingDrawing" xmlns:wp="http://schemas.openxmlformats.org/drawingml/2006/wordprocessingDrawing" xmlns:w10="urn:schemas-microsoft-com:office:word" xmlns:w="http://schemas.openxmlformats.org/wordprocessingml/2006/main" xmlns:w14="http://schemas.microsoft.com/office/word/2010/wordml" xmlns:w15="http://schemas.microsoft.com/office/word/2012/wordml" xmlns:w16cex="http://schemas.microsoft.com/office/word/2018/wordml/cex" xmlns:w16cid="http://schemas.microsoft.com/office/word/2016/wordml/cid" xmlns:w16="http://schemas.microsoft.com/office/word/2018/wordml" xmlns:w16sdtdh="http://schemas.microsoft.com/office/word/2020/wordml/sdtdatahash" xmlns:w16se="http://schemas.microsoft.com/office/word/2015/wordml/symex" xmlns:wpg="http://schemas.microsoft.com/office/word/2010/wordprocessingGroup" xmlns:wpi="http://schemas.microsoft.com/office/word/2010/wordprocessingInk" xmlns:wne="http://schemas.microsoft.com/office/word/2006/wordml" xmlns:wps="http://schemas.microsoft.com/office/word/2010/wordprocessingShape" mc:Ignorable="w14 w15 w16se w16cid w16 w16cex w16sdtdh wp14">
+<w:hdr xmlns:wpc="http://schemas.microsoft.com/office/word/2010/wordprocessingCanvas" xmlns:cx="http://schemas.microsoft.com/office/drawing/2014/chartex" xmlns:cx1="http://schemas.microsoft.com/office/drawing/2015/9/8/chartex" xmlns:cx2="http://schemas.microsoft.com/office/drawing/2015/10/21/chartex" xmlns:cx3="http://schemas.microsoft.com/office/drawing/2016/5/9/chartex" xmlns:cx4="http://schemas.microsoft.com/office/drawing/2016/5/10/chartex" xmlns:cx5="http://schemas.microsoft.com/office/drawing/2016/5/11/chartex" xmlns:cx6="http://schemas.microsoft.com/office/drawing/2016/5/12/chartex" xmlns:cx7="http://schemas.microsoft.com/office/drawing/2016/5/13/chartex" xmlns:cx8="http://schemas.microsoft.com/office/drawing/2016/5/14/chartex" xmlns:mc="http://schemas.openxmlformats.org/markup-compatibility/2006" xmlns:aink="http://schemas.microsoft.com/office/drawing/2016/ink" xmlns:am3d="http://schemas.microsoft.com/office/drawing/2017/model3d" xmlns:o="urn:schemas-microsoft-com:office:office" xmlns:oel="http://schemas.microsoft.com/office/2019/extlst" xmlns:r="http://schemas.openxmlformats.org/officeDocument/2006/relationships" xmlns:m="http://schemas.openxmlformats.org/officeDocument/2006/math" xmlns:v="urn:schemas-microsoft-com:vml" xmlns:wp14="http://schemas.microsoft.com/office/word/2010/wordprocessingDrawing" xmlns:wp="http://schemas.openxmlformats.org/drawingml/2006/wordprocessingDrawing" xmlns:w10="urn:schemas-microsoft-com:office:word" xmlns:w="http://schemas.openxmlformats.org/wordprocessingml/2006/main" xmlns:w14="http://schemas.microsoft.com/office/word/2010/wordml" xmlns:w15="http://schemas.microsoft.com/office/word/2012/wordml" xmlns:w16cex="http://schemas.microsoft.com/office/word/2018/wordml/cex" xmlns:w16cid="http://schemas.microsoft.com/office/word/2016/wordml/cid" xmlns:w16="http://schemas.microsoft.com/office/word/2018/wordml" xmlns:w16du="http://schemas.microsoft.com/office/word/2023/wordml/word16du" xmlns:w16sdtdh="http://schemas.microsoft.com/office/word/2020/wordml/sdtdatahash" xmlns:w16sdtfl="http://schemas.microsoft.com/office/word/2024/wordml/sdtformatlock" xmlns:w16se="http://schemas.microsoft.com/office/word/2015/wordml/symex" xmlns:wpg="http://schemas.microsoft.com/office/word/2010/wordprocessingGroup" xmlns:wpi="http://schemas.microsoft.com/office/word/2010/wordprocessingInk" xmlns:wne="http://schemas.microsoft.com/office/word/2006/wordml" xmlns:wps="http://schemas.microsoft.com/office/word/2010/wordprocessingShape" mc:Ignorable="w14 w15 w16se w16cid w16 w16cex w16sdtdh w16sdtfl w16du wp14">
   <w:p>
     <w:pPr>
       <w:pStyle w:val="Header"/>
@@ -4534,7 +4659,7 @@
 </file>
 
 <file path=word/header3.xml><?xml version="1.0" encoding="utf-8"?>
-<w:hdr xmlns:wpc="http://schemas.microsoft.com/office/word/2010/wordprocessingCanvas" xmlns:cx="http://schemas.microsoft.com/office/drawing/2014/chartex" xmlns:cx1="http://schemas.microsoft.com/office/drawing/2015/9/8/chartex" xmlns:cx2="http://schemas.microsoft.com/office/drawing/2015/10/21/chartex" xmlns:cx3="http://schemas.microsoft.com/office/drawing/2016/5/9/chartex" xmlns:cx4="http://schemas.microsoft.com/office/drawing/2016/5/10/chartex" xmlns:cx5="http://schemas.microsoft.com/office/drawing/2016/5/11/chartex" xmlns:cx6="http://schemas.microsoft.com/office/drawing/2016/5/12/chartex" xmlns:cx7="http://schemas.microsoft.com/office/drawing/2016/5/13/chartex" xmlns:cx8="http://schemas.microsoft.com/office/drawing/2016/5/14/chartex" xmlns:mc="http://schemas.openxmlformats.org/markup-compatibility/2006" xmlns:aink="http://schemas.microsoft.com/office/drawing/2016/ink" xmlns:am3d="http://schemas.microsoft.com/office/drawing/2017/model3d" xmlns:o="urn:schemas-microsoft-com:office:office" xmlns:oel="http://schemas.microsoft.com/office/2019/extlst" xmlns:r="http://schemas.openxmlformats.org/officeDocument/2006/relationships" xmlns:m="http://schemas.openxmlformats.org/officeDocument/2006/math" xmlns:v="urn:schemas-microsoft-com:vml" xmlns:wp14="http://schemas.microsoft.com/office/word/2010/wordprocessingDrawing" xmlns:wp="http://schemas.openxmlformats.org/drawingml/2006/wordprocessingDrawing" xmlns:w10="urn:schemas-microsoft-com:office:word" xmlns:w="http://schemas.openxmlformats.org/wordprocessingml/2006/main" xmlns:w14="http://schemas.microsoft.com/office/word/2010/wordml" xmlns:w15="http://schemas.microsoft.com/office/word/2012/wordml" xmlns:w16cex="http://schemas.microsoft.com/office/word/2018/wordml/cex" xmlns:w16cid="http://schemas.microsoft.com/office/word/2016/wordml/cid" xmlns:w16="http://schemas.microsoft.com/office/word/2018/wordml" xmlns:w16sdtdh="http://schemas.microsoft.com/office/word/2020/wordml/sdtdatahash" xmlns:w16se="http://schemas.microsoft.com/office/word/2015/wordml/symex" xmlns:wpg="http://schemas.microsoft.com/office/word/2010/wordprocessingGroup" xmlns:wpi="http://schemas.microsoft.com/office/word/2010/wordprocessingInk" xmlns:wne="http://schemas.microsoft.com/office/word/2006/wordml" xmlns:wps="http://schemas.microsoft.com/office/word/2010/wordprocessingShape" mc:Ignorable="w14 w15 w16se w16cid w16 w16cex w16sdtdh wp14">
+<w:hdr xmlns:wpc="http://schemas.microsoft.com/office/word/2010/wordprocessingCanvas" xmlns:cx="http://schemas.microsoft.com/office/drawing/2014/chartex" xmlns:cx1="http://schemas.microsoft.com/office/drawing/2015/9/8/chartex" xmlns:cx2="http://schemas.microsoft.com/office/drawing/2015/10/21/chartex" xmlns:cx3="http://schemas.microsoft.com/office/drawing/2016/5/9/chartex" xmlns:cx4="http://schemas.microsoft.com/office/drawing/2016/5/10/chartex" xmlns:cx5="http://schemas.microsoft.com/office/drawing/2016/5/11/chartex" xmlns:cx6="http://schemas.microsoft.com/office/drawing/2016/5/12/chartex" xmlns:cx7="http://schemas.microsoft.com/office/drawing/2016/5/13/chartex" xmlns:cx8="http://schemas.microsoft.com/office/drawing/2016/5/14/chartex" xmlns:mc="http://schemas.openxmlformats.org/markup-compatibility/2006" xmlns:aink="http://schemas.microsoft.com/office/drawing/2016/ink" xmlns:am3d="http://schemas.microsoft.com/office/drawing/2017/model3d" xmlns:o="urn:schemas-microsoft-com:office:office" xmlns:oel="http://schemas.microsoft.com/office/2019/extlst" xmlns:r="http://schemas.openxmlformats.org/officeDocument/2006/relationships" xmlns:m="http://schemas.openxmlformats.org/officeDocument/2006/math" xmlns:v="urn:schemas-microsoft-com:vml" xmlns:wp14="http://schemas.microsoft.com/office/word/2010/wordprocessingDrawing" xmlns:wp="http://schemas.openxmlformats.org/drawingml/2006/wordprocessingDrawing" xmlns:w10="urn:schemas-microsoft-com:office:word" xmlns:w="http://schemas.openxmlformats.org/wordprocessingml/2006/main" xmlns:w14="http://schemas.microsoft.com/office/word/2010/wordml" xmlns:w15="http://schemas.microsoft.com/office/word/2012/wordml" xmlns:w16cex="http://schemas.microsoft.com/office/word/2018/wordml/cex" xmlns:w16cid="http://schemas.microsoft.com/office/word/2016/wordml/cid" xmlns:w16="http://schemas.microsoft.com/office/word/2018/wordml" xmlns:w16du="http://schemas.microsoft.com/office/word/2023/wordml/word16du" xmlns:w16sdtdh="http://schemas.microsoft.com/office/word/2020/wordml/sdtdatahash" xmlns:w16sdtfl="http://schemas.microsoft.com/office/word/2024/wordml/sdtformatlock" xmlns:w16se="http://schemas.microsoft.com/office/word/2015/wordml/symex" xmlns:wpg="http://schemas.microsoft.com/office/word/2010/wordprocessingGroup" xmlns:wpi="http://schemas.microsoft.com/office/word/2010/wordprocessingInk" xmlns:wne="http://schemas.microsoft.com/office/word/2006/wordml" xmlns:wps="http://schemas.microsoft.com/office/word/2010/wordprocessingShape" mc:Ignorable="w14 w15 w16se w16cid w16 w16cex w16sdtdh w16sdtfl w16du wp14">
   <w:p>
     <w:pPr>
       <w:pStyle w:val="Header"/>
@@ -4544,7 +4669,7 @@
 </file>
 
 <file path=word/numbering.xml><?xml version="1.0" encoding="utf-8"?>
-<w:numbering xmlns:wpc="http://schemas.microsoft.com/office/word/2010/wordprocessingCanvas" xmlns:cx="http://schemas.microsoft.com/office/drawing/2014/chartex" xmlns:cx1="http://schemas.microsoft.com/office/drawing/2015/9/8/chartex" xmlns:cx2="http://schemas.microsoft.com/office/drawing/2015/10/21/chartex" xmlns:cx3="http://schemas.microsoft.com/office/drawing/2016/5/9/chartex" xmlns:cx4="http://schemas.microsoft.com/office/drawing/2016/5/10/chartex" xmlns:cx5="http://schemas.microsoft.com/office/drawing/2016/5/11/chartex" xmlns:cx6="http://schemas.microsoft.com/office/drawing/2016/5/12/chartex" xmlns:cx7="http://schemas.microsoft.com/office/drawing/2016/5/13/chartex" xmlns:cx8="http://schemas.microsoft.com/office/drawing/2016/5/14/chartex" xmlns:mc="http://schemas.openxmlformats.org/markup-compatibility/2006" xmlns:aink="http://schemas.microsoft.com/office/drawing/2016/ink" xmlns:am3d="http://schemas.microsoft.com/office/drawing/2017/model3d" xmlns:o="urn:schemas-microsoft-com:office:office" xmlns:oel="http://schemas.microsoft.com/office/2019/extlst" xmlns:r="http://schemas.openxmlformats.org/officeDocument/2006/relationships" xmlns:m="http://schemas.openxmlformats.org/officeDocument/2006/math" xmlns:v="urn:schemas-microsoft-com:vml" xmlns:wp14="http://schemas.microsoft.com/office/word/2010/wordprocessingDrawing" xmlns:wp="http://schemas.openxmlformats.org/drawingml/2006/wordprocessingDrawing" xmlns:w10="urn:schemas-microsoft-com:office:word" xmlns:w="http://schemas.openxmlformats.org/wordprocessingml/2006/main" xmlns:w14="http://schemas.microsoft.com/office/word/2010/wordml" xmlns:w15="http://schemas.microsoft.com/office/word/2012/wordml" xmlns:w16cex="http://schemas.microsoft.com/office/word/2018/wordml/cex" xmlns:w16cid="http://schemas.microsoft.com/office/word/2016/wordml/cid" xmlns:w16="http://schemas.microsoft.com/office/word/2018/wordml" xmlns:w16sdtdh="http://schemas.microsoft.com/office/word/2020/wordml/sdtdatahash" xmlns:w16se="http://schemas.microsoft.com/office/word/2015/wordml/symex" xmlns:wpg="http://schemas.microsoft.com/office/word/2010/wordprocessingGroup" xmlns:wpi="http://schemas.microsoft.com/office/word/2010/wordprocessingInk" xmlns:wne="http://schemas.microsoft.com/office/word/2006/wordml" xmlns:wps="http://schemas.microsoft.com/office/word/2010/wordprocessingShape" mc:Ignorable="w14 w15 w16se w16cid w16 w16cex w16sdtdh wp14">
+<w:numbering xmlns:wpc="http://schemas.microsoft.com/office/word/2010/wordprocessingCanvas" xmlns:cx="http://schemas.microsoft.com/office/drawing/2014/chartex" xmlns:cx1="http://schemas.microsoft.com/office/drawing/2015/9/8/chartex" xmlns:cx2="http://schemas.microsoft.com/office/drawing/2015/10/21/chartex" xmlns:cx3="http://schemas.microsoft.com/office/drawing/2016/5/9/chartex" xmlns:cx4="http://schemas.microsoft.com/office/drawing/2016/5/10/chartex" xmlns:cx5="http://schemas.microsoft.com/office/drawing/2016/5/11/chartex" xmlns:cx6="http://schemas.microsoft.com/office/drawing/2016/5/12/chartex" xmlns:cx7="http://schemas.microsoft.com/office/drawing/2016/5/13/chartex" xmlns:cx8="http://schemas.microsoft.com/office/drawing/2016/5/14/chartex" xmlns:mc="http://schemas.openxmlformats.org/markup-compatibility/2006" xmlns:aink="http://schemas.microsoft.com/office/drawing/2016/ink" xmlns:am3d="http://schemas.microsoft.com/office/drawing/2017/model3d" xmlns:o="urn:schemas-microsoft-com:office:office" xmlns:oel="http://schemas.microsoft.com/office/2019/extlst" xmlns:r="http://schemas.openxmlformats.org/officeDocument/2006/relationships" xmlns:m="http://schemas.openxmlformats.org/officeDocument/2006/math" xmlns:v="urn:schemas-microsoft-com:vml" xmlns:wp14="http://schemas.microsoft.com/office/word/2010/wordprocessingDrawing" xmlns:wp="http://schemas.openxmlformats.org/drawingml/2006/wordprocessingDrawing" xmlns:w10="urn:schemas-microsoft-com:office:word" xmlns:w="http://schemas.openxmlformats.org/wordprocessingml/2006/main" xmlns:w14="http://schemas.microsoft.com/office/word/2010/wordml" xmlns:w15="http://schemas.microsoft.com/office/word/2012/wordml" xmlns:w16cex="http://schemas.microsoft.com/office/word/2018/wordml/cex" xmlns:w16cid="http://schemas.microsoft.com/office/word/2016/wordml/cid" xmlns:w16="http://schemas.microsoft.com/office/word/2018/wordml" xmlns:w16du="http://schemas.microsoft.com/office/word/2023/wordml/word16du" xmlns:w16sdtdh="http://schemas.microsoft.com/office/word/2020/wordml/sdtdatahash" xmlns:w16sdtfl="http://schemas.microsoft.com/office/word/2024/wordml/sdtformatlock" xmlns:w16se="http://schemas.microsoft.com/office/word/2015/wordml/symex" xmlns:wpg="http://schemas.microsoft.com/office/word/2010/wordprocessingGroup" xmlns:wpi="http://schemas.microsoft.com/office/word/2010/wordprocessingInk" xmlns:wne="http://schemas.microsoft.com/office/word/2006/wordml" xmlns:wps="http://schemas.microsoft.com/office/word/2010/wordprocessingShape" mc:Ignorable="w14 w15 w16se w16cid w16 w16cex w16sdtdh w16sdtfl w16du wp14">
   <w:abstractNum w:abstractNumId="0" w15:restartNumberingAfterBreak="0">
     <w:nsid w:val="19365752"/>
     <w:multiLevelType w:val="hybridMultilevel"/>
@@ -4803,7 +4928,7 @@
 </file>
 
 <file path=word/styles.xml><?xml version="1.0" encoding="utf-8"?>
-<w:styles xmlns:mc="http://schemas.openxmlformats.org/markup-compatibility/2006" xmlns:r="http://schemas.openxmlformats.org/officeDocument/2006/relationships" xmlns:w="http://schemas.openxmlformats.org/wordprocessingml/2006/main" xmlns:w14="http://schemas.microsoft.com/office/word/2010/wordml" xmlns:w15="http://schemas.microsoft.com/office/word/2012/wordml" xmlns:w16cex="http://schemas.microsoft.com/office/word/2018/wordml/cex" xmlns:w16cid="http://schemas.microsoft.com/office/word/2016/wordml/cid" xmlns:w16="http://schemas.microsoft.com/office/word/2018/wordml" xmlns:w16sdtdh="http://schemas.microsoft.com/office/word/2020/wordml/sdtdatahash" xmlns:w16se="http://schemas.microsoft.com/office/word/2015/wordml/symex" mc:Ignorable="w14 w15 w16se w16cid w16 w16cex w16sdtdh">
+<w:styles xmlns:mc="http://schemas.openxmlformats.org/markup-compatibility/2006" xmlns:r="http://schemas.openxmlformats.org/officeDocument/2006/relationships" xmlns:w="http://schemas.openxmlformats.org/wordprocessingml/2006/main" xmlns:w14="http://schemas.microsoft.com/office/word/2010/wordml" xmlns:w15="http://schemas.microsoft.com/office/word/2012/wordml" xmlns:w16cex="http://schemas.microsoft.com/office/word/2018/wordml/cex" xmlns:w16cid="http://schemas.microsoft.com/office/word/2016/wordml/cid" xmlns:w16="http://schemas.microsoft.com/office/word/2018/wordml" xmlns:w16du="http://schemas.microsoft.com/office/word/2023/wordml/word16du" xmlns:w16sdtdh="http://schemas.microsoft.com/office/word/2020/wordml/sdtdatahash" xmlns:w16sdtfl="http://schemas.microsoft.com/office/word/2024/wordml/sdtformatlock" xmlns:w16se="http://schemas.microsoft.com/office/word/2015/wordml/symex" mc:Ignorable="w14 w15 w16se w16cid w16 w16cex w16sdtdh w16sdtfl w16du">
   <w:docDefaults>
     <w:rPrDefault>
       <w:rPr>

</xml_diff>